<commit_message>
Added to main doc
</commit_message>
<xml_diff>
--- a/Main Document.docx
+++ b/Main Document.docx
@@ -1044,23 +1044,7 @@
                 <w:szCs w:val="24"/>
                 <w:lang w:val="en-US"/>
               </w:rPr>
-              <w:t xml:space="preserve">Apparent </w:t>
-            </w:r>
-            <w:r>
-              <w:rPr>
-                <w:sz w:val="24"/>
-                <w:szCs w:val="24"/>
-                <w:lang w:val="en-US"/>
-              </w:rPr>
-              <w:t>Temperature</w:t>
-            </w:r>
-            <w:r>
-              <w:rPr>
-                <w:sz w:val="24"/>
-                <w:szCs w:val="24"/>
-                <w:lang w:val="en-US"/>
-              </w:rPr>
-              <w:t xml:space="preserve"> 2m Mean</w:t>
+              <w:t>Apparent Temperature 2m Mean</w:t>
             </w:r>
           </w:p>
         </w:tc>
@@ -2667,17 +2651,7 @@
           <w:szCs w:val="24"/>
           <w:lang w:val="en-US"/>
         </w:rPr>
-        <w:t>Local News Articles</w:t>
-      </w:r>
-      <w:r>
-        <w:rPr>
-          <w:i/>
-          <w:iCs/>
-          <w:sz w:val="24"/>
-          <w:szCs w:val="24"/>
-          <w:lang w:val="en-US"/>
-        </w:rPr>
-        <w:t>:</w:t>
+        <w:t>Local News Articles:</w:t>
       </w:r>
     </w:p>
     <w:p>
@@ -4585,6 +4559,60 @@
     <w:p>
       <w:pPr>
         <w:rPr>
+          <w:sz w:val="24"/>
+          <w:szCs w:val="24"/>
+          <w:lang w:val="en-US"/>
+        </w:rPr>
+      </w:pPr>
+    </w:p>
+    <w:p>
+      <w:pPr>
+        <w:rPr>
+          <w:sz w:val="24"/>
+          <w:szCs w:val="24"/>
+          <w:lang w:val="en-US"/>
+        </w:rPr>
+      </w:pPr>
+    </w:p>
+    <w:p>
+      <w:pPr>
+        <w:rPr>
+          <w:sz w:val="24"/>
+          <w:szCs w:val="24"/>
+          <w:lang w:val="en-US"/>
+        </w:rPr>
+      </w:pPr>
+    </w:p>
+    <w:p>
+      <w:pPr>
+        <w:rPr>
+          <w:sz w:val="24"/>
+          <w:szCs w:val="24"/>
+          <w:lang w:val="en-US"/>
+        </w:rPr>
+      </w:pPr>
+    </w:p>
+    <w:p>
+      <w:pPr>
+        <w:rPr>
+          <w:sz w:val="24"/>
+          <w:szCs w:val="24"/>
+          <w:lang w:val="en-US"/>
+        </w:rPr>
+      </w:pPr>
+    </w:p>
+    <w:p>
+      <w:pPr>
+        <w:rPr>
+          <w:sz w:val="24"/>
+          <w:szCs w:val="24"/>
+          <w:lang w:val="en-US"/>
+        </w:rPr>
+      </w:pPr>
+    </w:p>
+    <w:p>
+      <w:pPr>
+        <w:rPr>
           <w:b/>
           <w:bCs/>
           <w:sz w:val="32"/>
@@ -4600,6 +4628,7 @@
           <w:szCs w:val="32"/>
           <w:lang w:val="en-US"/>
         </w:rPr>
+        <w:lastRenderedPageBreak/>
         <w:t>References</w:t>
       </w:r>
     </w:p>
@@ -4703,13 +4732,33 @@
         </w:rPr>
         <w:t xml:space="preserve">. [Online]. </w:t>
       </w:r>
-      <w:r>
-        <w:rPr>
-          <w:sz w:val="24"/>
-          <w:szCs w:val="24"/>
-          <w:lang w:val="en-US"/>
-        </w:rPr>
-        <w:t xml:space="preserve">Available: </w:t>
+      <w:proofErr w:type="spellStart"/>
+      <w:proofErr w:type="gramStart"/>
+      <w:r>
+        <w:rPr>
+          <w:sz w:val="24"/>
+          <w:szCs w:val="24"/>
+          <w:lang w:val="fr-FR"/>
+        </w:rPr>
+        <w:t>Available</w:t>
+      </w:r>
+      <w:proofErr w:type="spellEnd"/>
+      <w:r>
+        <w:rPr>
+          <w:sz w:val="24"/>
+          <w:szCs w:val="24"/>
+          <w:lang w:val="fr-FR"/>
+        </w:rPr>
+        <w:t>:</w:t>
+      </w:r>
+      <w:proofErr w:type="gramEnd"/>
+      <w:r>
+        <w:rPr>
+          <w:sz w:val="24"/>
+          <w:szCs w:val="24"/>
+          <w:lang w:val="fr-FR"/>
+        </w:rPr>
+        <w:t xml:space="preserve"> </w:t>
       </w:r>
       <w:hyperlink r:id="rId6" w:tgtFrame="_blank" w:history="1">
         <w:r>
@@ -4717,7 +4766,7 @@
             <w:rStyle w:val="Hyperlink"/>
             <w:sz w:val="24"/>
             <w:szCs w:val="24"/>
-            <w:lang w:val="en-US"/>
+            <w:lang w:val="fr-FR"/>
           </w:rPr>
           <w:t>https://pandas.pydata.org/docs/reference/api/pandas.Series.dt.year.html</w:t>
         </w:r>
@@ -4726,7 +4775,7 @@
         <w:rPr>
           <w:sz w:val="24"/>
           <w:szCs w:val="24"/>
-          <w:lang w:val="en-US"/>
+          <w:lang w:val="fr-FR"/>
         </w:rPr>
         <w:t xml:space="preserve">. </w:t>
       </w:r>
@@ -4751,7 +4800,6 @@
         <w:rPr>
           <w:sz w:val="24"/>
           <w:szCs w:val="24"/>
-          <w:lang w:val="en-US"/>
         </w:rPr>
       </w:pPr>
       <w:r>
@@ -4784,6 +4832,100 @@
         </w:rPr>
         <w:t>, Jan. 29, 2018</w:t>
       </w:r>
+    </w:p>
+    <w:p>
+      <w:pPr>
+        <w:rPr>
+          <w:sz w:val="24"/>
+          <w:szCs w:val="24"/>
+        </w:rPr>
+      </w:pPr>
+    </w:p>
+    <w:p>
+      <w:pPr>
+        <w:rPr>
+          <w:sz w:val="24"/>
+          <w:szCs w:val="24"/>
+          <w:lang w:val="fr-FR"/>
+        </w:rPr>
+      </w:pPr>
+      <w:r>
+        <w:rPr>
+          <w:sz w:val="24"/>
+          <w:szCs w:val="24"/>
+        </w:rPr>
+        <w:t xml:space="preserve">[4] </w:t>
+      </w:r>
+      <w:r>
+        <w:rPr>
+          <w:sz w:val="24"/>
+          <w:szCs w:val="24"/>
+        </w:rPr>
+        <w:t xml:space="preserve">O. Sirois, “How to handle weekdays in a NN,” </w:t>
+      </w:r>
+      <w:r>
+        <w:rPr>
+          <w:i/>
+          <w:iCs/>
+          <w:sz w:val="24"/>
+          <w:szCs w:val="24"/>
+        </w:rPr>
+        <w:t>Data Science Stack Exchange</w:t>
+      </w:r>
+      <w:r>
+        <w:rPr>
+          <w:sz w:val="24"/>
+          <w:szCs w:val="24"/>
+        </w:rPr>
+        <w:t xml:space="preserve">, 2019. </w:t>
+      </w:r>
+      <w:r>
+        <w:rPr>
+          <w:sz w:val="24"/>
+          <w:szCs w:val="24"/>
+          <w:lang w:val="fr-FR"/>
+        </w:rPr>
+        <w:t xml:space="preserve">[Online]. </w:t>
+      </w:r>
+      <w:proofErr w:type="spellStart"/>
+      <w:proofErr w:type="gramStart"/>
+      <w:r>
+        <w:rPr>
+          <w:sz w:val="24"/>
+          <w:szCs w:val="24"/>
+          <w:lang w:val="fr-FR"/>
+        </w:rPr>
+        <w:t>Available</w:t>
+      </w:r>
+      <w:proofErr w:type="spellEnd"/>
+      <w:r>
+        <w:rPr>
+          <w:sz w:val="24"/>
+          <w:szCs w:val="24"/>
+          <w:lang w:val="fr-FR"/>
+        </w:rPr>
+        <w:t>:</w:t>
+      </w:r>
+      <w:proofErr w:type="gramEnd"/>
+      <w:r>
+        <w:rPr>
+          <w:sz w:val="24"/>
+          <w:szCs w:val="24"/>
+          <w:lang w:val="fr-FR"/>
+        </w:rPr>
+        <w:t xml:space="preserve"> </w:t>
+      </w:r>
+      <w:hyperlink r:id="rId7" w:tgtFrame="_new" w:history="1">
+        <w:r>
+          <w:rPr>
+            <w:rStyle w:val="Hyperlink"/>
+            <w:sz w:val="24"/>
+            <w:szCs w:val="24"/>
+            <w:lang w:val="fr-FR"/>
+          </w:rPr>
+          <w:t>https://datascience.stackexchange.com/questions/63049/how-to-handle-weekdays-in-a-nn</w:t>
+        </w:r>
+      </w:hyperlink>
     </w:p>
     <w:sectPr>
       <w:pgSz w:w="11906" w:h="16838"/>

</xml_diff>

<commit_message>
RandomF - wrote part of method and results
</commit_message>
<xml_diff>
--- a/Main Document.docx
+++ b/Main Document.docx
@@ -3554,7 +3554,57 @@
           <w:szCs w:val="24"/>
           <w:lang w:val="en-US"/>
         </w:rPr>
-        <w:t>’. This is due to the large number of added columns created by the vectorizer function TF-IDF which would make the finalized dataset unreadable.</w:t>
+        <w:t>’. This is due to the large number of added columns created by the vectorizer function TF-IDF</w:t>
+      </w:r>
+      <w:r>
+        <w:rPr>
+          <w:sz w:val="24"/>
+          <w:szCs w:val="24"/>
+          <w:lang w:val="en-US"/>
+        </w:rPr>
+        <w:t>,</w:t>
+      </w:r>
+      <w:r>
+        <w:rPr>
+          <w:sz w:val="24"/>
+          <w:szCs w:val="24"/>
+          <w:lang w:val="en-US"/>
+        </w:rPr>
+        <w:t xml:space="preserve"> which would make the </w:t>
+      </w:r>
+      <w:proofErr w:type="spellStart"/>
+      <w:r>
+        <w:rPr>
+          <w:sz w:val="24"/>
+          <w:szCs w:val="24"/>
+          <w:lang w:val="en-US"/>
+        </w:rPr>
+        <w:t>finali</w:t>
+      </w:r>
+      <w:r>
+        <w:rPr>
+          <w:sz w:val="24"/>
+          <w:szCs w:val="24"/>
+          <w:lang w:val="en-US"/>
+        </w:rPr>
+        <w:t>s</w:t>
+      </w:r>
+      <w:r>
+        <w:rPr>
+          <w:sz w:val="24"/>
+          <w:szCs w:val="24"/>
+          <w:lang w:val="en-US"/>
+        </w:rPr>
+        <w:t>ed</w:t>
+      </w:r>
+      <w:proofErr w:type="spellEnd"/>
+      <w:r>
+        <w:rPr>
+          <w:sz w:val="24"/>
+          <w:szCs w:val="24"/>
+          <w:lang w:val="en-US"/>
+        </w:rPr>
+        <w:t xml:space="preserve"> dataset unreadable.</w:t>
       </w:r>
     </w:p>
     <w:p>
@@ -3595,23 +3645,81 @@
           <w:szCs w:val="24"/>
           <w:lang w:val="en-US"/>
         </w:rPr>
-        <w:t xml:space="preserve">which </w:t>
-      </w:r>
-      <w:r>
-        <w:rPr>
-          <w:sz w:val="24"/>
-          <w:szCs w:val="24"/>
-          <w:lang w:val="en-US"/>
-        </w:rPr>
-        <w:t xml:space="preserve">requires a team of 3 people to focus on. </w:t>
-      </w:r>
-      <w:r>
-        <w:rPr>
-          <w:sz w:val="24"/>
-          <w:szCs w:val="24"/>
-          <w:lang w:val="en-US"/>
-        </w:rPr>
-        <w:t xml:space="preserve">It mostly works well since TF-IDF results in sparse matrices, traditional models such as SVMs are mathematically optimized to process these sparse matrices [3]. Moreover, </w:t>
+        <w:t>that</w:t>
+      </w:r>
+      <w:r>
+        <w:rPr>
+          <w:sz w:val="24"/>
+          <w:szCs w:val="24"/>
+          <w:lang w:val="en-US"/>
+        </w:rPr>
+        <w:t xml:space="preserve"> </w:t>
+      </w:r>
+      <w:r>
+        <w:rPr>
+          <w:sz w:val="24"/>
+          <w:szCs w:val="24"/>
+          <w:lang w:val="en-US"/>
+        </w:rPr>
+        <w:t>require</w:t>
+      </w:r>
+      <w:r>
+        <w:rPr>
+          <w:sz w:val="24"/>
+          <w:szCs w:val="24"/>
+          <w:lang w:val="en-US"/>
+        </w:rPr>
+        <w:t>d</w:t>
+      </w:r>
+      <w:r>
+        <w:rPr>
+          <w:sz w:val="24"/>
+          <w:szCs w:val="24"/>
+          <w:lang w:val="en-US"/>
+        </w:rPr>
+        <w:t xml:space="preserve"> a team of 3 people to focus on. </w:t>
+      </w:r>
+      <w:r>
+        <w:rPr>
+          <w:sz w:val="24"/>
+          <w:szCs w:val="24"/>
+          <w:lang w:val="en-US"/>
+        </w:rPr>
+        <w:t xml:space="preserve">It mostly works well since TF-IDF results in sparse matrices, traditional models such as SVMs are mathematically </w:t>
+      </w:r>
+      <w:proofErr w:type="spellStart"/>
+      <w:r>
+        <w:rPr>
+          <w:sz w:val="24"/>
+          <w:szCs w:val="24"/>
+          <w:lang w:val="en-US"/>
+        </w:rPr>
+        <w:t>optimi</w:t>
+      </w:r>
+      <w:r>
+        <w:rPr>
+          <w:sz w:val="24"/>
+          <w:szCs w:val="24"/>
+          <w:lang w:val="en-US"/>
+        </w:rPr>
+        <w:t>s</w:t>
+      </w:r>
+      <w:r>
+        <w:rPr>
+          <w:sz w:val="24"/>
+          <w:szCs w:val="24"/>
+          <w:lang w:val="en-US"/>
+        </w:rPr>
+        <w:t>ed</w:t>
+      </w:r>
+      <w:proofErr w:type="spellEnd"/>
+      <w:r>
+        <w:rPr>
+          <w:sz w:val="24"/>
+          <w:szCs w:val="24"/>
+          <w:lang w:val="en-US"/>
+        </w:rPr>
+        <w:t xml:space="preserve"> to process these sparse matrices [3]. Moreover, </w:t>
       </w:r>
       <w:r>
         <w:rPr>
@@ -3635,7 +3743,23 @@
           <w:szCs w:val="24"/>
           <w:lang w:val="en-US"/>
         </w:rPr>
-        <w:t xml:space="preserve"> features due to having 432 rows of data but </w:t>
+        <w:t xml:space="preserve"> features due to having 432 rows of data</w:t>
+      </w:r>
+      <w:r>
+        <w:rPr>
+          <w:sz w:val="24"/>
+          <w:szCs w:val="24"/>
+          <w:lang w:val="en-US"/>
+        </w:rPr>
+        <w:t>,</w:t>
+      </w:r>
+      <w:r>
+        <w:rPr>
+          <w:sz w:val="24"/>
+          <w:szCs w:val="24"/>
+          <w:lang w:val="en-US"/>
+        </w:rPr>
+        <w:t xml:space="preserve"> but </w:t>
       </w:r>
       <w:r>
         <w:rPr>
@@ -3651,7 +3775,23 @@
           <w:szCs w:val="24"/>
           <w:lang w:val="en-US"/>
         </w:rPr>
-        <w:t xml:space="preserve"> features. This should give the model enough variety to learn whilst keeping the model safe from overfitting. Should the accuracy prove to be low, we will increase the features accordingly.</w:t>
+        <w:t xml:space="preserve"> features. This should give the model enough variety to learn whil</w:t>
+      </w:r>
+      <w:r>
+        <w:rPr>
+          <w:sz w:val="24"/>
+          <w:szCs w:val="24"/>
+          <w:lang w:val="en-US"/>
+        </w:rPr>
+        <w:t>e</w:t>
+      </w:r>
+      <w:r>
+        <w:rPr>
+          <w:sz w:val="24"/>
+          <w:szCs w:val="24"/>
+          <w:lang w:val="en-US"/>
+        </w:rPr>
+        <w:t xml:space="preserve"> keeping the model safe from overfitting. Should the accuracy prove to be low, we will increase the features accordingly.</w:t>
       </w:r>
       <w:r>
         <w:rPr>
@@ -3683,6 +3823,14 @@
           <w:szCs w:val="24"/>
           <w:lang w:val="en-US"/>
         </w:rPr>
+        <w:t>,</w:t>
+      </w:r>
+      <w:r>
+        <w:rPr>
+          <w:sz w:val="24"/>
+          <w:szCs w:val="24"/>
+          <w:lang w:val="en-US"/>
+        </w:rPr>
         <w:t xml:space="preserve"> hence at least t</w:t>
       </w:r>
       <w:r>
@@ -3699,30 +3847,408 @@
           <w:szCs w:val="24"/>
           <w:lang w:val="en-US"/>
         </w:rPr>
-        <w:t>ree documents must feature a phrase and maximum document frequency of 80% hence the model will ignore phrases that appear in 80% of the documents.</w:t>
-      </w:r>
-    </w:p>
-    <w:p>
-      <w:pPr>
+        <w:t>ree documents must feature a phrase and maximum document frequency of 80%</w:t>
+      </w:r>
+      <w:r>
+        <w:rPr>
+          <w:sz w:val="24"/>
+          <w:szCs w:val="24"/>
+          <w:lang w:val="en-US"/>
+        </w:rPr>
+        <w:t>,</w:t>
+      </w:r>
+      <w:r>
+        <w:rPr>
+          <w:sz w:val="24"/>
+          <w:szCs w:val="24"/>
+          <w:lang w:val="en-US"/>
+        </w:rPr>
+        <w:t xml:space="preserve"> hence the model will ignore phrases that appear in 80% of the documents.</w:t>
+      </w:r>
+    </w:p>
+    <w:p>
+      <w:pPr>
+        <w:rPr>
+          <w:sz w:val="24"/>
+          <w:szCs w:val="24"/>
+          <w:lang w:val="en-MT"/>
+        </w:rPr>
+      </w:pPr>
+      <w:r>
         <w:rPr>
           <w:b/>
           <w:bCs/>
           <w:sz w:val="32"/>
           <w:szCs w:val="32"/>
-          <w:lang w:val="en-US"/>
-        </w:rPr>
-      </w:pPr>
-      <w:r>
+          <w:u w:val="single"/>
+          <w:lang w:val="en-US"/>
+        </w:rPr>
+        <w:lastRenderedPageBreak/>
+        <w:t>Methodology</w:t>
+      </w:r>
+    </w:p>
+    <w:p>
+      <w:pPr>
         <w:rPr>
           <w:b/>
           <w:bCs/>
-          <w:sz w:val="32"/>
-          <w:szCs w:val="32"/>
+          <w:sz w:val="28"/>
+          <w:szCs w:val="28"/>
+          <w:u w:val="single"/>
+          <w:lang w:val="en-US"/>
+        </w:rPr>
+      </w:pPr>
+      <w:r>
+        <w:rPr>
+          <w:b/>
+          <w:bCs/>
+          <w:sz w:val="28"/>
+          <w:szCs w:val="28"/>
+          <w:u w:val="single"/>
+          <w:lang w:val="en-US"/>
+        </w:rPr>
+        <w:t>Random Forest (Luca D’Ascari)</w:t>
+      </w:r>
+    </w:p>
+    <w:p>
+      <w:pPr>
+        <w:spacing w:line="240" w:lineRule="auto"/>
+        <w:rPr>
+          <w:b/>
+          <w:bCs/>
+          <w:sz w:val="28"/>
+          <w:szCs w:val="28"/>
+          <w:lang w:val="en-US"/>
+        </w:rPr>
+      </w:pPr>
+      <w:r>
+        <w:rPr>
+          <w:b/>
+          <w:bCs/>
+          <w:sz w:val="28"/>
+          <w:szCs w:val="28"/>
+          <w:lang w:val="en-US"/>
+        </w:rPr>
+        <w:t>Technique Overview and Rationale:</w:t>
+      </w:r>
+    </w:p>
+    <w:p>
+      <w:pPr>
+        <w:spacing w:line="240" w:lineRule="auto"/>
+        <w:rPr>
+          <w:sz w:val="24"/>
+          <w:szCs w:val="24"/>
+          <w:lang w:val="en-US"/>
+        </w:rPr>
+      </w:pPr>
+      <w:r>
+        <w:rPr>
+          <w:sz w:val="24"/>
+          <w:szCs w:val="24"/>
+          <w:lang w:val="en-US"/>
+        </w:rPr>
+        <w:t xml:space="preserve">This technique uses a Random Forest classifier to predict </w:t>
+      </w:r>
+      <w:proofErr w:type="spellStart"/>
+      <w:r>
+        <w:rPr>
+          <w:i/>
+          <w:iCs/>
+          <w:sz w:val="24"/>
+          <w:szCs w:val="24"/>
+          <w:lang w:val="en-US"/>
+        </w:rPr>
+        <w:t>severity_label</w:t>
+      </w:r>
+      <w:proofErr w:type="spellEnd"/>
+      <w:r>
+        <w:rPr>
+          <w:sz w:val="24"/>
+          <w:szCs w:val="24"/>
+          <w:lang w:val="en-US"/>
+        </w:rPr>
+        <w:t xml:space="preserve"> as a multi</w:t>
+      </w:r>
+      <w:r>
+        <w:rPr>
+          <w:sz w:val="24"/>
+          <w:szCs w:val="24"/>
+          <w:lang w:val="en-US"/>
+        </w:rPr>
+        <w:t>-</w:t>
+      </w:r>
+      <w:r>
+        <w:rPr>
+          <w:sz w:val="24"/>
+          <w:szCs w:val="24"/>
+          <w:lang w:val="en-US"/>
+        </w:rPr>
+        <w:t>class classification problem.  Random Forest is an ensemble method that trains many decision trees on bootstrapped samples of the training data and combines their predictions through majority voting.  At each split, only a random subset of features is considered, which reduces correlation between trees and typically improves generalisation compared with a single decision tree.  It was selected because it performs well on mixed feature sets and captures nonlinear relationships without needing scaling or strong parametric assumptions.  In this project, predictors include unstructured article text and structured variables, so Random Forest can integrate TF IDF text features with numeric and binary inputs in a single model, and it also provides feature importance scores to support a first pass interpretation.</w:t>
+      </w:r>
+    </w:p>
+    <w:p>
+      <w:pPr>
+        <w:spacing w:line="240" w:lineRule="auto"/>
+        <w:rPr>
+          <w:b/>
+          <w:bCs/>
+          <w:sz w:val="28"/>
+          <w:szCs w:val="28"/>
+          <w:lang w:val="en-US"/>
+        </w:rPr>
+      </w:pPr>
+      <w:r>
+        <w:rPr>
+          <w:b/>
+          <w:bCs/>
+          <w:sz w:val="28"/>
+          <w:szCs w:val="28"/>
+          <w:lang w:val="en-US"/>
+        </w:rPr>
+        <w:t>Feature Design, Preprocessing, and Training Protocol:</w:t>
+      </w:r>
+    </w:p>
+    <w:p>
+      <w:pPr>
+        <w:spacing w:line="240" w:lineRule="auto"/>
+        <w:rPr>
+          <w:sz w:val="24"/>
+          <w:szCs w:val="24"/>
+          <w:lang w:val="en-US"/>
+        </w:rPr>
+      </w:pPr>
+      <w:r>
+        <w:rPr>
+          <w:sz w:val="24"/>
+          <w:szCs w:val="24"/>
+          <w:lang w:val="en-US"/>
+        </w:rPr>
+        <w:t>Inputs were built from article text and structured variables.  The content field was converted into TF IDF features using unigrams and bigrams, English stop word removal, and document frequency filtering to reduce noise and cap vocabulary size for efficiency.  Structured predictors, including temporal, weather, and tag indicators, were combined with TF IDF using a ColumnTransformer that applies TF IDF only to the text column and passes the remaining numeric and binary columns through unchanged.  No scaling was applied because Random Forest split decisions depend on ordering and thresholds rather than distance</w:t>
+      </w:r>
+      <w:r>
+        <w:rPr>
+          <w:sz w:val="24"/>
+          <w:szCs w:val="24"/>
+          <w:lang w:val="en-US"/>
+        </w:rPr>
+        <w:t>-</w:t>
+      </w:r>
+      <w:r>
+        <w:rPr>
+          <w:sz w:val="24"/>
+          <w:szCs w:val="24"/>
+          <w:lang w:val="en-US"/>
+        </w:rPr>
+        <w:t>based measures, and constant columns were removed because they provide no predictive value.  The target variable severity_label was excluded from the feature set to avoid leakage, and the dataset was split into training and held</w:t>
+      </w:r>
+      <w:r>
+        <w:rPr>
+          <w:sz w:val="24"/>
+          <w:szCs w:val="24"/>
+          <w:lang w:val="en-US"/>
+        </w:rPr>
+        <w:t>-</w:t>
+      </w:r>
+      <w:r>
+        <w:rPr>
+          <w:sz w:val="24"/>
+          <w:szCs w:val="24"/>
+          <w:lang w:val="en-US"/>
+        </w:rPr>
+        <w:t>out test sets using an 80</w:t>
+      </w:r>
+      <w:r>
+        <w:rPr>
+          <w:sz w:val="24"/>
+          <w:szCs w:val="24"/>
+          <w:lang w:val="en-US"/>
+        </w:rPr>
+        <w:t>/</w:t>
+      </w:r>
+      <w:r>
+        <w:rPr>
+          <w:sz w:val="24"/>
+          <w:szCs w:val="24"/>
+          <w:lang w:val="en-US"/>
+        </w:rPr>
+        <w:t>20 stratified split with a fixed random seed of 42 for reproducibility.  For context, a majority class baseline was computed, then two baseline Random Forest models were trained, one with structured features only and one with text plus structured features, to quantify the contribution of text.</w:t>
+      </w:r>
+    </w:p>
+    <w:p>
+      <w:pPr>
+        <w:spacing w:line="240" w:lineRule="auto"/>
+        <w:rPr>
+          <w:b/>
+          <w:bCs/>
+          <w:sz w:val="28"/>
+          <w:szCs w:val="28"/>
+          <w:lang w:val="en-US"/>
+        </w:rPr>
+      </w:pPr>
+      <w:r>
+        <w:rPr>
+          <w:b/>
+          <w:bCs/>
+          <w:sz w:val="28"/>
+          <w:szCs w:val="28"/>
+          <w:lang w:val="en-US"/>
+        </w:rPr>
+        <w:t>Hyperparameter Tuning and Evaluation:</w:t>
+      </w:r>
+    </w:p>
+    <w:p>
+      <w:pPr>
+        <w:spacing w:line="240" w:lineRule="auto"/>
+        <w:rPr>
+          <w:sz w:val="24"/>
+          <w:szCs w:val="24"/>
+          <w:lang w:val="en-US"/>
+        </w:rPr>
+      </w:pPr>
+      <w:r>
+        <w:rPr>
+          <w:sz w:val="24"/>
+          <w:szCs w:val="24"/>
+          <w:lang w:val="en-US"/>
+        </w:rPr>
+        <w:t xml:space="preserve">Hyperparameters were tuned on the training set using </w:t>
+      </w:r>
+      <w:proofErr w:type="spellStart"/>
+      <w:r>
+        <w:rPr>
+          <w:i/>
+          <w:iCs/>
+          <w:sz w:val="24"/>
+          <w:szCs w:val="24"/>
+          <w:lang w:val="en-US"/>
+        </w:rPr>
+        <w:t>RandomizedSearchCV</w:t>
+      </w:r>
+      <w:proofErr w:type="spellEnd"/>
+      <w:r>
+        <w:rPr>
+          <w:sz w:val="24"/>
+          <w:szCs w:val="24"/>
+          <w:lang w:val="en-US"/>
+        </w:rPr>
+        <w:t xml:space="preserve"> with five</w:t>
+      </w:r>
+      <w:r>
+        <w:rPr>
+          <w:sz w:val="24"/>
+          <w:szCs w:val="24"/>
+          <w:lang w:val="en-US"/>
+        </w:rPr>
+        <w:t>-</w:t>
+      </w:r>
+      <w:r>
+        <w:rPr>
+          <w:sz w:val="24"/>
+          <w:szCs w:val="24"/>
+          <w:lang w:val="en-US"/>
+        </w:rPr>
+        <w:t>fold stratified cross</w:t>
+      </w:r>
+      <w:r>
+        <w:rPr>
+          <w:sz w:val="24"/>
+          <w:szCs w:val="24"/>
+          <w:lang w:val="en-US"/>
+        </w:rPr>
+        <w:t>-</w:t>
+      </w:r>
+      <w:r>
+        <w:rPr>
+          <w:sz w:val="24"/>
+          <w:szCs w:val="24"/>
+          <w:lang w:val="en-US"/>
+        </w:rPr>
+        <w:t>validation.  The search explored key Random Forest settings such as number of trees, maximum depth, minimum samples to split, minimum samples per leaf, max_features, and class_weight, and it also tuned the TF IDF max_features setting to balance expressiveness and overfitting risk.  Macro averaged F1 was used as the optimisation metric because classes are imbalanced and performance should be strong across all severity levels rather than dominated by the majority class.  Final reporting included Accuracy, Macro F1, and Weighted F1, plus a full classification report with per</w:t>
+      </w:r>
+      <w:r>
+        <w:rPr>
+          <w:sz w:val="24"/>
+          <w:szCs w:val="24"/>
+          <w:lang w:val="en-US"/>
+        </w:rPr>
+        <w:t>-</w:t>
+      </w:r>
+      <w:r>
+        <w:rPr>
+          <w:sz w:val="24"/>
+          <w:szCs w:val="24"/>
+          <w:lang w:val="en-US"/>
+        </w:rPr>
+        <w:t xml:space="preserve">class precision, recall, and F1.  Visual evaluation used confusion matrices in both raw counts and </w:t>
+      </w:r>
+      <w:proofErr w:type="spellStart"/>
+      <w:r>
+        <w:rPr>
+          <w:sz w:val="24"/>
+          <w:szCs w:val="24"/>
+          <w:lang w:val="en-US"/>
+        </w:rPr>
+        <w:t>normalised</w:t>
+      </w:r>
+      <w:proofErr w:type="spellEnd"/>
+      <w:r>
+        <w:rPr>
+          <w:sz w:val="24"/>
+          <w:szCs w:val="24"/>
+          <w:lang w:val="en-US"/>
+        </w:rPr>
+        <w:t xml:space="preserve"> form, per</w:t>
+      </w:r>
+      <w:r>
+        <w:rPr>
+          <w:sz w:val="24"/>
+          <w:szCs w:val="24"/>
+          <w:lang w:val="en-US"/>
+        </w:rPr>
+        <w:t>-</w:t>
+      </w:r>
+      <w:r>
+        <w:rPr>
+          <w:sz w:val="24"/>
+          <w:szCs w:val="24"/>
+          <w:lang w:val="en-US"/>
+        </w:rPr>
+        <w:t xml:space="preserve">class F1 and support plots to show performance under imbalance, and one versus rest ROC curves with micro and </w:t>
+      </w:r>
+      <w:r>
+        <w:rPr>
+          <w:sz w:val="24"/>
+          <w:szCs w:val="24"/>
+          <w:lang w:val="en-US"/>
+        </w:rPr>
+        <w:t>M</w:t>
+      </w:r>
+      <w:r>
+        <w:rPr>
+          <w:sz w:val="24"/>
+          <w:szCs w:val="24"/>
+          <w:lang w:val="en-US"/>
+        </w:rPr>
+        <w:t xml:space="preserve">acro AUC to assess how well predicted probabilities separate each class across </w:t>
+      </w:r>
+      <w:r>
+        <w:rPr>
+          <w:sz w:val="24"/>
+          <w:szCs w:val="24"/>
           <w:lang w:val="en-US"/>
         </w:rPr>
         <w:lastRenderedPageBreak/>
-        <w:t>Methodology</w:t>
-      </w:r>
+        <w:t>thresholds.  Overall, results showed that TF IDF text features provided the largest performance gain over structured features alone, with most remaining errors occurring between adjacent severity levels, which is consistent with overlapping language used to describe borderline cases.</w:t>
+      </w:r>
+    </w:p>
+    <w:p>
+      <w:pPr>
+        <w:rPr>
+          <w:sz w:val="24"/>
+          <w:szCs w:val="24"/>
+          <w:lang w:val="en-US"/>
+        </w:rPr>
+      </w:pPr>
     </w:p>
     <w:p>
       <w:pPr>
@@ -3768,7 +4294,39 @@
           <w:szCs w:val="24"/>
           <w:lang w:val="en-US"/>
         </w:rPr>
-        <w:t xml:space="preserve"> (Luke Cardona to determine based on EDA insights which problem we should focus on)</w:t>
+        <w:t xml:space="preserve"> (Luke Cardona to determine</w:t>
+      </w:r>
+      <w:r>
+        <w:rPr>
+          <w:sz w:val="24"/>
+          <w:szCs w:val="24"/>
+          <w:lang w:val="en-US"/>
+        </w:rPr>
+        <w:t>,</w:t>
+      </w:r>
+      <w:r>
+        <w:rPr>
+          <w:sz w:val="24"/>
+          <w:szCs w:val="24"/>
+          <w:lang w:val="en-US"/>
+        </w:rPr>
+        <w:t xml:space="preserve"> based on EDA insights</w:t>
+      </w:r>
+      <w:r>
+        <w:rPr>
+          <w:sz w:val="24"/>
+          <w:szCs w:val="24"/>
+          <w:lang w:val="en-US"/>
+        </w:rPr>
+        <w:t>,</w:t>
+      </w:r>
+      <w:r>
+        <w:rPr>
+          <w:sz w:val="24"/>
+          <w:szCs w:val="24"/>
+          <w:lang w:val="en-US"/>
+        </w:rPr>
+        <w:t xml:space="preserve"> which problem we should focus on)</w:t>
       </w:r>
     </w:p>
     <w:p>
@@ -3826,11 +4384,13 @@
     </w:p>
     <w:p>
       <w:pPr>
+        <w:spacing w:line="240" w:lineRule="auto"/>
         <w:rPr>
           <w:b/>
           <w:bCs/>
           <w:sz w:val="32"/>
           <w:szCs w:val="32"/>
+          <w:u w:val="single"/>
           <w:lang w:val="en-US"/>
         </w:rPr>
       </w:pPr>
@@ -3840,10 +4400,294 @@
           <w:bCs/>
           <w:sz w:val="32"/>
           <w:szCs w:val="32"/>
+          <w:u w:val="single"/>
           <w:lang w:val="en-US"/>
         </w:rPr>
         <w:t>Results</w:t>
       </w:r>
+    </w:p>
+    <w:p>
+      <w:pPr>
+        <w:spacing w:line="240" w:lineRule="auto"/>
+        <w:rPr>
+          <w:b/>
+          <w:bCs/>
+          <w:sz w:val="28"/>
+          <w:szCs w:val="28"/>
+          <w:u w:val="single"/>
+          <w:lang w:val="en-US"/>
+        </w:rPr>
+      </w:pPr>
+      <w:r>
+        <w:rPr>
+          <w:b/>
+          <w:bCs/>
+          <w:sz w:val="28"/>
+          <w:szCs w:val="28"/>
+          <w:u w:val="single"/>
+          <w:lang w:val="en-US"/>
+        </w:rPr>
+        <w:t>Individual Model Performance: Random Forest</w:t>
+      </w:r>
+    </w:p>
+    <w:p>
+      <w:pPr>
+        <w:spacing w:line="240" w:lineRule="auto"/>
+        <w:rPr>
+          <w:sz w:val="24"/>
+          <w:szCs w:val="24"/>
+          <w:lang w:val="en-US"/>
+        </w:rPr>
+      </w:pPr>
+      <w:r>
+        <w:rPr>
+          <w:sz w:val="24"/>
+          <w:szCs w:val="24"/>
+          <w:lang w:val="en-US"/>
+        </w:rPr>
+        <w:t>The Random Forest models were evaluated on an 80</w:t>
+      </w:r>
+      <w:r>
+        <w:rPr>
+          <w:sz w:val="24"/>
+          <w:szCs w:val="24"/>
+          <w:lang w:val="en-US"/>
+        </w:rPr>
+        <w:t>/</w:t>
+      </w:r>
+      <w:r>
+        <w:rPr>
+          <w:sz w:val="24"/>
+          <w:szCs w:val="24"/>
+          <w:lang w:val="en-US"/>
+        </w:rPr>
+        <w:t>20 stratified train</w:t>
+      </w:r>
+      <w:r>
+        <w:rPr>
+          <w:sz w:val="24"/>
+          <w:szCs w:val="24"/>
+          <w:lang w:val="en-US"/>
+        </w:rPr>
+        <w:t>-</w:t>
+      </w:r>
+      <w:r>
+        <w:rPr>
+          <w:sz w:val="24"/>
+          <w:szCs w:val="24"/>
+          <w:lang w:val="en-US"/>
+        </w:rPr>
+        <w:t xml:space="preserve">test split to preserve the severity distribution.  A majority class baseline achieved 0.448 accuracy, indicating that simply predicting the most frequent severity level performs poorly for minority classes.  A Random Forest using only structured features produced a small improvement, reaching 0.471 accuracy with </w:t>
+      </w:r>
+      <w:r>
+        <w:rPr>
+          <w:sz w:val="24"/>
+          <w:szCs w:val="24"/>
+          <w:lang w:val="en-US"/>
+        </w:rPr>
+        <w:t xml:space="preserve">a </w:t>
+      </w:r>
+      <w:r>
+        <w:rPr>
+          <w:sz w:val="24"/>
+          <w:szCs w:val="24"/>
+          <w:lang w:val="en-US"/>
+        </w:rPr>
+        <w:t>M</w:t>
+      </w:r>
+      <w:r>
+        <w:rPr>
+          <w:sz w:val="24"/>
+          <w:szCs w:val="24"/>
+          <w:lang w:val="en-US"/>
+        </w:rPr>
+        <w:t xml:space="preserve">acro F1 of 0.393, suggesting </w:t>
+      </w:r>
+      <w:r>
+        <w:rPr>
+          <w:sz w:val="24"/>
+          <w:szCs w:val="24"/>
+          <w:lang w:val="en-US"/>
+        </w:rPr>
+        <w:t xml:space="preserve">a </w:t>
+      </w:r>
+      <w:r>
+        <w:rPr>
+          <w:sz w:val="24"/>
+          <w:szCs w:val="24"/>
+          <w:lang w:val="en-US"/>
+        </w:rPr>
+        <w:t>limited predictive signal from weather and calendar variables alone.</w:t>
+      </w:r>
+    </w:p>
+    <w:p>
+      <w:pPr>
+        <w:spacing w:line="240" w:lineRule="auto"/>
+        <w:rPr>
+          <w:sz w:val="24"/>
+          <w:szCs w:val="24"/>
+          <w:lang w:val="en-US"/>
+        </w:rPr>
+      </w:pPr>
+      <w:r>
+        <w:rPr>
+          <w:sz w:val="24"/>
+          <w:szCs w:val="24"/>
+          <w:lang w:val="en-US"/>
+        </w:rPr>
+        <w:t xml:space="preserve">Adding TF IDF text features produced a large performance gain.  The combined text plus structured model achieved 0.759 accuracy with </w:t>
+      </w:r>
+      <w:r>
+        <w:rPr>
+          <w:sz w:val="24"/>
+          <w:szCs w:val="24"/>
+          <w:lang w:val="en-US"/>
+        </w:rPr>
+        <w:t xml:space="preserve">a </w:t>
+      </w:r>
+      <w:r>
+        <w:rPr>
+          <w:sz w:val="24"/>
+          <w:szCs w:val="24"/>
+          <w:lang w:val="en-US"/>
+        </w:rPr>
+        <w:t>Macro F1 of 0.677, showing that language patterns in the articles are the main driver of severity prediction.  After hyperparameter tuning with stratified 5</w:t>
+      </w:r>
+      <w:r>
+        <w:rPr>
+          <w:sz w:val="24"/>
+          <w:szCs w:val="24"/>
+          <w:lang w:val="en-US"/>
+        </w:rPr>
+        <w:t>-fold</w:t>
+      </w:r>
+      <w:r>
+        <w:rPr>
+          <w:sz w:val="24"/>
+          <w:szCs w:val="24"/>
+          <w:lang w:val="en-US"/>
+        </w:rPr>
+        <w:t xml:space="preserve"> </w:t>
+      </w:r>
+      <w:r>
+        <w:rPr>
+          <w:sz w:val="24"/>
+          <w:szCs w:val="24"/>
+          <w:lang w:val="en-US"/>
+        </w:rPr>
+        <w:t>cross-</w:t>
+      </w:r>
+      <w:r>
+        <w:rPr>
+          <w:sz w:val="24"/>
+          <w:szCs w:val="24"/>
+          <w:lang w:val="en-US"/>
+        </w:rPr>
+        <w:t xml:space="preserve">validation, the final tuned model achieved 0.862 accuracy and </w:t>
+      </w:r>
+      <w:r>
+        <w:rPr>
+          <w:sz w:val="24"/>
+          <w:szCs w:val="24"/>
+          <w:lang w:val="en-US"/>
+        </w:rPr>
+        <w:t xml:space="preserve">a </w:t>
+      </w:r>
+      <w:r>
+        <w:rPr>
+          <w:sz w:val="24"/>
+          <w:szCs w:val="24"/>
+          <w:lang w:val="en-US"/>
+        </w:rPr>
+        <w:t>M</w:t>
+      </w:r>
+      <w:r>
+        <w:rPr>
+          <w:sz w:val="24"/>
+          <w:szCs w:val="24"/>
+          <w:lang w:val="en-US"/>
+        </w:rPr>
+        <w:t>acro F1 of 0.859 on the held</w:t>
+      </w:r>
+      <w:r>
+        <w:rPr>
+          <w:sz w:val="24"/>
+          <w:szCs w:val="24"/>
+          <w:lang w:val="en-US"/>
+        </w:rPr>
+        <w:t>-</w:t>
+      </w:r>
+      <w:r>
+        <w:rPr>
+          <w:sz w:val="24"/>
+          <w:szCs w:val="24"/>
+          <w:lang w:val="en-US"/>
+        </w:rPr>
+        <w:t>out test set, indicating strong performance across classes rather than only on the dominant class.</w:t>
+      </w:r>
+    </w:p>
+    <w:p>
+      <w:pPr>
+        <w:spacing w:line="240" w:lineRule="auto"/>
+        <w:rPr>
+          <w:sz w:val="24"/>
+          <w:szCs w:val="24"/>
+          <w:lang w:val="en-US"/>
+        </w:rPr>
+      </w:pPr>
+      <w:r>
+        <w:rPr>
+          <w:sz w:val="24"/>
+          <w:szCs w:val="24"/>
+          <w:lang w:val="en-US"/>
+        </w:rPr>
+        <w:t xml:space="preserve">Error analysis from the confusion matrix showed that most mistakes occur between adjacent severity levels, which is expected because neighbouring classes often share similar wording.  Per class scores were generally strong, although severity class 2 was comparatively weaker before tuning, consistent with overlap in phrasing between moderate and higher severity reports.  Feature importance also aligned with the task, with </w:t>
+      </w:r>
+      <w:proofErr w:type="gramStart"/>
+      <w:r>
+        <w:rPr>
+          <w:sz w:val="24"/>
+          <w:szCs w:val="24"/>
+          <w:lang w:val="en-US"/>
+        </w:rPr>
+        <w:t>high ranking</w:t>
+      </w:r>
+      <w:proofErr w:type="gramEnd"/>
+      <w:r>
+        <w:rPr>
+          <w:sz w:val="24"/>
+          <w:szCs w:val="24"/>
+          <w:lang w:val="en-US"/>
+        </w:rPr>
+        <w:t xml:space="preserve"> TF IDF terms such as hospital, injuries, death, and fatal, while structured variables such as tag indicators and selected weather features contributed </w:t>
+      </w:r>
+      <w:r>
+        <w:rPr>
+          <w:sz w:val="24"/>
+          <w:szCs w:val="24"/>
+          <w:lang w:val="en-US"/>
+        </w:rPr>
+        <w:t xml:space="preserve">a </w:t>
+      </w:r>
+      <w:r>
+        <w:rPr>
+          <w:sz w:val="24"/>
+          <w:szCs w:val="24"/>
+          <w:lang w:val="en-US"/>
+        </w:rPr>
+        <w:t>smaller supporting signal.</w:t>
+      </w:r>
+    </w:p>
+    <w:p>
+      <w:pPr>
+        <w:rPr>
+          <w:b/>
+          <w:bCs/>
+          <w:sz w:val="32"/>
+          <w:szCs w:val="32"/>
+          <w:lang w:val="en-US"/>
+        </w:rPr>
+      </w:pPr>
     </w:p>
     <w:p>
       <w:pPr>
@@ -4299,7 +5143,6 @@
           <w:szCs w:val="32"/>
           <w:lang w:val="en-US"/>
         </w:rPr>
-        <w:lastRenderedPageBreak/>
         <w:t>Conclusion</w:t>
       </w:r>
     </w:p>
@@ -4628,7 +5471,6 @@
           <w:szCs w:val="32"/>
           <w:lang w:val="en-US"/>
         </w:rPr>
-        <w:lastRenderedPageBreak/>
         <w:t>References</w:t>
       </w:r>
     </w:p>
@@ -4690,12 +5532,21 @@
         <w:t xml:space="preserve"> development team, “</w:t>
       </w:r>
       <w:proofErr w:type="spellStart"/>
-      <w:r>
-        <w:rPr>
-          <w:sz w:val="24"/>
-          <w:szCs w:val="24"/>
-        </w:rPr>
-        <w:t>pandas.Series.dt.year</w:t>
+      <w:proofErr w:type="gramStart"/>
+      <w:r>
+        <w:rPr>
+          <w:sz w:val="24"/>
+          <w:szCs w:val="24"/>
+        </w:rPr>
+        <w:t>pandas.Series.dt</w:t>
+      </w:r>
+      <w:proofErr w:type="gramEnd"/>
+      <w:r>
+        <w:rPr>
+          <w:sz w:val="24"/>
+          <w:szCs w:val="24"/>
+        </w:rPr>
+        <w:t>.year</w:t>
       </w:r>
       <w:proofErr w:type="spellEnd"/>
       <w:r>
@@ -4854,6 +5705,7 @@
           <w:sz w:val="24"/>
           <w:szCs w:val="24"/>
         </w:rPr>
+        <w:lastRenderedPageBreak/>
         <w:t xml:space="preserve">[4] </w:t>
       </w:r>
       <w:r>
@@ -5166,6 +6018,119 @@
     </w:lvl>
   </w:abstractNum>
   <w:abstractNum w:abstractNumId="2" w15:restartNumberingAfterBreak="0">
+    <w:nsid w:val="07E513C7"/>
+    <w:multiLevelType w:val="multilevel"/>
+    <w:tmpl w:val="E5C8ED1C"/>
+    <w:lvl w:ilvl="0">
+      <w:start w:val="5"/>
+      <w:numFmt w:val="decimal"/>
+      <w:lvlText w:val="%1."/>
+      <w:lvlJc w:val="left"/>
+      <w:pPr>
+        <w:tabs>
+          <w:tab w:val="num" w:pos="720"/>
+        </w:tabs>
+        <w:ind w:left="720" w:hanging="360"/>
+      </w:pPr>
+    </w:lvl>
+    <w:lvl w:ilvl="1" w:tentative="1">
+      <w:start w:val="1"/>
+      <w:numFmt w:val="decimal"/>
+      <w:lvlText w:val="%2."/>
+      <w:lvlJc w:val="left"/>
+      <w:pPr>
+        <w:tabs>
+          <w:tab w:val="num" w:pos="1440"/>
+        </w:tabs>
+        <w:ind w:left="1440" w:hanging="360"/>
+      </w:pPr>
+    </w:lvl>
+    <w:lvl w:ilvl="2" w:tentative="1">
+      <w:start w:val="1"/>
+      <w:numFmt w:val="decimal"/>
+      <w:lvlText w:val="%3."/>
+      <w:lvlJc w:val="left"/>
+      <w:pPr>
+        <w:tabs>
+          <w:tab w:val="num" w:pos="2160"/>
+        </w:tabs>
+        <w:ind w:left="2160" w:hanging="360"/>
+      </w:pPr>
+    </w:lvl>
+    <w:lvl w:ilvl="3" w:tentative="1">
+      <w:start w:val="1"/>
+      <w:numFmt w:val="decimal"/>
+      <w:lvlText w:val="%4."/>
+      <w:lvlJc w:val="left"/>
+      <w:pPr>
+        <w:tabs>
+          <w:tab w:val="num" w:pos="2880"/>
+        </w:tabs>
+        <w:ind w:left="2880" w:hanging="360"/>
+      </w:pPr>
+    </w:lvl>
+    <w:lvl w:ilvl="4" w:tentative="1">
+      <w:start w:val="1"/>
+      <w:numFmt w:val="decimal"/>
+      <w:lvlText w:val="%5."/>
+      <w:lvlJc w:val="left"/>
+      <w:pPr>
+        <w:tabs>
+          <w:tab w:val="num" w:pos="3600"/>
+        </w:tabs>
+        <w:ind w:left="3600" w:hanging="360"/>
+      </w:pPr>
+    </w:lvl>
+    <w:lvl w:ilvl="5" w:tentative="1">
+      <w:start w:val="1"/>
+      <w:numFmt w:val="decimal"/>
+      <w:lvlText w:val="%6."/>
+      <w:lvlJc w:val="left"/>
+      <w:pPr>
+        <w:tabs>
+          <w:tab w:val="num" w:pos="4320"/>
+        </w:tabs>
+        <w:ind w:left="4320" w:hanging="360"/>
+      </w:pPr>
+    </w:lvl>
+    <w:lvl w:ilvl="6" w:tentative="1">
+      <w:start w:val="1"/>
+      <w:numFmt w:val="decimal"/>
+      <w:lvlText w:val="%7."/>
+      <w:lvlJc w:val="left"/>
+      <w:pPr>
+        <w:tabs>
+          <w:tab w:val="num" w:pos="5040"/>
+        </w:tabs>
+        <w:ind w:left="5040" w:hanging="360"/>
+      </w:pPr>
+    </w:lvl>
+    <w:lvl w:ilvl="7" w:tentative="1">
+      <w:start w:val="1"/>
+      <w:numFmt w:val="decimal"/>
+      <w:lvlText w:val="%8."/>
+      <w:lvlJc w:val="left"/>
+      <w:pPr>
+        <w:tabs>
+          <w:tab w:val="num" w:pos="5760"/>
+        </w:tabs>
+        <w:ind w:left="5760" w:hanging="360"/>
+      </w:pPr>
+    </w:lvl>
+    <w:lvl w:ilvl="8" w:tentative="1">
+      <w:start w:val="1"/>
+      <w:numFmt w:val="decimal"/>
+      <w:lvlText w:val="%9."/>
+      <w:lvlJc w:val="left"/>
+      <w:pPr>
+        <w:tabs>
+          <w:tab w:val="num" w:pos="6480"/>
+        </w:tabs>
+        <w:ind w:left="6480" w:hanging="360"/>
+      </w:pPr>
+    </w:lvl>
+  </w:abstractNum>
+  <w:abstractNum w:abstractNumId="3" w15:restartNumberingAfterBreak="0">
     <w:nsid w:val="095D59F7"/>
     <w:multiLevelType w:val="hybridMultilevel"/>
     <w:tmpl w:val="27343972"/>
@@ -5278,7 +6243,120 @@
       </w:rPr>
     </w:lvl>
   </w:abstractNum>
-  <w:abstractNum w:abstractNumId="3" w15:restartNumberingAfterBreak="0">
+  <w:abstractNum w:abstractNumId="4" w15:restartNumberingAfterBreak="0">
+    <w:nsid w:val="0A8C5537"/>
+    <w:multiLevelType w:val="multilevel"/>
+    <w:tmpl w:val="CF4AFE14"/>
+    <w:lvl w:ilvl="0">
+      <w:start w:val="6"/>
+      <w:numFmt w:val="decimal"/>
+      <w:lvlText w:val="%1."/>
+      <w:lvlJc w:val="left"/>
+      <w:pPr>
+        <w:tabs>
+          <w:tab w:val="num" w:pos="720"/>
+        </w:tabs>
+        <w:ind w:left="720" w:hanging="360"/>
+      </w:pPr>
+    </w:lvl>
+    <w:lvl w:ilvl="1" w:tentative="1">
+      <w:start w:val="1"/>
+      <w:numFmt w:val="decimal"/>
+      <w:lvlText w:val="%2."/>
+      <w:lvlJc w:val="left"/>
+      <w:pPr>
+        <w:tabs>
+          <w:tab w:val="num" w:pos="1440"/>
+        </w:tabs>
+        <w:ind w:left="1440" w:hanging="360"/>
+      </w:pPr>
+    </w:lvl>
+    <w:lvl w:ilvl="2" w:tentative="1">
+      <w:start w:val="1"/>
+      <w:numFmt w:val="decimal"/>
+      <w:lvlText w:val="%3."/>
+      <w:lvlJc w:val="left"/>
+      <w:pPr>
+        <w:tabs>
+          <w:tab w:val="num" w:pos="2160"/>
+        </w:tabs>
+        <w:ind w:left="2160" w:hanging="360"/>
+      </w:pPr>
+    </w:lvl>
+    <w:lvl w:ilvl="3" w:tentative="1">
+      <w:start w:val="1"/>
+      <w:numFmt w:val="decimal"/>
+      <w:lvlText w:val="%4."/>
+      <w:lvlJc w:val="left"/>
+      <w:pPr>
+        <w:tabs>
+          <w:tab w:val="num" w:pos="2880"/>
+        </w:tabs>
+        <w:ind w:left="2880" w:hanging="360"/>
+      </w:pPr>
+    </w:lvl>
+    <w:lvl w:ilvl="4" w:tentative="1">
+      <w:start w:val="1"/>
+      <w:numFmt w:val="decimal"/>
+      <w:lvlText w:val="%5."/>
+      <w:lvlJc w:val="left"/>
+      <w:pPr>
+        <w:tabs>
+          <w:tab w:val="num" w:pos="3600"/>
+        </w:tabs>
+        <w:ind w:left="3600" w:hanging="360"/>
+      </w:pPr>
+    </w:lvl>
+    <w:lvl w:ilvl="5" w:tentative="1">
+      <w:start w:val="1"/>
+      <w:numFmt w:val="decimal"/>
+      <w:lvlText w:val="%6."/>
+      <w:lvlJc w:val="left"/>
+      <w:pPr>
+        <w:tabs>
+          <w:tab w:val="num" w:pos="4320"/>
+        </w:tabs>
+        <w:ind w:left="4320" w:hanging="360"/>
+      </w:pPr>
+    </w:lvl>
+    <w:lvl w:ilvl="6" w:tentative="1">
+      <w:start w:val="1"/>
+      <w:numFmt w:val="decimal"/>
+      <w:lvlText w:val="%7."/>
+      <w:lvlJc w:val="left"/>
+      <w:pPr>
+        <w:tabs>
+          <w:tab w:val="num" w:pos="5040"/>
+        </w:tabs>
+        <w:ind w:left="5040" w:hanging="360"/>
+      </w:pPr>
+    </w:lvl>
+    <w:lvl w:ilvl="7" w:tentative="1">
+      <w:start w:val="1"/>
+      <w:numFmt w:val="decimal"/>
+      <w:lvlText w:val="%8."/>
+      <w:lvlJc w:val="left"/>
+      <w:pPr>
+        <w:tabs>
+          <w:tab w:val="num" w:pos="5760"/>
+        </w:tabs>
+        <w:ind w:left="5760" w:hanging="360"/>
+      </w:pPr>
+    </w:lvl>
+    <w:lvl w:ilvl="8" w:tentative="1">
+      <w:start w:val="1"/>
+      <w:numFmt w:val="decimal"/>
+      <w:lvlText w:val="%9."/>
+      <w:lvlJc w:val="left"/>
+      <w:pPr>
+        <w:tabs>
+          <w:tab w:val="num" w:pos="6480"/>
+        </w:tabs>
+        <w:ind w:left="6480" w:hanging="360"/>
+      </w:pPr>
+    </w:lvl>
+  </w:abstractNum>
+  <w:abstractNum w:abstractNumId="5" w15:restartNumberingAfterBreak="0">
     <w:nsid w:val="15A87ABC"/>
     <w:multiLevelType w:val="hybridMultilevel"/>
     <w:tmpl w:val="B254ADC2"/>
@@ -5391,7 +6469,7 @@
       </w:rPr>
     </w:lvl>
   </w:abstractNum>
-  <w:abstractNum w:abstractNumId="4" w15:restartNumberingAfterBreak="0">
+  <w:abstractNum w:abstractNumId="6" w15:restartNumberingAfterBreak="0">
     <w:nsid w:val="39DA1E4A"/>
     <w:multiLevelType w:val="hybridMultilevel"/>
     <w:tmpl w:val="7F10193A"/>
@@ -5504,7 +6582,7 @@
       </w:rPr>
     </w:lvl>
   </w:abstractNum>
-  <w:abstractNum w:abstractNumId="5" w15:restartNumberingAfterBreak="0">
+  <w:abstractNum w:abstractNumId="7" w15:restartNumberingAfterBreak="0">
     <w:nsid w:val="3ACD0A4E"/>
     <w:multiLevelType w:val="hybridMultilevel"/>
     <w:tmpl w:val="1F2A18EE"/>
@@ -5617,7 +6695,7 @@
       </w:rPr>
     </w:lvl>
   </w:abstractNum>
-  <w:abstractNum w:abstractNumId="6" w15:restartNumberingAfterBreak="0">
+  <w:abstractNum w:abstractNumId="8" w15:restartNumberingAfterBreak="0">
     <w:nsid w:val="3F166206"/>
     <w:multiLevelType w:val="hybridMultilevel"/>
     <w:tmpl w:val="8702E73E"/>
@@ -5730,7 +6808,7 @@
       </w:rPr>
     </w:lvl>
   </w:abstractNum>
-  <w:abstractNum w:abstractNumId="7" w15:restartNumberingAfterBreak="0">
+  <w:abstractNum w:abstractNumId="9" w15:restartNumberingAfterBreak="0">
     <w:nsid w:val="463824AF"/>
     <w:multiLevelType w:val="hybridMultilevel"/>
     <w:tmpl w:val="EF9CCED0"/>
@@ -5843,7 +6921,233 @@
       </w:rPr>
     </w:lvl>
   </w:abstractNum>
-  <w:abstractNum w:abstractNumId="8" w15:restartNumberingAfterBreak="0">
+  <w:abstractNum w:abstractNumId="10" w15:restartNumberingAfterBreak="0">
+    <w:nsid w:val="4B0B2F2E"/>
+    <w:multiLevelType w:val="multilevel"/>
+    <w:tmpl w:val="49106A16"/>
+    <w:lvl w:ilvl="0">
+      <w:start w:val="8"/>
+      <w:numFmt w:val="decimal"/>
+      <w:lvlText w:val="%1."/>
+      <w:lvlJc w:val="left"/>
+      <w:pPr>
+        <w:tabs>
+          <w:tab w:val="num" w:pos="720"/>
+        </w:tabs>
+        <w:ind w:left="720" w:hanging="360"/>
+      </w:pPr>
+    </w:lvl>
+    <w:lvl w:ilvl="1" w:tentative="1">
+      <w:start w:val="1"/>
+      <w:numFmt w:val="decimal"/>
+      <w:lvlText w:val="%2."/>
+      <w:lvlJc w:val="left"/>
+      <w:pPr>
+        <w:tabs>
+          <w:tab w:val="num" w:pos="1440"/>
+        </w:tabs>
+        <w:ind w:left="1440" w:hanging="360"/>
+      </w:pPr>
+    </w:lvl>
+    <w:lvl w:ilvl="2" w:tentative="1">
+      <w:start w:val="1"/>
+      <w:numFmt w:val="decimal"/>
+      <w:lvlText w:val="%3."/>
+      <w:lvlJc w:val="left"/>
+      <w:pPr>
+        <w:tabs>
+          <w:tab w:val="num" w:pos="2160"/>
+        </w:tabs>
+        <w:ind w:left="2160" w:hanging="360"/>
+      </w:pPr>
+    </w:lvl>
+    <w:lvl w:ilvl="3" w:tentative="1">
+      <w:start w:val="1"/>
+      <w:numFmt w:val="decimal"/>
+      <w:lvlText w:val="%4."/>
+      <w:lvlJc w:val="left"/>
+      <w:pPr>
+        <w:tabs>
+          <w:tab w:val="num" w:pos="2880"/>
+        </w:tabs>
+        <w:ind w:left="2880" w:hanging="360"/>
+      </w:pPr>
+    </w:lvl>
+    <w:lvl w:ilvl="4" w:tentative="1">
+      <w:start w:val="1"/>
+      <w:numFmt w:val="decimal"/>
+      <w:lvlText w:val="%5."/>
+      <w:lvlJc w:val="left"/>
+      <w:pPr>
+        <w:tabs>
+          <w:tab w:val="num" w:pos="3600"/>
+        </w:tabs>
+        <w:ind w:left="3600" w:hanging="360"/>
+      </w:pPr>
+    </w:lvl>
+    <w:lvl w:ilvl="5" w:tentative="1">
+      <w:start w:val="1"/>
+      <w:numFmt w:val="decimal"/>
+      <w:lvlText w:val="%6."/>
+      <w:lvlJc w:val="left"/>
+      <w:pPr>
+        <w:tabs>
+          <w:tab w:val="num" w:pos="4320"/>
+        </w:tabs>
+        <w:ind w:left="4320" w:hanging="360"/>
+      </w:pPr>
+    </w:lvl>
+    <w:lvl w:ilvl="6" w:tentative="1">
+      <w:start w:val="1"/>
+      <w:numFmt w:val="decimal"/>
+      <w:lvlText w:val="%7."/>
+      <w:lvlJc w:val="left"/>
+      <w:pPr>
+        <w:tabs>
+          <w:tab w:val="num" w:pos="5040"/>
+        </w:tabs>
+        <w:ind w:left="5040" w:hanging="360"/>
+      </w:pPr>
+    </w:lvl>
+    <w:lvl w:ilvl="7" w:tentative="1">
+      <w:start w:val="1"/>
+      <w:numFmt w:val="decimal"/>
+      <w:lvlText w:val="%8."/>
+      <w:lvlJc w:val="left"/>
+      <w:pPr>
+        <w:tabs>
+          <w:tab w:val="num" w:pos="5760"/>
+        </w:tabs>
+        <w:ind w:left="5760" w:hanging="360"/>
+      </w:pPr>
+    </w:lvl>
+    <w:lvl w:ilvl="8" w:tentative="1">
+      <w:start w:val="1"/>
+      <w:numFmt w:val="decimal"/>
+      <w:lvlText w:val="%9."/>
+      <w:lvlJc w:val="left"/>
+      <w:pPr>
+        <w:tabs>
+          <w:tab w:val="num" w:pos="6480"/>
+        </w:tabs>
+        <w:ind w:left="6480" w:hanging="360"/>
+      </w:pPr>
+    </w:lvl>
+  </w:abstractNum>
+  <w:abstractNum w:abstractNumId="11" w15:restartNumberingAfterBreak="0">
+    <w:nsid w:val="4C0A6AB4"/>
+    <w:multiLevelType w:val="multilevel"/>
+    <w:tmpl w:val="75AEFBD6"/>
+    <w:lvl w:ilvl="0">
+      <w:start w:val="3"/>
+      <w:numFmt w:val="decimal"/>
+      <w:lvlText w:val="%1."/>
+      <w:lvlJc w:val="left"/>
+      <w:pPr>
+        <w:tabs>
+          <w:tab w:val="num" w:pos="720"/>
+        </w:tabs>
+        <w:ind w:left="720" w:hanging="360"/>
+      </w:pPr>
+    </w:lvl>
+    <w:lvl w:ilvl="1" w:tentative="1">
+      <w:start w:val="1"/>
+      <w:numFmt w:val="decimal"/>
+      <w:lvlText w:val="%2."/>
+      <w:lvlJc w:val="left"/>
+      <w:pPr>
+        <w:tabs>
+          <w:tab w:val="num" w:pos="1440"/>
+        </w:tabs>
+        <w:ind w:left="1440" w:hanging="360"/>
+      </w:pPr>
+    </w:lvl>
+    <w:lvl w:ilvl="2" w:tentative="1">
+      <w:start w:val="1"/>
+      <w:numFmt w:val="decimal"/>
+      <w:lvlText w:val="%3."/>
+      <w:lvlJc w:val="left"/>
+      <w:pPr>
+        <w:tabs>
+          <w:tab w:val="num" w:pos="2160"/>
+        </w:tabs>
+        <w:ind w:left="2160" w:hanging="360"/>
+      </w:pPr>
+    </w:lvl>
+    <w:lvl w:ilvl="3" w:tentative="1">
+      <w:start w:val="1"/>
+      <w:numFmt w:val="decimal"/>
+      <w:lvlText w:val="%4."/>
+      <w:lvlJc w:val="left"/>
+      <w:pPr>
+        <w:tabs>
+          <w:tab w:val="num" w:pos="2880"/>
+        </w:tabs>
+        <w:ind w:left="2880" w:hanging="360"/>
+      </w:pPr>
+    </w:lvl>
+    <w:lvl w:ilvl="4" w:tentative="1">
+      <w:start w:val="1"/>
+      <w:numFmt w:val="decimal"/>
+      <w:lvlText w:val="%5."/>
+      <w:lvlJc w:val="left"/>
+      <w:pPr>
+        <w:tabs>
+          <w:tab w:val="num" w:pos="3600"/>
+        </w:tabs>
+        <w:ind w:left="3600" w:hanging="360"/>
+      </w:pPr>
+    </w:lvl>
+    <w:lvl w:ilvl="5" w:tentative="1">
+      <w:start w:val="1"/>
+      <w:numFmt w:val="decimal"/>
+      <w:lvlText w:val="%6."/>
+      <w:lvlJc w:val="left"/>
+      <w:pPr>
+        <w:tabs>
+          <w:tab w:val="num" w:pos="4320"/>
+        </w:tabs>
+        <w:ind w:left="4320" w:hanging="360"/>
+      </w:pPr>
+    </w:lvl>
+    <w:lvl w:ilvl="6" w:tentative="1">
+      <w:start w:val="1"/>
+      <w:numFmt w:val="decimal"/>
+      <w:lvlText w:val="%7."/>
+      <w:lvlJc w:val="left"/>
+      <w:pPr>
+        <w:tabs>
+          <w:tab w:val="num" w:pos="5040"/>
+        </w:tabs>
+        <w:ind w:left="5040" w:hanging="360"/>
+      </w:pPr>
+    </w:lvl>
+    <w:lvl w:ilvl="7" w:tentative="1">
+      <w:start w:val="1"/>
+      <w:numFmt w:val="decimal"/>
+      <w:lvlText w:val="%8."/>
+      <w:lvlJc w:val="left"/>
+      <w:pPr>
+        <w:tabs>
+          <w:tab w:val="num" w:pos="5760"/>
+        </w:tabs>
+        <w:ind w:left="5760" w:hanging="360"/>
+      </w:pPr>
+    </w:lvl>
+    <w:lvl w:ilvl="8" w:tentative="1">
+      <w:start w:val="1"/>
+      <w:numFmt w:val="decimal"/>
+      <w:lvlText w:val="%9."/>
+      <w:lvlJc w:val="left"/>
+      <w:pPr>
+        <w:tabs>
+          <w:tab w:val="num" w:pos="6480"/>
+        </w:tabs>
+        <w:ind w:left="6480" w:hanging="360"/>
+      </w:pPr>
+    </w:lvl>
+  </w:abstractNum>
+  <w:abstractNum w:abstractNumId="12" w15:restartNumberingAfterBreak="0">
     <w:nsid w:val="4F8568FB"/>
     <w:multiLevelType w:val="hybridMultilevel"/>
     <w:tmpl w:val="6A5E38BC"/>
@@ -5956,7 +7260,7 @@
       </w:rPr>
     </w:lvl>
   </w:abstractNum>
-  <w:abstractNum w:abstractNumId="9" w15:restartNumberingAfterBreak="0">
+  <w:abstractNum w:abstractNumId="13" w15:restartNumberingAfterBreak="0">
     <w:nsid w:val="506E530E"/>
     <w:multiLevelType w:val="hybridMultilevel"/>
     <w:tmpl w:val="EEF002AA"/>
@@ -6069,7 +7373,120 @@
       </w:rPr>
     </w:lvl>
   </w:abstractNum>
-  <w:abstractNum w:abstractNumId="10" w15:restartNumberingAfterBreak="0">
+  <w:abstractNum w:abstractNumId="14" w15:restartNumberingAfterBreak="0">
+    <w:nsid w:val="6FD50651"/>
+    <w:multiLevelType w:val="multilevel"/>
+    <w:tmpl w:val="F8348BE6"/>
+    <w:lvl w:ilvl="0">
+      <w:start w:val="4"/>
+      <w:numFmt w:val="decimal"/>
+      <w:lvlText w:val="%1."/>
+      <w:lvlJc w:val="left"/>
+      <w:pPr>
+        <w:tabs>
+          <w:tab w:val="num" w:pos="720"/>
+        </w:tabs>
+        <w:ind w:left="720" w:hanging="360"/>
+      </w:pPr>
+    </w:lvl>
+    <w:lvl w:ilvl="1" w:tentative="1">
+      <w:start w:val="1"/>
+      <w:numFmt w:val="decimal"/>
+      <w:lvlText w:val="%2."/>
+      <w:lvlJc w:val="left"/>
+      <w:pPr>
+        <w:tabs>
+          <w:tab w:val="num" w:pos="1440"/>
+        </w:tabs>
+        <w:ind w:left="1440" w:hanging="360"/>
+      </w:pPr>
+    </w:lvl>
+    <w:lvl w:ilvl="2" w:tentative="1">
+      <w:start w:val="1"/>
+      <w:numFmt w:val="decimal"/>
+      <w:lvlText w:val="%3."/>
+      <w:lvlJc w:val="left"/>
+      <w:pPr>
+        <w:tabs>
+          <w:tab w:val="num" w:pos="2160"/>
+        </w:tabs>
+        <w:ind w:left="2160" w:hanging="360"/>
+      </w:pPr>
+    </w:lvl>
+    <w:lvl w:ilvl="3" w:tentative="1">
+      <w:start w:val="1"/>
+      <w:numFmt w:val="decimal"/>
+      <w:lvlText w:val="%4."/>
+      <w:lvlJc w:val="left"/>
+      <w:pPr>
+        <w:tabs>
+          <w:tab w:val="num" w:pos="2880"/>
+        </w:tabs>
+        <w:ind w:left="2880" w:hanging="360"/>
+      </w:pPr>
+    </w:lvl>
+    <w:lvl w:ilvl="4" w:tentative="1">
+      <w:start w:val="1"/>
+      <w:numFmt w:val="decimal"/>
+      <w:lvlText w:val="%5."/>
+      <w:lvlJc w:val="left"/>
+      <w:pPr>
+        <w:tabs>
+          <w:tab w:val="num" w:pos="3600"/>
+        </w:tabs>
+        <w:ind w:left="3600" w:hanging="360"/>
+      </w:pPr>
+    </w:lvl>
+    <w:lvl w:ilvl="5" w:tentative="1">
+      <w:start w:val="1"/>
+      <w:numFmt w:val="decimal"/>
+      <w:lvlText w:val="%6."/>
+      <w:lvlJc w:val="left"/>
+      <w:pPr>
+        <w:tabs>
+          <w:tab w:val="num" w:pos="4320"/>
+        </w:tabs>
+        <w:ind w:left="4320" w:hanging="360"/>
+      </w:pPr>
+    </w:lvl>
+    <w:lvl w:ilvl="6" w:tentative="1">
+      <w:start w:val="1"/>
+      <w:numFmt w:val="decimal"/>
+      <w:lvlText w:val="%7."/>
+      <w:lvlJc w:val="left"/>
+      <w:pPr>
+        <w:tabs>
+          <w:tab w:val="num" w:pos="5040"/>
+        </w:tabs>
+        <w:ind w:left="5040" w:hanging="360"/>
+      </w:pPr>
+    </w:lvl>
+    <w:lvl w:ilvl="7" w:tentative="1">
+      <w:start w:val="1"/>
+      <w:numFmt w:val="decimal"/>
+      <w:lvlText w:val="%8."/>
+      <w:lvlJc w:val="left"/>
+      <w:pPr>
+        <w:tabs>
+          <w:tab w:val="num" w:pos="5760"/>
+        </w:tabs>
+        <w:ind w:left="5760" w:hanging="360"/>
+      </w:pPr>
+    </w:lvl>
+    <w:lvl w:ilvl="8" w:tentative="1">
+      <w:start w:val="1"/>
+      <w:numFmt w:val="decimal"/>
+      <w:lvlText w:val="%9."/>
+      <w:lvlJc w:val="left"/>
+      <w:pPr>
+        <w:tabs>
+          <w:tab w:val="num" w:pos="6480"/>
+        </w:tabs>
+        <w:ind w:left="6480" w:hanging="360"/>
+      </w:pPr>
+    </w:lvl>
+  </w:abstractNum>
+  <w:abstractNum w:abstractNumId="15" w15:restartNumberingAfterBreak="0">
     <w:nsid w:val="73915981"/>
     <w:multiLevelType w:val="hybridMultilevel"/>
     <w:tmpl w:val="EB3032D8"/>
@@ -6182,7 +7599,120 @@
       </w:rPr>
     </w:lvl>
   </w:abstractNum>
-  <w:abstractNum w:abstractNumId="11" w15:restartNumberingAfterBreak="0">
+  <w:abstractNum w:abstractNumId="16" w15:restartNumberingAfterBreak="0">
+    <w:nsid w:val="74650F26"/>
+    <w:multiLevelType w:val="multilevel"/>
+    <w:tmpl w:val="D18A352E"/>
+    <w:lvl w:ilvl="0">
+      <w:start w:val="7"/>
+      <w:numFmt w:val="decimal"/>
+      <w:lvlText w:val="%1."/>
+      <w:lvlJc w:val="left"/>
+      <w:pPr>
+        <w:tabs>
+          <w:tab w:val="num" w:pos="720"/>
+        </w:tabs>
+        <w:ind w:left="720" w:hanging="360"/>
+      </w:pPr>
+    </w:lvl>
+    <w:lvl w:ilvl="1" w:tentative="1">
+      <w:start w:val="1"/>
+      <w:numFmt w:val="decimal"/>
+      <w:lvlText w:val="%2."/>
+      <w:lvlJc w:val="left"/>
+      <w:pPr>
+        <w:tabs>
+          <w:tab w:val="num" w:pos="1440"/>
+        </w:tabs>
+        <w:ind w:left="1440" w:hanging="360"/>
+      </w:pPr>
+    </w:lvl>
+    <w:lvl w:ilvl="2" w:tentative="1">
+      <w:start w:val="1"/>
+      <w:numFmt w:val="decimal"/>
+      <w:lvlText w:val="%3."/>
+      <w:lvlJc w:val="left"/>
+      <w:pPr>
+        <w:tabs>
+          <w:tab w:val="num" w:pos="2160"/>
+        </w:tabs>
+        <w:ind w:left="2160" w:hanging="360"/>
+      </w:pPr>
+    </w:lvl>
+    <w:lvl w:ilvl="3" w:tentative="1">
+      <w:start w:val="1"/>
+      <w:numFmt w:val="decimal"/>
+      <w:lvlText w:val="%4."/>
+      <w:lvlJc w:val="left"/>
+      <w:pPr>
+        <w:tabs>
+          <w:tab w:val="num" w:pos="2880"/>
+        </w:tabs>
+        <w:ind w:left="2880" w:hanging="360"/>
+      </w:pPr>
+    </w:lvl>
+    <w:lvl w:ilvl="4" w:tentative="1">
+      <w:start w:val="1"/>
+      <w:numFmt w:val="decimal"/>
+      <w:lvlText w:val="%5."/>
+      <w:lvlJc w:val="left"/>
+      <w:pPr>
+        <w:tabs>
+          <w:tab w:val="num" w:pos="3600"/>
+        </w:tabs>
+        <w:ind w:left="3600" w:hanging="360"/>
+      </w:pPr>
+    </w:lvl>
+    <w:lvl w:ilvl="5" w:tentative="1">
+      <w:start w:val="1"/>
+      <w:numFmt w:val="decimal"/>
+      <w:lvlText w:val="%6."/>
+      <w:lvlJc w:val="left"/>
+      <w:pPr>
+        <w:tabs>
+          <w:tab w:val="num" w:pos="4320"/>
+        </w:tabs>
+        <w:ind w:left="4320" w:hanging="360"/>
+      </w:pPr>
+    </w:lvl>
+    <w:lvl w:ilvl="6" w:tentative="1">
+      <w:start w:val="1"/>
+      <w:numFmt w:val="decimal"/>
+      <w:lvlText w:val="%7."/>
+      <w:lvlJc w:val="left"/>
+      <w:pPr>
+        <w:tabs>
+          <w:tab w:val="num" w:pos="5040"/>
+        </w:tabs>
+        <w:ind w:left="5040" w:hanging="360"/>
+      </w:pPr>
+    </w:lvl>
+    <w:lvl w:ilvl="7" w:tentative="1">
+      <w:start w:val="1"/>
+      <w:numFmt w:val="decimal"/>
+      <w:lvlText w:val="%8."/>
+      <w:lvlJc w:val="left"/>
+      <w:pPr>
+        <w:tabs>
+          <w:tab w:val="num" w:pos="5760"/>
+        </w:tabs>
+        <w:ind w:left="5760" w:hanging="360"/>
+      </w:pPr>
+    </w:lvl>
+    <w:lvl w:ilvl="8" w:tentative="1">
+      <w:start w:val="1"/>
+      <w:numFmt w:val="decimal"/>
+      <w:lvlText w:val="%9."/>
+      <w:lvlJc w:val="left"/>
+      <w:pPr>
+        <w:tabs>
+          <w:tab w:val="num" w:pos="6480"/>
+        </w:tabs>
+        <w:ind w:left="6480" w:hanging="360"/>
+      </w:pPr>
+    </w:lvl>
+  </w:abstractNum>
+  <w:abstractNum w:abstractNumId="17" w15:restartNumberingAfterBreak="0">
     <w:nsid w:val="76B6677C"/>
     <w:multiLevelType w:val="hybridMultilevel"/>
     <w:tmpl w:val="9176EB40"/>
@@ -6295,7 +7825,7 @@
       </w:rPr>
     </w:lvl>
   </w:abstractNum>
-  <w:abstractNum w:abstractNumId="12" w15:restartNumberingAfterBreak="0">
+  <w:abstractNum w:abstractNumId="18" w15:restartNumberingAfterBreak="0">
     <w:nsid w:val="7A444F0D"/>
     <w:multiLevelType w:val="hybridMultilevel"/>
     <w:tmpl w:val="DF8CA23E"/>
@@ -6412,40 +7942,58 @@
     <w:abstractNumId w:val="0"/>
   </w:num>
   <w:num w:numId="2" w16cid:durableId="965890858">
+    <w:abstractNumId w:val="7"/>
+  </w:num>
+  <w:num w:numId="3" w16cid:durableId="626667162">
+    <w:abstractNumId w:val="18"/>
+  </w:num>
+  <w:num w:numId="4" w16cid:durableId="896434062">
+    <w:abstractNumId w:val="12"/>
+  </w:num>
+  <w:num w:numId="5" w16cid:durableId="40443943">
+    <w:abstractNumId w:val="6"/>
+  </w:num>
+  <w:num w:numId="6" w16cid:durableId="1154224028">
+    <w:abstractNumId w:val="15"/>
+  </w:num>
+  <w:num w:numId="7" w16cid:durableId="457722261">
     <w:abstractNumId w:val="5"/>
   </w:num>
-  <w:num w:numId="3" w16cid:durableId="626667162">
-    <w:abstractNumId w:val="12"/>
+  <w:num w:numId="8" w16cid:durableId="1220360483">
+    <w:abstractNumId w:val="9"/>
   </w:num>
-  <w:num w:numId="4" w16cid:durableId="896434062">
-    <w:abstractNumId w:val="8"/>
-  </w:num>
-  <w:num w:numId="5" w16cid:durableId="40443943">
-    <w:abstractNumId w:val="4"/>
-  </w:num>
-  <w:num w:numId="6" w16cid:durableId="1154224028">
-    <w:abstractNumId w:val="10"/>
-  </w:num>
-  <w:num w:numId="7" w16cid:durableId="457722261">
+  <w:num w:numId="9" w16cid:durableId="1448235623">
     <w:abstractNumId w:val="3"/>
   </w:num>
-  <w:num w:numId="8" w16cid:durableId="1220360483">
-    <w:abstractNumId w:val="7"/>
-  </w:num>
-  <w:num w:numId="9" w16cid:durableId="1448235623">
-    <w:abstractNumId w:val="2"/>
-  </w:num>
   <w:num w:numId="10" w16cid:durableId="805665568">
-    <w:abstractNumId w:val="9"/>
+    <w:abstractNumId w:val="13"/>
   </w:num>
   <w:num w:numId="11" w16cid:durableId="1391996475">
-    <w:abstractNumId w:val="6"/>
+    <w:abstractNumId w:val="8"/>
   </w:num>
   <w:num w:numId="12" w16cid:durableId="2144106784">
     <w:abstractNumId w:val="1"/>
   </w:num>
   <w:num w:numId="13" w16cid:durableId="1541627024">
+    <w:abstractNumId w:val="17"/>
+  </w:num>
+  <w:num w:numId="14" w16cid:durableId="1672218429">
     <w:abstractNumId w:val="11"/>
+  </w:num>
+  <w:num w:numId="15" w16cid:durableId="1369913868">
+    <w:abstractNumId w:val="14"/>
+  </w:num>
+  <w:num w:numId="16" w16cid:durableId="78991378">
+    <w:abstractNumId w:val="2"/>
+  </w:num>
+  <w:num w:numId="17" w16cid:durableId="1970478199">
+    <w:abstractNumId w:val="4"/>
+  </w:num>
+  <w:num w:numId="18" w16cid:durableId="956525713">
+    <w:abstractNumId w:val="16"/>
+  </w:num>
+  <w:num w:numId="19" w16cid:durableId="703021157">
+    <w:abstractNumId w:val="10"/>
   </w:num>
 </w:numbering>
 </file>
@@ -7056,6 +8604,7 @@
   <w:style w:type="character" w:default="1" w:styleId="DefaultParagraphFont">
     <w:name w:val="Default Paragraph Font"/>
     <w:uiPriority w:val="1"/>
+    <w:semiHidden/>
     <w:unhideWhenUsed/>
   </w:style>
   <w:style w:type="table" w:default="1" w:styleId="TableNormal">
@@ -7424,6 +8973,59 @@
       </w:tblBorders>
     </w:tblPr>
   </w:style>
+  <w:style w:type="paragraph" w:customStyle="1" w:styleId="p1">
+    <w:name w:val="p1"/>
+    <w:basedOn w:val="Normal"/>
+    <w:rsid w:val="007B6D7E"/>
+    <w:pPr>
+      <w:spacing w:before="100" w:beforeAutospacing="1" w:after="100" w:afterAutospacing="1" w:line="240" w:lineRule="auto"/>
+    </w:pPr>
+    <w:rPr>
+      <w:rFonts w:ascii="Times New Roman" w:eastAsia="Times New Roman" w:hAnsi="Times New Roman" w:cs="Times New Roman"/>
+      <w:kern w:val="0"/>
+      <w:sz w:val="24"/>
+      <w:szCs w:val="24"/>
+      <w:lang w:val="en-MT" w:eastAsia="en-GB"/>
+      <w14:ligatures w14:val="none"/>
+    </w:rPr>
+  </w:style>
+  <w:style w:type="character" w:customStyle="1" w:styleId="apple-converted-space">
+    <w:name w:val="apple-converted-space"/>
+    <w:basedOn w:val="DefaultParagraphFont"/>
+    <w:rsid w:val="007B6D7E"/>
+  </w:style>
+  <w:style w:type="paragraph" w:customStyle="1" w:styleId="p2">
+    <w:name w:val="p2"/>
+    <w:basedOn w:val="Normal"/>
+    <w:rsid w:val="007B6D7E"/>
+    <w:pPr>
+      <w:spacing w:before="100" w:beforeAutospacing="1" w:after="100" w:afterAutospacing="1" w:line="240" w:lineRule="auto"/>
+    </w:pPr>
+    <w:rPr>
+      <w:rFonts w:ascii="Times New Roman" w:eastAsia="Times New Roman" w:hAnsi="Times New Roman" w:cs="Times New Roman"/>
+      <w:kern w:val="0"/>
+      <w:sz w:val="24"/>
+      <w:szCs w:val="24"/>
+      <w:lang w:val="en-MT" w:eastAsia="en-GB"/>
+      <w14:ligatures w14:val="none"/>
+    </w:rPr>
+  </w:style>
+  <w:style w:type="paragraph" w:customStyle="1" w:styleId="p3">
+    <w:name w:val="p3"/>
+    <w:basedOn w:val="Normal"/>
+    <w:rsid w:val="00341E21"/>
+    <w:pPr>
+      <w:spacing w:before="100" w:beforeAutospacing="1" w:after="100" w:afterAutospacing="1" w:line="240" w:lineRule="auto"/>
+    </w:pPr>
+    <w:rPr>
+      <w:rFonts w:ascii="Times New Roman" w:eastAsia="Times New Roman" w:hAnsi="Times New Roman" w:cs="Times New Roman"/>
+      <w:kern w:val="0"/>
+      <w:sz w:val="24"/>
+      <w:szCs w:val="24"/>
+      <w:lang w:val="en-MT" w:eastAsia="en-GB"/>
+      <w14:ligatures w14:val="none"/>
+    </w:rPr>
+  </w:style>
 </w:styles>
 </file>
 

</xml_diff>

<commit_message>
Added SVM to main doc
</commit_message>
<xml_diff>
--- a/Main Document.docx
+++ b/Main Document.docx
@@ -4461,7 +4461,137 @@
           <w:szCs w:val="24"/>
           <w:lang w:val="en-US"/>
         </w:rPr>
-        <w:t>20 stratified train</w:t>
+        <w:t xml:space="preserve">20 stratified train-test split to preserve the severity distribution.  A majority class baseline achieved 0.448 accuracy, indicating that simply predicting the most frequent severity level performs poorly for minority classes.  A Random Forest using only structured features produced a small improvement, reaching 0.471 accuracy with </w:t>
+      </w:r>
+      <w:r>
+        <w:rPr>
+          <w:sz w:val="24"/>
+          <w:szCs w:val="24"/>
+          <w:lang w:val="en-US"/>
+        </w:rPr>
+        <w:t xml:space="preserve">a </w:t>
+      </w:r>
+      <w:r>
+        <w:rPr>
+          <w:sz w:val="24"/>
+          <w:szCs w:val="24"/>
+          <w:lang w:val="en-US"/>
+        </w:rPr>
+        <w:t>M</w:t>
+      </w:r>
+      <w:r>
+        <w:rPr>
+          <w:sz w:val="24"/>
+          <w:szCs w:val="24"/>
+          <w:lang w:val="en-US"/>
+        </w:rPr>
+        <w:t xml:space="preserve">acro F1 of 0.393, suggesting </w:t>
+      </w:r>
+      <w:r>
+        <w:rPr>
+          <w:sz w:val="24"/>
+          <w:szCs w:val="24"/>
+          <w:lang w:val="en-US"/>
+        </w:rPr>
+        <w:t xml:space="preserve">a </w:t>
+      </w:r>
+      <w:r>
+        <w:rPr>
+          <w:sz w:val="24"/>
+          <w:szCs w:val="24"/>
+          <w:lang w:val="en-US"/>
+        </w:rPr>
+        <w:t>limited predictive signal from weather and calendar variables alone.</w:t>
+      </w:r>
+    </w:p>
+    <w:p>
+      <w:pPr>
+        <w:spacing w:line="240" w:lineRule="auto"/>
+        <w:rPr>
+          <w:sz w:val="24"/>
+          <w:szCs w:val="24"/>
+          <w:lang w:val="en-US"/>
+        </w:rPr>
+      </w:pPr>
+      <w:r>
+        <w:rPr>
+          <w:sz w:val="24"/>
+          <w:szCs w:val="24"/>
+          <w:lang w:val="en-US"/>
+        </w:rPr>
+        <w:t xml:space="preserve">Adding TF IDF text features produced a large performance gain.  The combined text plus structured model achieved 0.759 accuracy with </w:t>
+      </w:r>
+      <w:r>
+        <w:rPr>
+          <w:sz w:val="24"/>
+          <w:szCs w:val="24"/>
+          <w:lang w:val="en-US"/>
+        </w:rPr>
+        <w:t xml:space="preserve">a </w:t>
+      </w:r>
+      <w:r>
+        <w:rPr>
+          <w:sz w:val="24"/>
+          <w:szCs w:val="24"/>
+          <w:lang w:val="en-US"/>
+        </w:rPr>
+        <w:t>Macro F1 of 0.677, showing that language patterns in the articles are the main driver of severity prediction.  After hyperparameter tuning with stratified 5</w:t>
+      </w:r>
+      <w:r>
+        <w:rPr>
+          <w:sz w:val="24"/>
+          <w:szCs w:val="24"/>
+          <w:lang w:val="en-US"/>
+        </w:rPr>
+        <w:t>-fold</w:t>
+      </w:r>
+      <w:r>
+        <w:rPr>
+          <w:sz w:val="24"/>
+          <w:szCs w:val="24"/>
+          <w:lang w:val="en-US"/>
+        </w:rPr>
+        <w:t xml:space="preserve"> </w:t>
+      </w:r>
+      <w:r>
+        <w:rPr>
+          <w:sz w:val="24"/>
+          <w:szCs w:val="24"/>
+          <w:lang w:val="en-US"/>
+        </w:rPr>
+        <w:t>cross-</w:t>
+      </w:r>
+      <w:r>
+        <w:rPr>
+          <w:sz w:val="24"/>
+          <w:szCs w:val="24"/>
+          <w:lang w:val="en-US"/>
+        </w:rPr>
+        <w:t xml:space="preserve">validation, the final tuned model achieved 0.862 accuracy and </w:t>
+      </w:r>
+      <w:r>
+        <w:rPr>
+          <w:sz w:val="24"/>
+          <w:szCs w:val="24"/>
+          <w:lang w:val="en-US"/>
+        </w:rPr>
+        <w:t xml:space="preserve">a </w:t>
+      </w:r>
+      <w:r>
+        <w:rPr>
+          <w:sz w:val="24"/>
+          <w:szCs w:val="24"/>
+          <w:lang w:val="en-US"/>
+        </w:rPr>
+        <w:t>M</w:t>
+      </w:r>
+      <w:r>
+        <w:rPr>
+          <w:sz w:val="24"/>
+          <w:szCs w:val="24"/>
+          <w:lang w:val="en-US"/>
+        </w:rPr>
+        <w:t>acro F1 of 0.859 on the held</w:t>
       </w:r>
       <w:r>
         <w:rPr>
@@ -4477,7 +4607,43 @@
           <w:szCs w:val="24"/>
           <w:lang w:val="en-US"/>
         </w:rPr>
-        <w:t xml:space="preserve">test split to preserve the severity distribution.  A majority class baseline achieved 0.448 accuracy, indicating that simply predicting the most frequent severity level performs poorly for minority classes.  A Random Forest using only structured features produced a small improvement, reaching 0.471 accuracy with </w:t>
+        <w:t>out test set, indicating strong performance across classes rather than only on the dominant class.</w:t>
+      </w:r>
+    </w:p>
+    <w:p>
+      <w:pPr>
+        <w:spacing w:line="240" w:lineRule="auto"/>
+        <w:rPr>
+          <w:sz w:val="24"/>
+          <w:szCs w:val="24"/>
+          <w:lang w:val="en-US"/>
+        </w:rPr>
+      </w:pPr>
+      <w:r>
+        <w:rPr>
+          <w:sz w:val="24"/>
+          <w:szCs w:val="24"/>
+          <w:lang w:val="en-US"/>
+        </w:rPr>
+        <w:t xml:space="preserve">Error analysis from the confusion matrix showed that most mistakes occur between adjacent severity levels, which is expected because neighbouring classes often share similar wording.  Per class scores were generally strong, although severity class 2 was comparatively weaker before tuning, consistent with overlap in phrasing between moderate and higher severity reports.  Feature importance also aligned with the task, with </w:t>
+      </w:r>
+      <w:proofErr w:type="gramStart"/>
+      <w:r>
+        <w:rPr>
+          <w:sz w:val="24"/>
+          <w:szCs w:val="24"/>
+          <w:lang w:val="en-US"/>
+        </w:rPr>
+        <w:t>high ranking</w:t>
+      </w:r>
+      <w:proofErr w:type="gramEnd"/>
+      <w:r>
+        <w:rPr>
+          <w:sz w:val="24"/>
+          <w:szCs w:val="24"/>
+          <w:lang w:val="en-US"/>
+        </w:rPr>
+        <w:t xml:space="preserve"> TF IDF terms such as hospital, injuries, death, and fatal, while structured variables such as tag indicators and selected weather features contributed </w:t>
       </w:r>
       <w:r>
         <w:rPr>
@@ -4493,31 +4659,7 @@
           <w:szCs w:val="24"/>
           <w:lang w:val="en-US"/>
         </w:rPr>
-        <w:t>M</w:t>
-      </w:r>
-      <w:r>
-        <w:rPr>
-          <w:sz w:val="24"/>
-          <w:szCs w:val="24"/>
-          <w:lang w:val="en-US"/>
-        </w:rPr>
-        <w:t xml:space="preserve">acro F1 of 0.393, suggesting </w:t>
-      </w:r>
-      <w:r>
-        <w:rPr>
-          <w:sz w:val="24"/>
-          <w:szCs w:val="24"/>
-          <w:lang w:val="en-US"/>
-        </w:rPr>
-        <w:t xml:space="preserve">a </w:t>
-      </w:r>
-      <w:r>
-        <w:rPr>
-          <w:sz w:val="24"/>
-          <w:szCs w:val="24"/>
-          <w:lang w:val="en-US"/>
-        </w:rPr>
-        <w:t>limited predictive signal from weather and calendar variables alone.</w:t>
+        <w:t>smaller supporting signal.</w:t>
       </w:r>
     </w:p>
     <w:p>
@@ -4529,43 +4671,264 @@
           <w:lang w:val="en-US"/>
         </w:rPr>
       </w:pPr>
-      <w:r>
-        <w:rPr>
-          <w:sz w:val="24"/>
-          <w:szCs w:val="24"/>
-          <w:lang w:val="en-US"/>
-        </w:rPr>
-        <w:t xml:space="preserve">Adding TF IDF text features produced a large performance gain.  The combined text plus structured model achieved 0.759 accuracy with </w:t>
-      </w:r>
-      <w:r>
-        <w:rPr>
-          <w:sz w:val="24"/>
-          <w:szCs w:val="24"/>
-          <w:lang w:val="en-US"/>
-        </w:rPr>
-        <w:t xml:space="preserve">a </w:t>
-      </w:r>
-      <w:r>
-        <w:rPr>
-          <w:sz w:val="24"/>
-          <w:szCs w:val="24"/>
-          <w:lang w:val="en-US"/>
-        </w:rPr>
-        <w:t>Macro F1 of 0.677, showing that language patterns in the articles are the main driver of severity prediction.  After hyperparameter tuning with stratified 5</w:t>
-      </w:r>
-      <w:r>
-        <w:rPr>
-          <w:sz w:val="24"/>
-          <w:szCs w:val="24"/>
-          <w:lang w:val="en-US"/>
-        </w:rPr>
-        <w:t>-fold</w:t>
-      </w:r>
-      <w:r>
-        <w:rPr>
-          <w:sz w:val="24"/>
-          <w:szCs w:val="24"/>
-          <w:lang w:val="en-US"/>
+    </w:p>
+    <w:p>
+      <w:pPr>
+        <w:spacing w:line="240" w:lineRule="auto"/>
+        <w:rPr>
+          <w:sz w:val="24"/>
+          <w:szCs w:val="24"/>
+          <w:lang w:val="en-US"/>
+        </w:rPr>
+      </w:pPr>
+    </w:p>
+    <w:p>
+      <w:pPr>
+        <w:spacing w:line="240" w:lineRule="auto"/>
+        <w:rPr>
+          <w:sz w:val="24"/>
+          <w:szCs w:val="24"/>
+          <w:lang w:val="en-US"/>
+        </w:rPr>
+      </w:pPr>
+    </w:p>
+    <w:p>
+      <w:pPr>
+        <w:spacing w:line="240" w:lineRule="auto"/>
+        <w:rPr>
+          <w:sz w:val="24"/>
+          <w:szCs w:val="24"/>
+          <w:lang w:val="en-US"/>
+        </w:rPr>
+      </w:pPr>
+    </w:p>
+    <w:p>
+      <w:pPr>
+        <w:spacing w:line="240" w:lineRule="auto"/>
+        <w:rPr>
+          <w:sz w:val="24"/>
+          <w:szCs w:val="24"/>
+          <w:lang w:val="en-US"/>
+        </w:rPr>
+      </w:pPr>
+    </w:p>
+    <w:p>
+      <w:pPr>
+        <w:rPr>
+          <w:b/>
+          <w:bCs/>
+          <w:sz w:val="28"/>
+          <w:szCs w:val="28"/>
+          <w:u w:val="single"/>
+          <w:lang w:val="en-US"/>
+        </w:rPr>
+      </w:pPr>
+      <w:r>
+        <w:rPr>
+          <w:b/>
+          <w:bCs/>
+          <w:sz w:val="28"/>
+          <w:szCs w:val="28"/>
+          <w:u w:val="single"/>
+          <w:lang w:val="en-US"/>
+        </w:rPr>
+        <w:lastRenderedPageBreak/>
+        <w:t>Support Vector Machine</w:t>
+      </w:r>
+      <w:r>
+        <w:rPr>
+          <w:b/>
+          <w:bCs/>
+          <w:sz w:val="28"/>
+          <w:szCs w:val="28"/>
+          <w:u w:val="single"/>
+          <w:lang w:val="en-US"/>
+        </w:rPr>
+        <w:t xml:space="preserve"> (Luca </w:t>
+      </w:r>
+      <w:r>
+        <w:rPr>
+          <w:b/>
+          <w:bCs/>
+          <w:sz w:val="28"/>
+          <w:szCs w:val="28"/>
+          <w:u w:val="single"/>
+          <w:lang w:val="en-US"/>
+        </w:rPr>
+        <w:t>Alfino</w:t>
+      </w:r>
+      <w:r>
+        <w:rPr>
+          <w:b/>
+          <w:bCs/>
+          <w:sz w:val="28"/>
+          <w:szCs w:val="28"/>
+          <w:u w:val="single"/>
+          <w:lang w:val="en-US"/>
+        </w:rPr>
+        <w:t>)</w:t>
+      </w:r>
+    </w:p>
+    <w:p>
+      <w:pPr>
+        <w:spacing w:line="240" w:lineRule="auto"/>
+        <w:rPr>
+          <w:b/>
+          <w:bCs/>
+          <w:sz w:val="28"/>
+          <w:szCs w:val="28"/>
+          <w:lang w:val="en-US"/>
+        </w:rPr>
+      </w:pPr>
+      <w:r>
+        <w:rPr>
+          <w:b/>
+          <w:bCs/>
+          <w:sz w:val="28"/>
+          <w:szCs w:val="28"/>
+          <w:lang w:val="en-US"/>
+        </w:rPr>
+        <w:t>Technique Overview and Rationale:</w:t>
+      </w:r>
+    </w:p>
+    <w:p>
+      <w:pPr>
+        <w:spacing w:line="240" w:lineRule="auto"/>
+        <w:rPr>
+          <w:sz w:val="24"/>
+          <w:szCs w:val="24"/>
+          <w:lang w:val="en-MT"/>
+        </w:rPr>
+      </w:pPr>
+      <w:r>
+        <w:rPr>
+          <w:sz w:val="24"/>
+          <w:szCs w:val="24"/>
+          <w:lang w:val="en-MT"/>
+        </w:rPr>
+        <w:t xml:space="preserve">Support Vector </w:t>
+      </w:r>
+      <w:proofErr w:type="gramStart"/>
+      <w:r>
+        <w:rPr>
+          <w:sz w:val="24"/>
+          <w:szCs w:val="24"/>
+          <w:lang w:val="en-MT"/>
+        </w:rPr>
+        <w:t>Machines(</w:t>
+      </w:r>
+      <w:proofErr w:type="spellStart"/>
+      <w:proofErr w:type="gramEnd"/>
+      <w:r>
+        <w:rPr>
+          <w:sz w:val="24"/>
+          <w:szCs w:val="24"/>
+          <w:lang w:val="en-MT"/>
+        </w:rPr>
+        <w:t>SVMs</w:t>
+      </w:r>
+      <w:proofErr w:type="spellEnd"/>
+      <w:r>
+        <w:rPr>
+          <w:sz w:val="24"/>
+          <w:szCs w:val="24"/>
+          <w:lang w:val="en-MT"/>
+        </w:rPr>
+        <w:t xml:space="preserve">) are a set of supervised learning methods used for classification, regression and outlier </w:t>
+      </w:r>
+      <w:proofErr w:type="gramStart"/>
+      <w:r>
+        <w:rPr>
+          <w:sz w:val="24"/>
+          <w:szCs w:val="24"/>
+          <w:lang w:val="en-MT"/>
+        </w:rPr>
+        <w:t>detection[</w:t>
+      </w:r>
+      <w:proofErr w:type="gramEnd"/>
+      <w:r>
+        <w:rPr>
+          <w:sz w:val="24"/>
+          <w:szCs w:val="24"/>
+          <w:lang w:val="en-MT"/>
+        </w:rPr>
+        <w:t>5</w:t>
+      </w:r>
+      <w:r>
+        <w:rPr>
+          <w:sz w:val="24"/>
+          <w:szCs w:val="24"/>
+          <w:lang w:val="en-MT"/>
+        </w:rPr>
+        <w:t>]. Hence, the main reason for the new column '</w:t>
+      </w:r>
+      <w:proofErr w:type="spellStart"/>
+      <w:r>
+        <w:rPr>
+          <w:sz w:val="24"/>
+          <w:szCs w:val="24"/>
+          <w:lang w:val="en-MT"/>
+        </w:rPr>
+        <w:t>Severity_label</w:t>
+      </w:r>
+      <w:proofErr w:type="spellEnd"/>
+      <w:r>
+        <w:rPr>
+          <w:sz w:val="24"/>
+          <w:szCs w:val="24"/>
+          <w:lang w:val="en-MT"/>
+        </w:rPr>
+        <w:t xml:space="preserve">' was for supervised learning possibilities. </w:t>
+      </w:r>
+      <w:proofErr w:type="spellStart"/>
+      <w:r>
+        <w:rPr>
+          <w:sz w:val="24"/>
+          <w:szCs w:val="24"/>
+          <w:lang w:val="en-MT"/>
+        </w:rPr>
+        <w:t>SVMs</w:t>
+      </w:r>
+      <w:proofErr w:type="spellEnd"/>
+      <w:r>
+        <w:rPr>
+          <w:sz w:val="24"/>
+          <w:szCs w:val="24"/>
+          <w:lang w:val="en-MT"/>
+        </w:rPr>
+        <w:t xml:space="preserve"> are effective in high dimensional spaces, especially when the number of dimensions and features is higher than the number of </w:t>
+      </w:r>
+      <w:proofErr w:type="gramStart"/>
+      <w:r>
+        <w:rPr>
+          <w:sz w:val="24"/>
+          <w:szCs w:val="24"/>
+          <w:lang w:val="en-MT"/>
+        </w:rPr>
+        <w:t>samples[</w:t>
+      </w:r>
+      <w:proofErr w:type="gramEnd"/>
+      <w:r>
+        <w:rPr>
+          <w:sz w:val="24"/>
+          <w:szCs w:val="24"/>
+          <w:lang w:val="en-MT"/>
+        </w:rPr>
+        <w:t>5</w:t>
+      </w:r>
+      <w:r>
+        <w:rPr>
+          <w:sz w:val="24"/>
+          <w:szCs w:val="24"/>
+          <w:lang w:val="en-MT"/>
+        </w:rPr>
+        <w:t>]. This makes SVM a highly effective model for our given problem.</w:t>
+      </w:r>
+      <w:r>
+        <w:rPr>
+          <w:sz w:val="24"/>
+          <w:szCs w:val="24"/>
+          <w:lang w:val="en-MT"/>
         </w:rPr>
         <w:t xml:space="preserve"> </w:t>
       </w:r>
@@ -4573,110 +4936,793 @@
         <w:rPr>
           <w:sz w:val="24"/>
           <w:szCs w:val="24"/>
-          <w:lang w:val="en-US"/>
-        </w:rPr>
-        <w:t>cross-</w:t>
-      </w:r>
-      <w:r>
-        <w:rPr>
-          <w:sz w:val="24"/>
-          <w:szCs w:val="24"/>
-          <w:lang w:val="en-US"/>
-        </w:rPr>
-        <w:t xml:space="preserve">validation, the final tuned model achieved 0.862 accuracy and </w:t>
-      </w:r>
-      <w:r>
-        <w:rPr>
-          <w:sz w:val="24"/>
-          <w:szCs w:val="24"/>
-          <w:lang w:val="en-US"/>
-        </w:rPr>
-        <w:t xml:space="preserve">a </w:t>
-      </w:r>
-      <w:r>
-        <w:rPr>
-          <w:sz w:val="24"/>
-          <w:szCs w:val="24"/>
-          <w:lang w:val="en-US"/>
-        </w:rPr>
-        <w:t>M</w:t>
-      </w:r>
-      <w:r>
-        <w:rPr>
-          <w:sz w:val="24"/>
-          <w:szCs w:val="24"/>
-          <w:lang w:val="en-US"/>
-        </w:rPr>
-        <w:t>acro F1 of 0.859 on the held</w:t>
-      </w:r>
-      <w:r>
-        <w:rPr>
-          <w:sz w:val="24"/>
-          <w:szCs w:val="24"/>
-          <w:lang w:val="en-US"/>
-        </w:rPr>
-        <w:t>-</w:t>
-      </w:r>
-      <w:r>
-        <w:rPr>
-          <w:sz w:val="24"/>
-          <w:szCs w:val="24"/>
-          <w:lang w:val="en-US"/>
-        </w:rPr>
-        <w:t>out test set, indicating strong performance across classes rather than only on the dominant class.</w:t>
+          <w:lang w:val="en-MT"/>
+        </w:rPr>
+        <w:t xml:space="preserve">However, when the number of features is much greater than the number of samples, overfitting could be a problem. Hence, proper kernel functions and regularization are </w:t>
+      </w:r>
+      <w:proofErr w:type="gramStart"/>
+      <w:r>
+        <w:rPr>
+          <w:sz w:val="24"/>
+          <w:szCs w:val="24"/>
+          <w:lang w:val="en-MT"/>
+        </w:rPr>
+        <w:t>crucial[</w:t>
+      </w:r>
+      <w:proofErr w:type="gramEnd"/>
+      <w:r>
+        <w:rPr>
+          <w:sz w:val="24"/>
+          <w:szCs w:val="24"/>
+          <w:lang w:val="en-MT"/>
+        </w:rPr>
+        <w:t>5</w:t>
+      </w:r>
+      <w:r>
+        <w:rPr>
+          <w:sz w:val="24"/>
+          <w:szCs w:val="24"/>
+          <w:lang w:val="en-MT"/>
+        </w:rPr>
+        <w:t xml:space="preserve">]. For multi-class classification in </w:t>
+      </w:r>
+      <w:proofErr w:type="spellStart"/>
+      <w:r>
+        <w:rPr>
+          <w:sz w:val="24"/>
+          <w:szCs w:val="24"/>
+          <w:lang w:val="en-MT"/>
+        </w:rPr>
+        <w:t>SVMs</w:t>
+      </w:r>
+      <w:proofErr w:type="spellEnd"/>
+      <w:r>
+        <w:rPr>
+          <w:sz w:val="24"/>
+          <w:szCs w:val="24"/>
+          <w:lang w:val="en-MT"/>
+        </w:rPr>
+        <w:t>, two modes exist. In One</w:t>
+      </w:r>
+      <w:r>
+        <w:rPr>
+          <w:sz w:val="24"/>
+          <w:szCs w:val="24"/>
+          <w:lang w:val="en-MT"/>
+        </w:rPr>
+        <w:noBreakHyphen/>
+        <w:t>vs</w:t>
+      </w:r>
+      <w:r>
+        <w:rPr>
+          <w:sz w:val="24"/>
+          <w:szCs w:val="24"/>
+          <w:lang w:val="en-MT"/>
+        </w:rPr>
+        <w:noBreakHyphen/>
+      </w:r>
+      <w:proofErr w:type="gramStart"/>
+      <w:r>
+        <w:rPr>
+          <w:sz w:val="24"/>
+          <w:szCs w:val="24"/>
+          <w:lang w:val="en-MT"/>
+        </w:rPr>
+        <w:t>Rest(</w:t>
+      </w:r>
+      <w:proofErr w:type="gramEnd"/>
+      <w:r>
+        <w:rPr>
+          <w:sz w:val="24"/>
+          <w:szCs w:val="24"/>
+          <w:lang w:val="en-MT"/>
+        </w:rPr>
+        <w:t xml:space="preserve">OVR), each classifier treats one class vs all others together. This creates high imbalance when the targeted class is rare (such as 0 or 5 in the dataset). These imbalances can bias the learned hyperplane. In contrast, </w:t>
+      </w:r>
+      <w:proofErr w:type="gramStart"/>
+      <w:r>
+        <w:rPr>
+          <w:sz w:val="24"/>
+          <w:szCs w:val="24"/>
+          <w:lang w:val="en-MT"/>
+        </w:rPr>
+        <w:t>One</w:t>
+      </w:r>
+      <w:proofErr w:type="gramEnd"/>
+      <w:r>
+        <w:rPr>
+          <w:sz w:val="24"/>
+          <w:szCs w:val="24"/>
+          <w:lang w:val="en-MT"/>
+        </w:rPr>
+        <w:noBreakHyphen/>
+        <w:t>vs</w:t>
+      </w:r>
+      <w:r>
+        <w:rPr>
+          <w:sz w:val="24"/>
+          <w:szCs w:val="24"/>
+          <w:lang w:val="en-MT"/>
+        </w:rPr>
+        <w:noBreakHyphen/>
+      </w:r>
+      <w:proofErr w:type="gramStart"/>
+      <w:r>
+        <w:rPr>
+          <w:sz w:val="24"/>
+          <w:szCs w:val="24"/>
+          <w:lang w:val="en-MT"/>
+        </w:rPr>
+        <w:t>One(</w:t>
+      </w:r>
+      <w:proofErr w:type="gramEnd"/>
+      <w:r>
+        <w:rPr>
+          <w:sz w:val="24"/>
+          <w:szCs w:val="24"/>
+          <w:lang w:val="en-MT"/>
+        </w:rPr>
+        <w:t xml:space="preserve">OVO) trains each classifier only on data from two classes at a time, which tends to result in more balanced binary problems and better decision boundaries for </w:t>
+      </w:r>
+      <w:proofErr w:type="spellStart"/>
+      <w:proofErr w:type="gramStart"/>
+      <w:r>
+        <w:rPr>
+          <w:sz w:val="24"/>
+          <w:szCs w:val="24"/>
+          <w:lang w:val="en-MT"/>
+        </w:rPr>
+        <w:t>SVMs</w:t>
+      </w:r>
+      <w:proofErr w:type="spellEnd"/>
+      <w:r>
+        <w:rPr>
+          <w:sz w:val="24"/>
+          <w:szCs w:val="24"/>
+          <w:lang w:val="en-MT"/>
+        </w:rPr>
+        <w:t>[</w:t>
+      </w:r>
+      <w:proofErr w:type="gramEnd"/>
+      <w:r>
+        <w:rPr>
+          <w:sz w:val="24"/>
+          <w:szCs w:val="24"/>
+          <w:lang w:val="en-MT"/>
+        </w:rPr>
+        <w:t>6</w:t>
+      </w:r>
+      <w:r>
+        <w:rPr>
+          <w:sz w:val="24"/>
+          <w:szCs w:val="24"/>
+          <w:lang w:val="en-MT"/>
+        </w:rPr>
+        <w:t>].</w:t>
       </w:r>
     </w:p>
     <w:p>
       <w:pPr>
         <w:spacing w:line="240" w:lineRule="auto"/>
         <w:rPr>
-          <w:sz w:val="24"/>
-          <w:szCs w:val="24"/>
-          <w:lang w:val="en-US"/>
-        </w:rPr>
-      </w:pPr>
-      <w:r>
-        <w:rPr>
-          <w:sz w:val="24"/>
-          <w:szCs w:val="24"/>
-          <w:lang w:val="en-US"/>
-        </w:rPr>
-        <w:t xml:space="preserve">Error analysis from the confusion matrix showed that most mistakes occur between adjacent severity levels, which is expected because neighbouring classes often share similar wording.  Per class scores were generally strong, although severity class 2 was comparatively weaker before tuning, consistent with overlap in phrasing between moderate and higher severity reports.  Feature importance also aligned with the task, with </w:t>
-      </w:r>
-      <w:proofErr w:type="gramStart"/>
-      <w:r>
-        <w:rPr>
-          <w:sz w:val="24"/>
-          <w:szCs w:val="24"/>
-          <w:lang w:val="en-US"/>
-        </w:rPr>
-        <w:t>high ranking</w:t>
-      </w:r>
-      <w:proofErr w:type="gramEnd"/>
-      <w:r>
-        <w:rPr>
-          <w:sz w:val="24"/>
-          <w:szCs w:val="24"/>
-          <w:lang w:val="en-US"/>
-        </w:rPr>
-        <w:t xml:space="preserve"> TF IDF terms such as hospital, injuries, death, and fatal, while structured variables such as tag indicators and selected weather features contributed </w:t>
-      </w:r>
-      <w:r>
-        <w:rPr>
-          <w:sz w:val="24"/>
-          <w:szCs w:val="24"/>
-          <w:lang w:val="en-US"/>
-        </w:rPr>
-        <w:t xml:space="preserve">a </w:t>
-      </w:r>
-      <w:r>
-        <w:rPr>
-          <w:sz w:val="24"/>
-          <w:szCs w:val="24"/>
-          <w:lang w:val="en-US"/>
-        </w:rPr>
-        <w:t>smaller supporting signal.</w:t>
-      </w:r>
+          <w:b/>
+          <w:bCs/>
+          <w:sz w:val="28"/>
+          <w:szCs w:val="28"/>
+          <w:lang w:val="en-US"/>
+        </w:rPr>
+      </w:pPr>
+      <w:r>
+        <w:rPr>
+          <w:b/>
+          <w:bCs/>
+          <w:sz w:val="28"/>
+          <w:szCs w:val="28"/>
+          <w:lang w:val="en-US"/>
+        </w:rPr>
+        <w:t>Feature Design, Preprocessing, and Training Protocol:</w:t>
+      </w:r>
+    </w:p>
+    <w:p>
+      <w:pPr>
+        <w:spacing w:line="240" w:lineRule="auto"/>
+        <w:rPr>
+          <w:sz w:val="24"/>
+          <w:szCs w:val="24"/>
+          <w:lang w:val="en-US"/>
+        </w:rPr>
+      </w:pPr>
+      <w:r>
+        <w:rPr>
+          <w:sz w:val="24"/>
+          <w:szCs w:val="24"/>
+          <w:lang w:val="en-US"/>
+        </w:rPr>
+        <w:t xml:space="preserve">This part is identical to Luca D’Ascari’s, with the </w:t>
+      </w:r>
+      <w:r>
+        <w:rPr>
+          <w:sz w:val="24"/>
+          <w:szCs w:val="24"/>
+          <w:lang w:val="en-US"/>
+        </w:rPr>
+        <w:t>difference being that the training protocol utilizes SVMs instead of trees.</w:t>
+      </w:r>
+    </w:p>
+    <w:p>
+      <w:pPr>
+        <w:spacing w:line="240" w:lineRule="auto"/>
+        <w:rPr>
+          <w:b/>
+          <w:bCs/>
+          <w:sz w:val="28"/>
+          <w:szCs w:val="28"/>
+          <w:lang w:val="en-US"/>
+        </w:rPr>
+      </w:pPr>
+      <w:r>
+        <w:rPr>
+          <w:b/>
+          <w:bCs/>
+          <w:sz w:val="28"/>
+          <w:szCs w:val="28"/>
+          <w:lang w:val="en-US"/>
+        </w:rPr>
+        <w:t>Hyperparameter Tuning and Evaluation:</w:t>
+      </w:r>
+    </w:p>
+    <w:p>
+      <w:pPr>
+        <w:spacing w:line="240" w:lineRule="auto"/>
+        <w:rPr>
+          <w:sz w:val="24"/>
+          <w:szCs w:val="24"/>
+          <w:lang w:val="en-MT"/>
+        </w:rPr>
+      </w:pPr>
+      <w:r>
+        <w:rPr>
+          <w:sz w:val="24"/>
+          <w:szCs w:val="24"/>
+          <w:lang w:val="en-MT"/>
+        </w:rPr>
+        <w:t xml:space="preserve">Hyper-parameter tuning was performed using GridSearchCV on a pipeline combining TF-IDF text features, numerical weather variables, and binary indicators with </w:t>
+      </w:r>
+      <w:r>
+        <w:rPr>
+          <w:sz w:val="24"/>
+          <w:szCs w:val="24"/>
+          <w:lang w:val="en-MT"/>
+        </w:rPr>
+        <w:t xml:space="preserve">an SVM </w:t>
+      </w:r>
+      <w:r>
+        <w:rPr>
+          <w:sz w:val="24"/>
+          <w:szCs w:val="24"/>
+          <w:lang w:val="en-MT"/>
+        </w:rPr>
+        <w:t xml:space="preserve">classifier. A grid search explored both linear and RBF kernels, with regularization strength </w:t>
+      </w:r>
+      <m:oMath>
+        <m:r>
+          <w:rPr>
+            <w:rFonts w:ascii="Cambria Math" w:hAnsi="Cambria Math"/>
+            <w:sz w:val="24"/>
+            <w:szCs w:val="24"/>
+            <w:lang w:val="en-MT"/>
+          </w:rPr>
+          <m:t>C∈</m:t>
+        </m:r>
+        <m:d>
+          <m:dPr>
+            <m:begChr m:val="{"/>
+            <m:endChr m:val="}"/>
+            <m:ctrlPr>
+              <w:rPr>
+                <w:rFonts w:ascii="Cambria Math" w:hAnsi="Cambria Math"/>
+                <w:i/>
+                <w:sz w:val="24"/>
+                <w:szCs w:val="24"/>
+                <w:lang w:val="en-MT"/>
+              </w:rPr>
+            </m:ctrlPr>
+          </m:dPr>
+          <m:e>
+            <m:r>
+              <w:rPr>
+                <w:rFonts w:ascii="Cambria Math" w:hAnsi="Cambria Math"/>
+                <w:sz w:val="24"/>
+                <w:szCs w:val="24"/>
+                <w:lang w:val="en-MT"/>
+              </w:rPr>
+              <m:t>0.1,1,10</m:t>
+            </m:r>
+          </m:e>
+        </m:d>
+      </m:oMath>
+      <w:r>
+        <w:rPr>
+          <w:rFonts w:eastAsiaTheme="minorEastAsia"/>
+          <w:sz w:val="24"/>
+          <w:szCs w:val="24"/>
+          <w:lang w:val="en-MT"/>
+        </w:rPr>
+        <w:t xml:space="preserve"> </w:t>
+      </w:r>
+      <w:r>
+        <w:rPr>
+          <w:sz w:val="24"/>
+          <w:szCs w:val="24"/>
+          <w:lang w:val="en-MT"/>
+        </w:rPr>
+        <w:t xml:space="preserve">and kernel coefficient </w:t>
+      </w:r>
+      <m:oMath>
+        <m:r>
+          <w:rPr>
+            <w:rFonts w:ascii="Cambria Math" w:hAnsi="Cambria Math"/>
+            <w:sz w:val="24"/>
+            <w:szCs w:val="24"/>
+            <w:lang w:val="en-MT"/>
+          </w:rPr>
+          <m:t>γ∈{</m:t>
+        </m:r>
+        <m:r>
+          <m:rPr>
+            <m:nor/>
+          </m:rPr>
+          <w:rPr>
+            <w:sz w:val="24"/>
+            <w:szCs w:val="24"/>
+            <w:lang w:val="en-MT"/>
+          </w:rPr>
+          <m:t>scale</m:t>
+        </m:r>
+        <m:r>
+          <w:rPr>
+            <w:rFonts w:ascii="Cambria Math" w:hAnsi="Cambria Math"/>
+            <w:sz w:val="24"/>
+            <w:szCs w:val="24"/>
+            <w:lang w:val="en-MT"/>
+          </w:rPr>
+          <m:t>,0.01,0.001}</m:t>
+        </m:r>
+      </m:oMath>
+      <w:r>
+        <w:rPr>
+          <w:sz w:val="24"/>
+          <w:szCs w:val="24"/>
+          <w:lang w:val="en-MT"/>
+        </w:rPr>
+        <w:t>. The SVM was configured using a</w:t>
+      </w:r>
+      <w:r>
+        <w:rPr>
+          <w:sz w:val="24"/>
+          <w:szCs w:val="24"/>
+          <w:lang w:val="en-MT"/>
+        </w:rPr>
+        <w:t>n</w:t>
+      </w:r>
+      <w:r>
+        <w:rPr>
+          <w:sz w:val="24"/>
+          <w:szCs w:val="24"/>
+          <w:lang w:val="en-MT"/>
+        </w:rPr>
+        <w:t xml:space="preserve"> </w:t>
+      </w:r>
+      <w:r>
+        <w:rPr>
+          <w:sz w:val="24"/>
+          <w:szCs w:val="24"/>
+          <w:lang w:val="en-MT"/>
+        </w:rPr>
+        <w:t>OVO</w:t>
+      </w:r>
+      <w:r>
+        <w:rPr>
+          <w:sz w:val="24"/>
+          <w:szCs w:val="24"/>
+          <w:lang w:val="en-MT"/>
+        </w:rPr>
+        <w:t xml:space="preserve"> multi-class strategy and class-balanced weights to mitigate class imbalance identified during exploratory data analysis. </w:t>
+      </w:r>
+      <w:r>
+        <w:rPr>
+          <w:sz w:val="24"/>
+          <w:szCs w:val="24"/>
+        </w:rPr>
+        <w:t>Model performance was evaluated using 5-fold stratified cross-validation, with accuracy as the evaluation metric. The final model was selected based on the highest mean cross-validation accuracy and retrained on the full dataset using the optimal hyper-parameters.</w:t>
+      </w:r>
+    </w:p>
+    <w:p>
+      <w:pPr>
+        <w:spacing w:line="240" w:lineRule="auto"/>
+        <w:rPr>
+          <w:b/>
+          <w:bCs/>
+          <w:sz w:val="32"/>
+          <w:szCs w:val="32"/>
+          <w:u w:val="single"/>
+          <w:lang w:val="en-US"/>
+        </w:rPr>
+      </w:pPr>
+      <w:r>
+        <w:rPr>
+          <w:b/>
+          <w:bCs/>
+          <w:sz w:val="32"/>
+          <w:szCs w:val="32"/>
+          <w:u w:val="single"/>
+          <w:lang w:val="en-US"/>
+        </w:rPr>
+        <w:t>Results</w:t>
+      </w:r>
+    </w:p>
+    <w:p>
+      <w:pPr>
+        <w:spacing w:line="240" w:lineRule="auto"/>
+        <w:rPr>
+          <w:b/>
+          <w:bCs/>
+          <w:sz w:val="28"/>
+          <w:szCs w:val="28"/>
+          <w:u w:val="single"/>
+          <w:lang w:val="en-US"/>
+        </w:rPr>
+      </w:pPr>
+      <w:r>
+        <w:rPr>
+          <w:b/>
+          <w:bCs/>
+          <w:sz w:val="28"/>
+          <w:szCs w:val="28"/>
+          <w:u w:val="single"/>
+          <w:lang w:val="en-US"/>
+        </w:rPr>
+        <w:t xml:space="preserve">Individual Model Performance: </w:t>
+      </w:r>
+      <w:r>
+        <w:rPr>
+          <w:b/>
+          <w:bCs/>
+          <w:sz w:val="28"/>
+          <w:szCs w:val="28"/>
+          <w:u w:val="single"/>
+          <w:lang w:val="en-US"/>
+        </w:rPr>
+        <w:t>SVM (OVO)</w:t>
+      </w:r>
+    </w:p>
+    <w:p>
+      <w:pPr>
+        <w:spacing w:line="240" w:lineRule="auto"/>
+        <w:rPr>
+          <w:sz w:val="24"/>
+          <w:szCs w:val="24"/>
+          <w:lang w:val="en-MT"/>
+        </w:rPr>
+      </w:pPr>
+      <w:r>
+        <w:rPr>
+          <w:sz w:val="24"/>
+          <w:szCs w:val="24"/>
+          <w:lang w:val="en-MT"/>
+        </w:rPr>
+        <w:t>Overall, the model achieves an accuracy of 62% with a cross-validation standard deviation of 4.6%, indicating stable and consistent performance across folds. Although prediction quality is uneven</w:t>
+      </w:r>
+      <w:r>
+        <w:rPr>
+          <w:sz w:val="24"/>
+          <w:szCs w:val="24"/>
+          <w:lang w:val="en-MT"/>
+        </w:rPr>
+        <w:t xml:space="preserve"> - </w:t>
+      </w:r>
+      <w:r>
+        <w:rPr>
+          <w:sz w:val="24"/>
+          <w:szCs w:val="24"/>
+          <w:lang w:val="en-MT"/>
+        </w:rPr>
+        <w:t>favouring</w:t>
+      </w:r>
+      <w:r>
+        <w:rPr>
+          <w:sz w:val="24"/>
+          <w:szCs w:val="24"/>
+          <w:lang w:val="en-MT"/>
+        </w:rPr>
+        <w:t xml:space="preserve"> the dominant class 3 while underperforming on classes 1 and 2</w:t>
+      </w:r>
+      <w:r>
+        <w:rPr>
+          <w:sz w:val="24"/>
+          <w:szCs w:val="24"/>
+          <w:lang w:val="en-MT"/>
+        </w:rPr>
+        <w:t xml:space="preserve"> - </w:t>
+      </w:r>
+      <w:r>
+        <w:rPr>
+          <w:sz w:val="24"/>
+          <w:szCs w:val="24"/>
+          <w:lang w:val="en-MT"/>
+        </w:rPr>
+        <w:t>the model attains an MAE of 0.67, showing that predictions deviate by less than one severity level on average. Most errors occur between neighbouring classes, confirming that the model preserves the ordinal structure of severity despite reduced sensitivity to minority classes.</w:t>
+      </w:r>
+    </w:p>
+    <w:p>
+      <w:pPr>
+        <w:spacing w:line="240" w:lineRule="auto"/>
+        <w:rPr>
+          <w:sz w:val="24"/>
+          <w:szCs w:val="24"/>
+          <w:lang w:val="en-MT"/>
+        </w:rPr>
+      </w:pPr>
+    </w:p>
+    <w:p>
+      <w:pPr>
+        <w:spacing w:line="240" w:lineRule="auto"/>
+        <w:rPr>
+          <w:sz w:val="24"/>
+          <w:szCs w:val="24"/>
+          <w:lang w:val="en-US"/>
+        </w:rPr>
+      </w:pPr>
+    </w:p>
+    <w:p>
+      <w:pPr>
+        <w:spacing w:line="240" w:lineRule="auto"/>
+        <w:rPr>
+          <w:sz w:val="24"/>
+          <w:szCs w:val="24"/>
+          <w:lang w:val="en-US"/>
+        </w:rPr>
+      </w:pPr>
+    </w:p>
+    <w:p>
+      <w:pPr>
+        <w:spacing w:line="240" w:lineRule="auto"/>
+        <w:rPr>
+          <w:sz w:val="24"/>
+          <w:szCs w:val="24"/>
+          <w:lang w:val="en-US"/>
+        </w:rPr>
+      </w:pPr>
+    </w:p>
+    <w:p>
+      <w:pPr>
+        <w:spacing w:line="240" w:lineRule="auto"/>
+        <w:rPr>
+          <w:sz w:val="24"/>
+          <w:szCs w:val="24"/>
+          <w:lang w:val="en-US"/>
+        </w:rPr>
+      </w:pPr>
+    </w:p>
+    <w:p>
+      <w:pPr>
+        <w:spacing w:line="240" w:lineRule="auto"/>
+        <w:rPr>
+          <w:sz w:val="24"/>
+          <w:szCs w:val="24"/>
+          <w:lang w:val="en-US"/>
+        </w:rPr>
+      </w:pPr>
+    </w:p>
+    <w:p>
+      <w:pPr>
+        <w:spacing w:line="240" w:lineRule="auto"/>
+        <w:rPr>
+          <w:sz w:val="24"/>
+          <w:szCs w:val="24"/>
+          <w:lang w:val="en-US"/>
+        </w:rPr>
+      </w:pPr>
+    </w:p>
+    <w:p>
+      <w:pPr>
+        <w:spacing w:line="240" w:lineRule="auto"/>
+        <w:rPr>
+          <w:sz w:val="24"/>
+          <w:szCs w:val="24"/>
+          <w:lang w:val="en-US"/>
+        </w:rPr>
+      </w:pPr>
+    </w:p>
+    <w:p>
+      <w:pPr>
+        <w:spacing w:line="240" w:lineRule="auto"/>
+        <w:rPr>
+          <w:sz w:val="24"/>
+          <w:szCs w:val="24"/>
+          <w:lang w:val="en-US"/>
+        </w:rPr>
+      </w:pPr>
+    </w:p>
+    <w:p>
+      <w:pPr>
+        <w:spacing w:line="240" w:lineRule="auto"/>
+        <w:rPr>
+          <w:sz w:val="24"/>
+          <w:szCs w:val="24"/>
+          <w:lang w:val="en-US"/>
+        </w:rPr>
+      </w:pPr>
+    </w:p>
+    <w:p>
+      <w:pPr>
+        <w:spacing w:line="240" w:lineRule="auto"/>
+        <w:rPr>
+          <w:sz w:val="24"/>
+          <w:szCs w:val="24"/>
+          <w:lang w:val="en-US"/>
+        </w:rPr>
+      </w:pPr>
+    </w:p>
+    <w:p>
+      <w:pPr>
+        <w:spacing w:line="240" w:lineRule="auto"/>
+        <w:rPr>
+          <w:sz w:val="24"/>
+          <w:szCs w:val="24"/>
+          <w:lang w:val="en-US"/>
+        </w:rPr>
+      </w:pPr>
+    </w:p>
+    <w:p>
+      <w:pPr>
+        <w:spacing w:line="240" w:lineRule="auto"/>
+        <w:rPr>
+          <w:sz w:val="24"/>
+          <w:szCs w:val="24"/>
+          <w:lang w:val="en-US"/>
+        </w:rPr>
+      </w:pPr>
+    </w:p>
+    <w:p>
+      <w:pPr>
+        <w:spacing w:line="240" w:lineRule="auto"/>
+        <w:rPr>
+          <w:sz w:val="24"/>
+          <w:szCs w:val="24"/>
+          <w:lang w:val="en-US"/>
+        </w:rPr>
+      </w:pPr>
+    </w:p>
+    <w:p>
+      <w:pPr>
+        <w:spacing w:line="240" w:lineRule="auto"/>
+        <w:rPr>
+          <w:sz w:val="24"/>
+          <w:szCs w:val="24"/>
+          <w:lang w:val="en-US"/>
+        </w:rPr>
+      </w:pPr>
+    </w:p>
+    <w:p>
+      <w:pPr>
+        <w:spacing w:line="240" w:lineRule="auto"/>
+        <w:rPr>
+          <w:sz w:val="24"/>
+          <w:szCs w:val="24"/>
+          <w:lang w:val="en-US"/>
+        </w:rPr>
+      </w:pPr>
+    </w:p>
+    <w:p>
+      <w:pPr>
+        <w:spacing w:line="240" w:lineRule="auto"/>
+        <w:rPr>
+          <w:sz w:val="24"/>
+          <w:szCs w:val="24"/>
+          <w:lang w:val="en-US"/>
+        </w:rPr>
+      </w:pPr>
+    </w:p>
+    <w:p>
+      <w:pPr>
+        <w:spacing w:line="240" w:lineRule="auto"/>
+        <w:rPr>
+          <w:sz w:val="24"/>
+          <w:szCs w:val="24"/>
+          <w:lang w:val="en-US"/>
+        </w:rPr>
+      </w:pPr>
+    </w:p>
+    <w:p>
+      <w:pPr>
+        <w:spacing w:line="240" w:lineRule="auto"/>
+        <w:rPr>
+          <w:sz w:val="24"/>
+          <w:szCs w:val="24"/>
+          <w:lang w:val="en-US"/>
+        </w:rPr>
+      </w:pPr>
+    </w:p>
+    <w:p>
+      <w:pPr>
+        <w:spacing w:line="240" w:lineRule="auto"/>
+        <w:rPr>
+          <w:sz w:val="24"/>
+          <w:szCs w:val="24"/>
+          <w:lang w:val="en-US"/>
+        </w:rPr>
+      </w:pPr>
+    </w:p>
+    <w:p>
+      <w:pPr>
+        <w:spacing w:line="240" w:lineRule="auto"/>
+        <w:rPr>
+          <w:sz w:val="24"/>
+          <w:szCs w:val="24"/>
+          <w:lang w:val="en-US"/>
+        </w:rPr>
+      </w:pPr>
+    </w:p>
+    <w:p>
+      <w:pPr>
+        <w:spacing w:line="240" w:lineRule="auto"/>
+        <w:rPr>
+          <w:sz w:val="24"/>
+          <w:szCs w:val="24"/>
+          <w:lang w:val="en-US"/>
+        </w:rPr>
+      </w:pPr>
+    </w:p>
+    <w:p>
+      <w:pPr>
+        <w:spacing w:line="240" w:lineRule="auto"/>
+        <w:rPr>
+          <w:sz w:val="24"/>
+          <w:szCs w:val="24"/>
+          <w:lang w:val="en-US"/>
+        </w:rPr>
+      </w:pPr>
+    </w:p>
+    <w:p>
+      <w:pPr>
+        <w:spacing w:line="240" w:lineRule="auto"/>
+        <w:rPr>
+          <w:sz w:val="24"/>
+          <w:szCs w:val="24"/>
+          <w:lang w:val="en-US"/>
+        </w:rPr>
+      </w:pPr>
+    </w:p>
+    <w:p>
+      <w:pPr>
+        <w:spacing w:line="240" w:lineRule="auto"/>
+        <w:rPr>
+          <w:sz w:val="24"/>
+          <w:szCs w:val="24"/>
+          <w:lang w:val="en-US"/>
+        </w:rPr>
+      </w:pPr>
+    </w:p>
+    <w:p>
+      <w:pPr>
+        <w:spacing w:line="240" w:lineRule="auto"/>
+        <w:rPr>
+          <w:sz w:val="24"/>
+          <w:szCs w:val="24"/>
+          <w:lang w:val="en-US"/>
+        </w:rPr>
+      </w:pPr>
+    </w:p>
+    <w:p>
+      <w:pPr>
+        <w:spacing w:line="240" w:lineRule="auto"/>
+        <w:rPr>
+          <w:sz w:val="24"/>
+          <w:szCs w:val="24"/>
+          <w:lang w:val="en-US"/>
+        </w:rPr>
+      </w:pPr>
     </w:p>
     <w:p>
       <w:pPr>
@@ -4799,6 +5845,7 @@
           <w:szCs w:val="32"/>
           <w:lang w:val="en-US"/>
         </w:rPr>
+        <w:lastRenderedPageBreak/>
         <w:t xml:space="preserve">Ethical Considerations (Not sure who should tackle this, we will discuss </w:t>
       </w:r>
       <w:proofErr w:type="gramStart"/>
@@ -5496,15 +6543,6 @@
         <w:rPr>
           <w:sz w:val="24"/>
           <w:szCs w:val="24"/>
-          <w:lang w:val="en-US"/>
-        </w:rPr>
-      </w:pPr>
-    </w:p>
-    <w:p>
-      <w:pPr>
-        <w:rPr>
-          <w:sz w:val="24"/>
-          <w:szCs w:val="24"/>
         </w:rPr>
       </w:pPr>
       <w:r>
@@ -5532,21 +6570,12 @@
         <w:t xml:space="preserve"> development team, “</w:t>
       </w:r>
       <w:proofErr w:type="spellStart"/>
-      <w:proofErr w:type="gramStart"/>
-      <w:r>
-        <w:rPr>
-          <w:sz w:val="24"/>
-          <w:szCs w:val="24"/>
-        </w:rPr>
-        <w:t>pandas.Series.dt</w:t>
-      </w:r>
-      <w:proofErr w:type="gramEnd"/>
-      <w:r>
-        <w:rPr>
-          <w:sz w:val="24"/>
-          <w:szCs w:val="24"/>
-        </w:rPr>
-        <w:t>.year</w:t>
+      <w:r>
+        <w:rPr>
+          <w:sz w:val="24"/>
+          <w:szCs w:val="24"/>
+        </w:rPr>
+        <w:t>pandas.Series.dt.year</w:t>
       </w:r>
       <w:proofErr w:type="spellEnd"/>
       <w:r>
@@ -5583,33 +6612,13 @@
         </w:rPr>
         <w:t xml:space="preserve">. [Online]. </w:t>
       </w:r>
-      <w:proofErr w:type="spellStart"/>
-      <w:proofErr w:type="gramStart"/>
-      <w:r>
-        <w:rPr>
-          <w:sz w:val="24"/>
-          <w:szCs w:val="24"/>
-          <w:lang w:val="fr-FR"/>
-        </w:rPr>
-        <w:t>Available</w:t>
-      </w:r>
-      <w:proofErr w:type="spellEnd"/>
-      <w:r>
-        <w:rPr>
-          <w:sz w:val="24"/>
-          <w:szCs w:val="24"/>
-          <w:lang w:val="fr-FR"/>
-        </w:rPr>
-        <w:t>:</w:t>
-      </w:r>
-      <w:proofErr w:type="gramEnd"/>
-      <w:r>
-        <w:rPr>
-          <w:sz w:val="24"/>
-          <w:szCs w:val="24"/>
-          <w:lang w:val="fr-FR"/>
-        </w:rPr>
-        <w:t xml:space="preserve"> </w:t>
+      <w:r>
+        <w:rPr>
+          <w:sz w:val="24"/>
+          <w:szCs w:val="24"/>
+          <w:lang w:val="en-US"/>
+        </w:rPr>
+        <w:t xml:space="preserve">Available: </w:t>
       </w:r>
       <w:hyperlink r:id="rId6" w:tgtFrame="_blank" w:history="1">
         <w:r>
@@ -5617,7 +6626,7 @@
             <w:rStyle w:val="Hyperlink"/>
             <w:sz w:val="24"/>
             <w:szCs w:val="24"/>
-            <w:lang w:val="fr-FR"/>
+            <w:lang w:val="en-US"/>
           </w:rPr>
           <w:t>https://pandas.pydata.org/docs/reference/api/pandas.Series.dt.year.html</w:t>
         </w:r>
@@ -5626,7 +6635,7 @@
         <w:rPr>
           <w:sz w:val="24"/>
           <w:szCs w:val="24"/>
-          <w:lang w:val="fr-FR"/>
+          <w:lang w:val="en-US"/>
         </w:rPr>
         <w:t xml:space="preserve">. </w:t>
       </w:r>
@@ -5637,14 +6646,6 @@
         </w:rPr>
         <w:t>[Accessed: Nov. 23, 2025].</w:t>
       </w:r>
-    </w:p>
-    <w:p>
-      <w:pPr>
-        <w:rPr>
-          <w:sz w:val="24"/>
-          <w:szCs w:val="24"/>
-        </w:rPr>
-      </w:pPr>
     </w:p>
     <w:p>
       <w:pPr>
@@ -5685,27 +6686,11 @@
       </w:r>
     </w:p>
     <w:p>
-      <w:pPr>
-        <w:rPr>
-          <w:sz w:val="24"/>
-          <w:szCs w:val="24"/>
-        </w:rPr>
-      </w:pPr>
-    </w:p>
-    <w:p>
-      <w:pPr>
-        <w:rPr>
-          <w:sz w:val="24"/>
-          <w:szCs w:val="24"/>
-          <w:lang w:val="fr-FR"/>
-        </w:rPr>
-      </w:pPr>
-      <w:r>
-        <w:rPr>
-          <w:sz w:val="24"/>
-          <w:szCs w:val="24"/>
-        </w:rPr>
-        <w:lastRenderedPageBreak/>
+      <w:r>
+        <w:rPr>
+          <w:sz w:val="24"/>
+          <w:szCs w:val="24"/>
+        </w:rPr>
         <w:t xml:space="preserve">[4] </w:t>
       </w:r>
       <w:r>
@@ -5778,6 +6763,68 @@
           <w:t>https://datascience.stackexchange.com/questions/63049/how-to-handle-weekdays-in-a-nn</w:t>
         </w:r>
       </w:hyperlink>
+    </w:p>
+    <w:p>
+      <w:pPr>
+        <w:rPr>
+          <w:lang w:val="en-MT"/>
+        </w:rPr>
+      </w:pPr>
+      <w:r>
+        <w:t xml:space="preserve">[5] </w:t>
+      </w:r>
+      <w:r>
+        <w:rPr>
+          <w:lang w:val="en-MT"/>
+        </w:rPr>
+        <w:t>Scikit-learn, “Support Vector Machines,” Scikit-learn Documentation. [Online]. Available: https://scikit-learn.org/stable/modules/svm.html</w:t>
+      </w:r>
+    </w:p>
+    <w:p>
+      <w:pPr>
+        <w:rPr>
+          <w:lang w:val="en-MT"/>
+        </w:rPr>
+      </w:pPr>
+      <w:r>
+        <w:lastRenderedPageBreak/>
+        <w:t xml:space="preserve">[6] </w:t>
+      </w:r>
+      <w:r>
+        <w:rPr>
+          <w:lang w:val="en-MT"/>
+        </w:rPr>
+        <w:t xml:space="preserve">J. B. Ribeiro, S. Singh, and C. </w:t>
+      </w:r>
+      <w:proofErr w:type="spellStart"/>
+      <w:r>
+        <w:rPr>
+          <w:lang w:val="en-MT"/>
+        </w:rPr>
+        <w:t>Guestrin</w:t>
+      </w:r>
+      <w:proofErr w:type="spellEnd"/>
+      <w:r>
+        <w:rPr>
+          <w:lang w:val="en-MT"/>
+        </w:rPr>
+        <w:t>, “Why should I trust you? Explaining the predictions of any classifier,” ACM SIGKDD, 2016. [Online]. Available: https://pubmed.ncbi.nlm.nih.gov/28606174</w:t>
+      </w:r>
+      <w:r>
+        <w:rPr>
+          <w:lang w:val="en-MT"/>
+        </w:rPr>
+        <w:t>/</w:t>
+      </w:r>
+    </w:p>
+    <w:p>
+      <w:pPr>
+        <w:rPr>
+          <w:sz w:val="24"/>
+          <w:szCs w:val="24"/>
+          <w:lang w:val="en-US"/>
+        </w:rPr>
+      </w:pPr>
     </w:p>
     <w:sectPr>
       <w:pgSz w:w="11906" w:h="16838"/>
@@ -8604,7 +9651,6 @@
   <w:style w:type="character" w:default="1" w:styleId="DefaultParagraphFont">
     <w:name w:val="Default Paragraph Font"/>
     <w:uiPriority w:val="1"/>
-    <w:semiHidden/>
     <w:unhideWhenUsed/>
   </w:style>
   <w:style w:type="table" w:default="1" w:styleId="TableNormal">

</xml_diff>

<commit_message>
had to make a quick fix here too
</commit_message>
<xml_diff>
--- a/Main Document.docx
+++ b/Main Document.docx
@@ -5558,25 +5558,41 @@
           <w:szCs w:val="24"/>
           <w:lang w:val="en-US"/>
         </w:rPr>
-        <w:t>The headline results show a clear ranking.  Random Forest achieved the strongest overall performance, with Accuracy 0.7471, Macro F1 0.6774, Weighted F1 0.7115, and Macro ROC AUC 0.9415.  RidgeClassifier ranked second, with Accuracy 0.6667, Macro F1 0.5146, Weighted F1 0.6063, and Macro ROC AUC 0.8500.  SVM performed weakest, with Accuracy 0.5287, Macro F1 0.3321, Weighted F1 0.4329, and Macro ROC AUC 0.6606.</w:t>
-      </w:r>
-    </w:p>
-    <w:p>
-      <w:pPr>
-        <w:spacing w:line="240" w:lineRule="auto"/>
-        <w:rPr>
-          <w:sz w:val="24"/>
-          <w:szCs w:val="24"/>
-          <w:lang w:val="en-US"/>
-        </w:rPr>
-      </w:pPr>
-      <w:r>
-        <w:rPr>
-          <w:sz w:val="24"/>
-          <w:szCs w:val="24"/>
-          <w:lang w:val="en-US"/>
-        </w:rPr>
-        <w:t xml:space="preserve">Efficiency results favour RidgeClassifier.  </w:t>
+        <w:t xml:space="preserve">The headline results show a clear ranking.  Random Forest achieved the strongest overall performance, with Accuracy 0.7471, Macro F1 0.6774, Weighted F1 0.7115, and Macro ROC AUC 0.9415.  </w:t>
+      </w:r>
+      <w:r>
+        <w:rPr>
+          <w:sz w:val="24"/>
+          <w:szCs w:val="24"/>
+          <w:lang w:val="en-US"/>
+        </w:rPr>
+        <w:t>Ridge based linear approach</w:t>
+      </w:r>
+      <w:r>
+        <w:rPr>
+          <w:sz w:val="24"/>
+          <w:szCs w:val="24"/>
+          <w:lang w:val="en-US"/>
+        </w:rPr>
+        <w:t xml:space="preserve"> ranked second, with Accuracy 0.6667, Macro F1 0.5146, Weighted F1 0.6063, and Macro ROC AUC 0.8500.  SVM performed weakest, with Accuracy 0.5287, Macro F1 0.3321, Weighted F1 0.4329, and Macro ROC AUC 0.6606.</w:t>
+      </w:r>
+    </w:p>
+    <w:p>
+      <w:pPr>
+        <w:spacing w:line="240" w:lineRule="auto"/>
+        <w:rPr>
+          <w:sz w:val="24"/>
+          <w:szCs w:val="24"/>
+          <w:lang w:val="en-US"/>
+        </w:rPr>
+      </w:pPr>
+      <w:r>
+        <w:rPr>
+          <w:sz w:val="24"/>
+          <w:szCs w:val="24"/>
+          <w:lang w:val="en-US"/>
+        </w:rPr>
+        <w:t xml:space="preserve">Efficiency results </w:t>
       </w:r>
       <w:proofErr w:type="spellStart"/>
       <w:r>
@@ -5585,7 +5601,7 @@
           <w:szCs w:val="24"/>
           <w:lang w:val="en-US"/>
         </w:rPr>
-        <w:t>RidgeClassifier</w:t>
+        <w:t>favour</w:t>
       </w:r>
       <w:proofErr w:type="spellEnd"/>
       <w:r>
@@ -5594,6 +5610,38 @@
           <w:szCs w:val="24"/>
           <w:lang w:val="en-US"/>
         </w:rPr>
+        <w:t xml:space="preserve"> </w:t>
+      </w:r>
+      <w:r>
+        <w:rPr>
+          <w:sz w:val="24"/>
+          <w:szCs w:val="24"/>
+          <w:lang w:val="en-US"/>
+        </w:rPr>
+        <w:t>Ridge based linear approach</w:t>
+      </w:r>
+      <w:r>
+        <w:rPr>
+          <w:sz w:val="24"/>
+          <w:szCs w:val="24"/>
+          <w:lang w:val="en-US"/>
+        </w:rPr>
+        <w:t xml:space="preserve">.  </w:t>
+      </w:r>
+      <w:r>
+        <w:rPr>
+          <w:sz w:val="24"/>
+          <w:szCs w:val="24"/>
+          <w:lang w:val="en-US"/>
+        </w:rPr>
+        <w:t>Ridge based linear approach</w:t>
+      </w:r>
+      <w:r>
+        <w:rPr>
+          <w:sz w:val="24"/>
+          <w:szCs w:val="24"/>
+          <w:lang w:val="en-US"/>
+        </w:rPr>
         <w:t xml:space="preserve"> was </w:t>
       </w:r>
       <w:r>
@@ -5644,30 +5692,47 @@
           <w:szCs w:val="24"/>
           <w:lang w:val="en-US"/>
         </w:rPr>
-        <w:t>Table 1 summarises the headline performance and timing metrics for each technique on the shared test split, showing that Random Forest achieves the highest Accuracy  0.7471, Macro F1  0.6774, Weighted F1  0.7115, and Macro ROC AUC  0.9415, while RidgeClassifier is the fastest to train  0.0658 seconds and predict  0.0071 seconds, and SVM performs weakest overall with the lowest Macro F1  0.3321 and Macro ROC AUC  0.6606.</w:t>
-      </w:r>
-    </w:p>
-    <w:p>
-      <w:pPr>
-        <w:spacing w:line="240" w:lineRule="auto"/>
-        <w:rPr>
-          <w:sz w:val="24"/>
-          <w:szCs w:val="24"/>
-          <w:lang w:val="en-US"/>
-        </w:rPr>
-      </w:pPr>
-    </w:p>
-    <w:p>
-      <w:pPr>
-        <w:spacing w:line="240" w:lineRule="auto"/>
-        <w:rPr>
-          <w:sz w:val="24"/>
-          <w:szCs w:val="24"/>
-          <w:lang w:val="en-US"/>
-        </w:rPr>
-      </w:pPr>
-      <w:r>
-        <w:rPr>
+        <w:t xml:space="preserve">Table 1 summarises the headline performance and timing metrics for each technique on the shared test split, showing that Random Forest achieves the highest Accuracy  0.7471, Macro F1  0.6774, Weighted F1  0.7115, and Macro ROC AUC  0.9415, while </w:t>
+      </w:r>
+      <w:r>
+        <w:rPr>
+          <w:sz w:val="24"/>
+          <w:szCs w:val="24"/>
+          <w:lang w:val="en-US"/>
+        </w:rPr>
+        <w:t>Ridge based linear approach</w:t>
+      </w:r>
+      <w:r>
+        <w:rPr>
+          <w:sz w:val="24"/>
+          <w:szCs w:val="24"/>
+          <w:lang w:val="en-US"/>
+        </w:rPr>
+        <w:t xml:space="preserve"> is the fastest to train  0.0658 seconds and predict  0.0071 seconds, and SVM performs weakest overall with the lowest Macro F1  0.3321 and Macro ROC AUC  0.6606.</w:t>
+      </w:r>
+    </w:p>
+    <w:p>
+      <w:pPr>
+        <w:spacing w:line="240" w:lineRule="auto"/>
+        <w:rPr>
+          <w:sz w:val="24"/>
+          <w:szCs w:val="24"/>
+          <w:lang w:val="en-US"/>
+        </w:rPr>
+      </w:pPr>
+    </w:p>
+    <w:p>
+      <w:pPr>
+        <w:spacing w:line="240" w:lineRule="auto"/>
+        <w:rPr>
+          <w:sz w:val="24"/>
+          <w:szCs w:val="24"/>
+          <w:lang w:val="en-US"/>
+        </w:rPr>
+      </w:pPr>
+      <w:r>
+        <w:rPr>
+          <w:noProof/>
           <w:sz w:val="24"/>
           <w:szCs w:val="24"/>
           <w:lang w:val="en-US"/>
@@ -5786,25 +5851,57 @@
           <w:szCs w:val="24"/>
           <w:lang w:val="en-US"/>
         </w:rPr>
-        <w:t>severity classes rather than complete class collapse.  RidgeClassifier improves materially over SVM but still shows weaker recognition for minority classes, which explains its lower Macro F1 relative to Random Forest.  SVM exhibits the most uneven behaviour, with very low recall for at least two minority classes, which depresses Macro F1 despite a moderate Accuracy.  This makes SVM difficult to justify where reliable coverage across severity levels is required.</w:t>
-      </w:r>
-    </w:p>
-    <w:p>
-      <w:pPr>
-        <w:spacing w:line="240" w:lineRule="auto"/>
-        <w:rPr>
-          <w:sz w:val="24"/>
-          <w:szCs w:val="24"/>
-          <w:lang w:val="en-US"/>
-        </w:rPr>
-      </w:pPr>
-      <w:r>
-        <w:rPr>
-          <w:sz w:val="24"/>
-          <w:szCs w:val="24"/>
-          <w:lang w:val="en-US"/>
-        </w:rPr>
-        <w:t xml:space="preserve">Figure 1 compares the confusion matrices for all three techniques on the same test set and shows that Random Forest and RidgeClassifier produce more concentrated diagonal mass, while the SVM collapses many cases into the predicted </w:t>
+        <w:t xml:space="preserve">severity classes rather than complete class collapse.  </w:t>
+      </w:r>
+      <w:r>
+        <w:rPr>
+          <w:sz w:val="24"/>
+          <w:szCs w:val="24"/>
+          <w:lang w:val="en-US"/>
+        </w:rPr>
+        <w:t>Ridge based linear approach</w:t>
+      </w:r>
+      <w:r>
+        <w:rPr>
+          <w:sz w:val="24"/>
+          <w:szCs w:val="24"/>
+          <w:lang w:val="en-US"/>
+        </w:rPr>
+        <w:t xml:space="preserve"> improves materially over SVM but still shows weaker recognition for minority classes, which explains its lower Macro F1 relative to Random Forest.  SVM exhibits the most uneven behaviour, with very low recall for at least two minority classes, which depresses Macro F1 despite a moderate Accuracy.  This makes SVM difficult to justify where reliable coverage across severity levels is required.</w:t>
+      </w:r>
+    </w:p>
+    <w:p>
+      <w:pPr>
+        <w:spacing w:line="240" w:lineRule="auto"/>
+        <w:rPr>
+          <w:sz w:val="24"/>
+          <w:szCs w:val="24"/>
+          <w:lang w:val="en-US"/>
+        </w:rPr>
+      </w:pPr>
+      <w:r>
+        <w:rPr>
+          <w:sz w:val="24"/>
+          <w:szCs w:val="24"/>
+          <w:lang w:val="en-US"/>
+        </w:rPr>
+        <w:t xml:space="preserve">Figure 1 compares the confusion matrices for all three techniques on the same test set and shows that Random Forest and </w:t>
+      </w:r>
+      <w:r>
+        <w:rPr>
+          <w:sz w:val="24"/>
+          <w:szCs w:val="24"/>
+          <w:lang w:val="en-US"/>
+        </w:rPr>
+        <w:t>Ridge based linear approach</w:t>
+      </w:r>
+      <w:r>
+        <w:rPr>
+          <w:sz w:val="24"/>
+          <w:szCs w:val="24"/>
+          <w:lang w:val="en-US"/>
+        </w:rPr>
+        <w:t xml:space="preserve"> produce more concentrated diagonal mass, while the SVM collapses many cases into the predicted </w:t>
       </w:r>
       <w:proofErr w:type="gramStart"/>
       <w:r>
@@ -5882,6 +5979,7 @@
       </w:pPr>
       <w:r>
         <w:rPr>
+          <w:noProof/>
           <w:sz w:val="24"/>
           <w:szCs w:val="24"/>
           <w:lang w:val="en-US"/>
@@ -5960,6 +6058,7 @@
       </w:pPr>
       <w:r>
         <w:rPr>
+          <w:noProof/>
           <w:sz w:val="24"/>
           <w:szCs w:val="24"/>
           <w:lang w:val="en-US"/>
@@ -6058,7 +6157,23 @@
           <w:szCs w:val="24"/>
           <w:lang w:val="en-US"/>
         </w:rPr>
-        <w:t>averaged AUC.  Random Forest shows strong separability across classes and achieves the highest Macro ROC AUC 0.9415.  RidgeClassifier is second at 0.8500, while SVM is substantially lower at 0.6606, with notably weak per</w:t>
+        <w:t xml:space="preserve">averaged AUC.  Random Forest shows strong separability across classes and achieves the highest Macro ROC AUC 0.9415.  </w:t>
+      </w:r>
+      <w:r>
+        <w:rPr>
+          <w:sz w:val="24"/>
+          <w:szCs w:val="24"/>
+          <w:lang w:val="en-US"/>
+        </w:rPr>
+        <w:t>Ridge based linear approach</w:t>
+      </w:r>
+      <w:r>
+        <w:rPr>
+          <w:sz w:val="24"/>
+          <w:szCs w:val="24"/>
+          <w:lang w:val="en-US"/>
+        </w:rPr>
+        <w:t xml:space="preserve"> is second at 0.8500, while SVM is substantially lower at 0.6606, with notably weak per</w:t>
       </w:r>
       <w:r>
         <w:rPr>
@@ -6076,16 +6191,14 @@
         </w:rPr>
         <w:t xml:space="preserve">class separability for some minority classes.  Random Forest ROC uses predicted probabilities, whereas SVM and </w:t>
       </w:r>
-      <w:proofErr w:type="spellStart"/>
-      <w:r>
-        <w:rPr>
-          <w:sz w:val="24"/>
-          <w:szCs w:val="24"/>
-          <w:lang w:val="en-US"/>
-        </w:rPr>
-        <w:t>RidgeClassifier</w:t>
-      </w:r>
-      <w:proofErr w:type="spellEnd"/>
+      <w:r>
+        <w:rPr>
+          <w:sz w:val="24"/>
+          <w:szCs w:val="24"/>
+          <w:lang w:val="en-US"/>
+        </w:rPr>
+        <w:t>Ridge based linear approach</w:t>
+      </w:r>
       <w:r>
         <w:rPr>
           <w:sz w:val="24"/>
@@ -6112,7 +6225,7 @@
           <w:lang w:val="en-US" w:eastAsia="en-US"/>
           <w14:ligatures w14:val="standardContextual"/>
         </w:rPr>
-        <w:t xml:space="preserve">Figure 2 shows the macro averaged one versus rest ROC curves, where Random Forest achieves the strongest overall separability with a Macro ROC AUC of </w:t>
+        <w:t xml:space="preserve">Figure 2 shows the macro averaged one versus rest ROC curves, where Random Forest achieves the strongest overall </w:t>
       </w:r>
       <w:r>
         <w:rPr>
@@ -6122,7 +6235,7 @@
           <w14:ligatures w14:val="standardContextual"/>
         </w:rPr>
         <w:lastRenderedPageBreak/>
-        <w:t xml:space="preserve">0.941, RidgeClassifier follows with 0.850, and SVM performs </w:t>
+        <w:t xml:space="preserve">separability with a Macro ROC AUC of 0.941, </w:t>
       </w:r>
       <w:r>
         <w:rPr>
@@ -6131,7 +6244,7 @@
           <w:lang w:val="en-US" w:eastAsia="en-US"/>
           <w14:ligatures w14:val="standardContextual"/>
         </w:rPr>
-        <w:t xml:space="preserve">the </w:t>
+        <w:t>Ridge based linear approach</w:t>
       </w:r>
       <w:r>
         <w:rPr>
@@ -6140,18 +6253,36 @@
           <w:lang w:val="en-US" w:eastAsia="en-US"/>
           <w14:ligatures w14:val="standardContextual"/>
         </w:rPr>
-        <w:t>weakest with 0.661, indicating that Random Forest provides the most reliable class ranking across thresholds on the shared test set.</w:t>
-      </w:r>
-    </w:p>
-    <w:p>
-      <w:pPr>
-        <w:pStyle w:val="p1"/>
+        <w:t xml:space="preserve"> follows with 0.850, and SVM performs </w:t>
+      </w:r>
+      <w:r>
         <w:rPr>
           <w:rFonts w:asciiTheme="minorHAnsi" w:eastAsiaTheme="minorHAnsi" w:hAnsiTheme="minorHAnsi" w:cstheme="minorBidi"/>
           <w:kern w:val="2"/>
           <w:lang w:val="en-US" w:eastAsia="en-US"/>
           <w14:ligatures w14:val="standardContextual"/>
         </w:rPr>
+        <w:t xml:space="preserve">the </w:t>
+      </w:r>
+      <w:r>
+        <w:rPr>
+          <w:rFonts w:asciiTheme="minorHAnsi" w:eastAsiaTheme="minorHAnsi" w:hAnsiTheme="minorHAnsi" w:cstheme="minorBidi"/>
+          <w:kern w:val="2"/>
+          <w:lang w:val="en-US" w:eastAsia="en-US"/>
+          <w14:ligatures w14:val="standardContextual"/>
+        </w:rPr>
+        <w:t>weakest with 0.661, indicating that Random Forest provides the most reliable class ranking across thresholds on the shared test set.</w:t>
+      </w:r>
+    </w:p>
+    <w:p>
+      <w:pPr>
+        <w:pStyle w:val="p1"/>
+        <w:rPr>
+          <w:rFonts w:asciiTheme="minorHAnsi" w:eastAsiaTheme="minorHAnsi" w:hAnsiTheme="minorHAnsi" w:cstheme="minorBidi"/>
+          <w:kern w:val="2"/>
+          <w:lang w:val="en-US" w:eastAsia="en-US"/>
+          <w14:ligatures w14:val="standardContextual"/>
+        </w:rPr>
       </w:pPr>
     </w:p>
     <w:p>
@@ -6191,6 +6322,7 @@
       </w:pPr>
       <w:r>
         <w:rPr>
+          <w:noProof/>
           <w:sz w:val="24"/>
           <w:szCs w:val="24"/>
           <w:lang w:val="en-US"/>
@@ -6275,16 +6407,14 @@
         </w:rPr>
         <w:t xml:space="preserve">based feature importance, </w:t>
       </w:r>
-      <w:proofErr w:type="spellStart"/>
-      <w:r>
-        <w:rPr>
-          <w:sz w:val="24"/>
-          <w:szCs w:val="24"/>
-          <w:lang w:val="en-US"/>
-        </w:rPr>
-        <w:t>RidgeClassifier</w:t>
-      </w:r>
-      <w:proofErr w:type="spellEnd"/>
+      <w:r>
+        <w:rPr>
+          <w:sz w:val="24"/>
+          <w:szCs w:val="24"/>
+          <w:lang w:val="en-US"/>
+        </w:rPr>
+        <w:t>Ridge based linear approach</w:t>
+      </w:r>
       <w:r>
         <w:rPr>
           <w:sz w:val="24"/>
@@ -6325,30 +6455,47 @@
           <w:szCs w:val="24"/>
           <w:lang w:val="en-MT"/>
         </w:rPr>
-        <w:t>Figure 3 summarises the headline metrics and confirms the same ranking as Table 1, where Random Forest is highest on Accuracy, Macro F1, and Weighted F1, RidgeClassifier is consistently second, and SVM is lowest across all three measures.</w:t>
-      </w:r>
-    </w:p>
-    <w:p>
-      <w:pPr>
-        <w:spacing w:line="240" w:lineRule="auto"/>
-        <w:rPr>
-          <w:sz w:val="24"/>
-          <w:szCs w:val="24"/>
-          <w:lang w:val="en-MT"/>
-        </w:rPr>
-      </w:pPr>
-    </w:p>
-    <w:p>
-      <w:pPr>
-        <w:spacing w:line="240" w:lineRule="auto"/>
-        <w:rPr>
-          <w:sz w:val="24"/>
-          <w:szCs w:val="24"/>
-          <w:lang w:val="en-MT"/>
-        </w:rPr>
-      </w:pPr>
-      <w:r>
-        <w:rPr>
+        <w:t xml:space="preserve">Figure 3 summarises the headline metrics and confirms the same ranking as Table 1, where Random Forest is highest on Accuracy, Macro F1, and Weighted F1, </w:t>
+      </w:r>
+      <w:r>
+        <w:rPr>
+          <w:sz w:val="24"/>
+          <w:szCs w:val="24"/>
+          <w:lang w:val="en-MT"/>
+        </w:rPr>
+        <w:t>Ridge based linear approach</w:t>
+      </w:r>
+      <w:r>
+        <w:rPr>
+          <w:sz w:val="24"/>
+          <w:szCs w:val="24"/>
+          <w:lang w:val="en-MT"/>
+        </w:rPr>
+        <w:t xml:space="preserve"> is consistently second, and SVM is lowest across all three measures.</w:t>
+      </w:r>
+    </w:p>
+    <w:p>
+      <w:pPr>
+        <w:spacing w:line="240" w:lineRule="auto"/>
+        <w:rPr>
+          <w:sz w:val="24"/>
+          <w:szCs w:val="24"/>
+          <w:lang w:val="en-MT"/>
+        </w:rPr>
+      </w:pPr>
+    </w:p>
+    <w:p>
+      <w:pPr>
+        <w:spacing w:line="240" w:lineRule="auto"/>
+        <w:rPr>
+          <w:sz w:val="24"/>
+          <w:szCs w:val="24"/>
+          <w:lang w:val="en-MT"/>
+        </w:rPr>
+      </w:pPr>
+      <w:r>
+        <w:rPr>
+          <w:noProof/>
           <w:sz w:val="24"/>
           <w:szCs w:val="24"/>
           <w:lang w:val="en-US"/>
@@ -6435,7 +6582,23 @@
           <w:szCs w:val="24"/>
           <w:lang w:val="en-MT"/>
         </w:rPr>
-        <w:t>Figure 4 shows that RidgeClassifier is the most efficient technique with the fastest training and prediction times, SVM is intermediate, and Random Forest is slowest, although the absolute times remain small at this dataset scale so performance differences are likely more important than latency.</w:t>
+        <w:t xml:space="preserve">Figure 4 shows that </w:t>
+      </w:r>
+      <w:r>
+        <w:rPr>
+          <w:sz w:val="24"/>
+          <w:szCs w:val="24"/>
+          <w:lang w:val="en-MT"/>
+        </w:rPr>
+        <w:t>Ridge based linear approach</w:t>
+      </w:r>
+      <w:r>
+        <w:rPr>
+          <w:sz w:val="24"/>
+          <w:szCs w:val="24"/>
+          <w:lang w:val="en-MT"/>
+        </w:rPr>
+        <w:t xml:space="preserve"> is the most efficient technique with the fastest training and prediction times, SVM is intermediate, and Random Forest is slowest, although the absolute times remain small at this dataset scale so performance differences are likely more important than latency.</w:t>
       </w:r>
     </w:p>
     <w:p>
@@ -6499,20 +6662,42 @@
           <w:szCs w:val="24"/>
           <w:lang w:val="en-US"/>
         </w:rPr>
-        <w:t xml:space="preserve">Paired bootstrap testing was used to assess whether Macro F1 differences are likely meaningful.  Random Forest outperformed SVM with a mean Macro F1 difference of 0.3414 and a 95 percent confidence interval from 0.2038 to 0.4805.  Random Forest also outperformed RidgeClassifier with a mean difference of 0.1587 and a 95 percent confidence interval from 0.0397 to 0.2757.  </w:t>
-      </w:r>
-      <w:r>
-        <w:rPr>
-          <w:lang w:val="en-US"/>
-        </w:rPr>
-        <w:t xml:space="preserve">RidgeClassifier outperformed SVM, with Macro </w:t>
+        <w:t xml:space="preserve">Paired bootstrap testing was used to assess whether Macro F1 differences are likely meaningful.  Random Forest outperformed SVM with a mean Macro F1 difference of 0.3414 and a 95 percent confidence interval from 0.2038 to 0.4805.  Random Forest also outperformed </w:t>
+      </w:r>
+      <w:r>
+        <w:rPr>
+          <w:sz w:val="24"/>
+          <w:szCs w:val="24"/>
+          <w:lang w:val="en-US"/>
+        </w:rPr>
+        <w:t>Ridge based linear approach</w:t>
+      </w:r>
+      <w:r>
+        <w:rPr>
+          <w:sz w:val="24"/>
+          <w:szCs w:val="24"/>
+          <w:lang w:val="en-US"/>
+        </w:rPr>
+        <w:t xml:space="preserve"> with a mean difference of 0.1587 and a 95 percent confidence interval from 0.0397 to 0.2757.  </w:t>
+      </w:r>
+      <w:r>
+        <w:rPr>
+          <w:lang w:val="en-US"/>
+        </w:rPr>
+        <w:t>Ridge based linear approach</w:t>
+      </w:r>
+      <w:r>
+        <w:rPr>
+          <w:lang w:val="en-US"/>
+        </w:rPr>
+        <w:t xml:space="preserve"> </w:t>
       </w:r>
       <w:r>
         <w:rPr>
           <w:lang w:val="en-US"/>
         </w:rPr>
         <w:lastRenderedPageBreak/>
-        <w:t>F1 higher by 0.1827 on average and a 95 percent confidence interval from 0.0761 to 0.2867.</w:t>
+        <w:t>outperformed SVM, with Macro F1 higher by 0.1827 on average and a 95 percent confidence interval from 0.0761 to 0.2867.</w:t>
       </w:r>
       <w:r>
         <w:rPr>
@@ -6538,20 +6723,69 @@
           <w:szCs w:val="24"/>
           <w:lang w:val="en-MT"/>
         </w:rPr>
-        <w:t>Table 2 shows that the Macro F1 differences are consistently away from zero, with Random Forest outperforming SVM by 0.3414 (95 percent CI 0.2038 to 0.4805) and RidgeClassifier by 0.1587 (95 percent CI 0.0397 to 0.2757), while RidgeClassifier also outperforms SVM because the SVM vs RidgeClassifier difference is negative at minus 0.1827 (95 percent CI minus 0.2867 to minus 0.0761).</w:t>
-      </w:r>
-    </w:p>
-    <w:p>
-      <w:pPr>
-        <w:spacing w:line="240" w:lineRule="auto"/>
-        <w:rPr>
-          <w:sz w:val="24"/>
-          <w:szCs w:val="24"/>
-          <w:lang w:val="en-US"/>
-        </w:rPr>
-      </w:pPr>
-      <w:r>
-        <w:rPr>
+        <w:t xml:space="preserve">Table 2 shows that the Macro F1 differences are consistently away from zero, with Random Forest outperforming SVM by 0.3414 (95 percent CI 0.2038 to 0.4805) and </w:t>
+      </w:r>
+      <w:r>
+        <w:rPr>
+          <w:sz w:val="24"/>
+          <w:szCs w:val="24"/>
+          <w:lang w:val="en-MT"/>
+        </w:rPr>
+        <w:t>Ridge based linear approach</w:t>
+      </w:r>
+      <w:r>
+        <w:rPr>
+          <w:sz w:val="24"/>
+          <w:szCs w:val="24"/>
+          <w:lang w:val="en-MT"/>
+        </w:rPr>
+        <w:t xml:space="preserve"> by 0.1587 (95 percent CI 0.0397 to 0.2757), while </w:t>
+      </w:r>
+      <w:r>
+        <w:rPr>
+          <w:sz w:val="24"/>
+          <w:szCs w:val="24"/>
+          <w:lang w:val="en-MT"/>
+        </w:rPr>
+        <w:t>Ridge based linear approach</w:t>
+      </w:r>
+      <w:r>
+        <w:rPr>
+          <w:sz w:val="24"/>
+          <w:szCs w:val="24"/>
+          <w:lang w:val="en-MT"/>
+        </w:rPr>
+        <w:t xml:space="preserve"> also outperforms SVM because the SVM vs </w:t>
+      </w:r>
+      <w:r>
+        <w:rPr>
+          <w:sz w:val="24"/>
+          <w:szCs w:val="24"/>
+          <w:lang w:val="en-MT"/>
+        </w:rPr>
+        <w:t>Ridge based linear approach</w:t>
+      </w:r>
+      <w:r>
+        <w:rPr>
+          <w:sz w:val="24"/>
+          <w:szCs w:val="24"/>
+          <w:lang w:val="en-MT"/>
+        </w:rPr>
+        <w:t xml:space="preserve"> difference is negative at minus 0.1827 (95 percent CI minus 0.2867 to minus 0.0761).</w:t>
+      </w:r>
+    </w:p>
+    <w:p>
+      <w:pPr>
+        <w:spacing w:line="240" w:lineRule="auto"/>
+        <w:rPr>
+          <w:sz w:val="24"/>
+          <w:szCs w:val="24"/>
+          <w:lang w:val="en-US"/>
+        </w:rPr>
+      </w:pPr>
+      <w:r>
+        <w:rPr>
+          <w:noProof/>
           <w:sz w:val="24"/>
           <w:szCs w:val="24"/>
           <w:lang w:val="en-US"/>
@@ -6700,7 +6934,23 @@
           <w:szCs w:val="24"/>
           <w:lang w:val="en-US"/>
         </w:rPr>
-        <w:t>Random Forest provides the best predictive quality and separability, at the cost of higher complexity and the slowest training and prediction times of the three.  RidgeClassifier offers the strongest transparency and speed, but with weaker minority</w:t>
+        <w:t xml:space="preserve">Random Forest provides the best predictive quality and separability, at the cost of higher complexity and the slowest training and prediction times of the three.  </w:t>
+      </w:r>
+      <w:r>
+        <w:rPr>
+          <w:sz w:val="24"/>
+          <w:szCs w:val="24"/>
+          <w:lang w:val="en-US"/>
+        </w:rPr>
+        <w:t>Ridge based linear approach</w:t>
+      </w:r>
+      <w:r>
+        <w:rPr>
+          <w:sz w:val="24"/>
+          <w:szCs w:val="24"/>
+          <w:lang w:val="en-US"/>
+        </w:rPr>
+        <w:t xml:space="preserve"> offers the strongest transparency and speed, but with weaker minority</w:t>
       </w:r>
       <w:r>
         <w:rPr>
@@ -6885,7 +7135,15 @@
           <w:szCs w:val="24"/>
           <w:lang w:val="en-US"/>
         </w:rPr>
-        <w:t>RidgeClassifier is a credible secondary option.  It clearly outperforms SVM while remaining the fastest approach for both training and inference, and it offers a more transparent explanation mechanism through coefficients.  The trade</w:t>
+        <w:t>Ridge based linear approach</w:t>
+      </w:r>
+      <w:r>
+        <w:rPr>
+          <w:sz w:val="24"/>
+          <w:szCs w:val="24"/>
+          <w:lang w:val="en-US"/>
+        </w:rPr>
+        <w:t xml:space="preserve"> is a credible secondary option.  It clearly outperforms SVM while remaining the fastest approach for both training and inference, and it offers a more transparent explanation mechanism through coefficients.  The trade</w:t>
       </w:r>
       <w:r>
         <w:rPr>
@@ -6955,6 +7213,7 @@
           <w:szCs w:val="24"/>
           <w:lang w:val="en-US"/>
         </w:rPr>
+        <w:lastRenderedPageBreak/>
         <w:t xml:space="preserve">SVM performs weakest </w:t>
       </w:r>
       <w:r>
@@ -6989,16 +7248,7 @@
           <w:szCs w:val="24"/>
           <w:lang w:val="en-US"/>
         </w:rPr>
-        <w:t xml:space="preserve">.  While its Accuracy appears moderate, the confusion matrices show that it struggles to correctly recognise some minority severity classes, which drives the low Macro F1.  This highlights that </w:t>
-      </w:r>
-      <w:r>
-        <w:rPr>
-          <w:sz w:val="24"/>
-          <w:szCs w:val="24"/>
-          <w:lang w:val="en-US"/>
-        </w:rPr>
-        <w:lastRenderedPageBreak/>
-        <w:t>Accuracy alone can be misleading in imbalanced multiclass settings, and that class</w:t>
+        <w:t>.  While its Accuracy appears moderate, the confusion matrices show that it struggles to correctly recognise some minority severity classes, which drives the low Macro F1.  This highlights that Accuracy alone can be misleading in imbalanced multiclass settings, and that class</w:t>
       </w:r>
       <w:r>
         <w:rPr>
@@ -7186,7 +7436,23 @@
           <w:szCs w:val="24"/>
           <w:lang w:val="en-US"/>
         </w:rPr>
-        <w:t xml:space="preserve">based results are informative but require careful interpretation.  Random Forest ROC is based on predicted probabilities, whereas RidgeClassifier and SVM ROC </w:t>
+        <w:t xml:space="preserve">based results are informative but require careful interpretation.  Random Forest ROC is based on predicted probabilities, whereas </w:t>
+      </w:r>
+      <w:r>
+        <w:rPr>
+          <w:sz w:val="24"/>
+          <w:szCs w:val="24"/>
+          <w:lang w:val="en-US"/>
+        </w:rPr>
+        <w:t>Ridge based linear approach</w:t>
+      </w:r>
+      <w:r>
+        <w:rPr>
+          <w:sz w:val="24"/>
+          <w:szCs w:val="24"/>
+          <w:lang w:val="en-US"/>
+        </w:rPr>
+        <w:t xml:space="preserve"> and SVM ROC </w:t>
       </w:r>
       <w:r>
         <w:rPr>
@@ -7363,6 +7629,7 @@
           <w:u w:val="single"/>
           <w:lang w:val="en-US"/>
         </w:rPr>
+        <w:lastRenderedPageBreak/>
         <w:t>Ethical Considerations</w:t>
       </w:r>
       <w:r>
@@ -7429,16 +7696,7 @@
           <w:szCs w:val="24"/>
           <w:lang w:val="en-US"/>
         </w:rPr>
-        <w:t xml:space="preserve">Bias and fairness considerations are critical </w:t>
-      </w:r>
-      <w:r>
-        <w:rPr>
-          <w:sz w:val="24"/>
-          <w:szCs w:val="24"/>
-          <w:lang w:val="en-US"/>
-        </w:rPr>
-        <w:lastRenderedPageBreak/>
-        <w:t>because the model outputs may influence operational decisions, resource allocation, or escalation workflows.  In this setting, unfairness would most plausibly arise from unequal performance across subgroups, either because the input features act as proxies for protected characteristics or because the training data is imbalanced in ways that cause systematic underperformance for certain conditions.</w:t>
+        <w:t>Bias and fairness considerations are critical because the model outputs may influence operational decisions, resource allocation, or escalation workflows.  In this setting, unfairness would most plausibly arise from unequal performance across subgroups, either because the input features act as proxies for protected characteristics or because the training data is imbalanced in ways that cause systematic underperformance for certain conditions.</w:t>
       </w:r>
     </w:p>
     <w:p>
@@ -7750,16 +8008,7 @@
           <w:szCs w:val="24"/>
           <w:lang w:val="en-US"/>
         </w:rPr>
-        <w:t xml:space="preserve">balanced metrics used in this report, with alerts for sustained declines in Macro F1 or severe increases in false negatives for higher severity classes.  If </w:t>
-      </w:r>
-      <w:r>
-        <w:rPr>
-          <w:sz w:val="24"/>
-          <w:szCs w:val="24"/>
-          <w:lang w:val="en-US"/>
-        </w:rPr>
-        <w:lastRenderedPageBreak/>
-        <w:t>additional fields</w:t>
+        <w:t>balanced metrics used in this report, with alerts for sustained declines in Macro F1 or severe increases in false negatives for higher severity classes.  If additional fields</w:t>
       </w:r>
       <w:r>
         <w:rPr>
@@ -7969,7 +8218,15 @@
           <w:szCs w:val="24"/>
           <w:lang w:val="en-US"/>
         </w:rPr>
-        <w:t>RidgeClassifier provides the clearest global interpretability because it is a linear model.  Its coefficients can be inspected to understand which inputs most strongly influence the decision boundary, and whether they push predictions towards higher or lower severity.  This makes it suitable when explanation and accountability are prioritised, even if absolute performance is lower than the best</w:t>
+        <w:t>Ridge based linear approach</w:t>
+      </w:r>
+      <w:r>
+        <w:rPr>
+          <w:sz w:val="24"/>
+          <w:szCs w:val="24"/>
+          <w:lang w:val="en-US"/>
+        </w:rPr>
+        <w:t xml:space="preserve"> provides the clearest global interpretability because it is a linear model.  Its coefficients can be inspected to understand which inputs most strongly influence the decision boundary, and whether they push predictions towards higher or lower severity.  This makes it suitable when explanation and accountability are prioritised, even if absolute performance is lower than the best</w:t>
       </w:r>
       <w:r>
         <w:rPr>
@@ -8005,7 +8262,14 @@
         </w:rPr>
         <w:t xml:space="preserve">Random Forest is less transparent than </w:t>
       </w:r>
-      <w:proofErr w:type="spellStart"/>
+      <w:r>
+        <w:rPr>
+          <w:sz w:val="24"/>
+          <w:szCs w:val="24"/>
+          <w:lang w:val="en-US"/>
+        </w:rPr>
+        <w:t xml:space="preserve">Ridge based linear </w:t>
+      </w:r>
       <w:proofErr w:type="gramStart"/>
       <w:r>
         <w:rPr>
@@ -8013,9 +8277,8 @@
           <w:szCs w:val="24"/>
           <w:lang w:val="en-US"/>
         </w:rPr>
-        <w:t>RidgeClassifier</w:t>
-      </w:r>
-      <w:proofErr w:type="spellEnd"/>
+        <w:t>approach</w:t>
+      </w:r>
       <w:r>
         <w:rPr>
           <w:sz w:val="24"/>
@@ -8143,7 +8406,16 @@
           <w:szCs w:val="24"/>
           <w:lang w:val="en-US"/>
         </w:rPr>
-        <w:t>To support transparency in the reporting process, the evaluation protocol uses a single frozen train test split and a consistent metric set across techniques.  Key outputs such as the metrics table and bootstrap significance results were exported directly from the notebook as CSV files, reducing the risk of transcription errors and improving traceability between the report narrative and the computed results.</w:t>
+        <w:t xml:space="preserve">To support transparency in the reporting process, the evaluation protocol uses a single frozen train test split and a consistent metric set across techniques.  Key outputs such </w:t>
+      </w:r>
+      <w:r>
+        <w:rPr>
+          <w:sz w:val="24"/>
+          <w:szCs w:val="24"/>
+          <w:lang w:val="en-US"/>
+        </w:rPr>
+        <w:lastRenderedPageBreak/>
+        <w:t>as the metrics table and bootstrap significance results were exported directly from the notebook as CSV files, reducing the risk of transcription errors and improving traceability between the report narrative and the computed results.</w:t>
       </w:r>
     </w:p>
     <w:p>
@@ -8249,7 +8521,23 @@
           <w:szCs w:val="24"/>
           <w:lang w:val="en-US"/>
         </w:rPr>
-        <w:t>off.  Random Forest provides the best predictive quality but requires more careful explanation and auditing, while RidgeClassifier provides the most straightforward explanation mechanism but at lower class</w:t>
+        <w:t xml:space="preserve">off.  Random Forest provides the best predictive quality but requires more careful explanation and auditing, while </w:t>
+      </w:r>
+      <w:r>
+        <w:rPr>
+          <w:sz w:val="24"/>
+          <w:szCs w:val="24"/>
+          <w:lang w:val="en-US"/>
+        </w:rPr>
+        <w:t>Ridge based linear approach</w:t>
+      </w:r>
+      <w:r>
+        <w:rPr>
+          <w:sz w:val="24"/>
+          <w:szCs w:val="24"/>
+          <w:lang w:val="en-US"/>
+        </w:rPr>
+        <w:t xml:space="preserve"> provides the most straightforward explanation mechanism but at lower class</w:t>
       </w:r>
       <w:r>
         <w:rPr>
@@ -8534,16 +8822,7 @@
           <w:szCs w:val="24"/>
           <w:lang w:val="en-US"/>
         </w:rPr>
-        <w:t xml:space="preserve">A common deployment failure mode is a feedback loop where model predictions affect which cases are investigated or recorded, which then changes the training data and reinforces the model’s existing biases.  Even without explicit demographic features, this </w:t>
-      </w:r>
-      <w:r>
-        <w:rPr>
-          <w:sz w:val="24"/>
-          <w:szCs w:val="24"/>
-          <w:lang w:val="en-US"/>
-        </w:rPr>
-        <w:lastRenderedPageBreak/>
-        <w:t>can lead to systematic over</w:t>
+        <w:t>A common deployment failure mode is a feedback loop where model predictions affect which cases are investigated or recorded, which then changes the training data and reinforces the model’s existing biases.  Even without explicit demographic features, this can lead to systematic over</w:t>
       </w:r>
       <w:r>
         <w:rPr>
@@ -8689,7 +8968,23 @@
           <w:szCs w:val="24"/>
           <w:lang w:val="en-US"/>
         </w:rPr>
-        <w:t xml:space="preserve"> but decision scores for SVM and RidgeClassifier.  Decision scores support ranking but are not calibrated probabilities.  If decision scores are communicated as risk percentages, users may place unjustified confidence in the outputs.  If a calibrated probability is required, explicit calibration and validation would be needed before deployment.</w:t>
+        <w:t xml:space="preserve"> but decision scores for SVM and </w:t>
+      </w:r>
+      <w:r>
+        <w:rPr>
+          <w:sz w:val="24"/>
+          <w:szCs w:val="24"/>
+          <w:lang w:val="en-US"/>
+        </w:rPr>
+        <w:t>Ridge based linear approach</w:t>
+      </w:r>
+      <w:r>
+        <w:rPr>
+          <w:sz w:val="24"/>
+          <w:szCs w:val="24"/>
+          <w:lang w:val="en-US"/>
+        </w:rPr>
+        <w:t>.  Decision scores support ranking but are not calibrated probabilities.  If decision scores are communicated as risk percentages, users may place unjustified confidence in the outputs.  If a calibrated probability is required, explicit calibration and validation would be needed before deployment.</w:t>
       </w:r>
     </w:p>
     <w:p>
@@ -8806,7 +9101,23 @@
           <w:szCs w:val="24"/>
           <w:lang w:val="en-US"/>
         </w:rPr>
-        <w:t>Random Forest is recommended as the primary technique because it achieves the strongest overall performance on the shared evaluation split, including the highest Macro F1 and Macro ROC AUC, and the paired bootstrap results support that its Macro F1 advantage is likely meaningful for this evaluation.  RidgeClassifier is recommended as a fallback because it is fast, more transparent through coefficients, and performs materially better than SVM on class</w:t>
+        <w:t xml:space="preserve">Random Forest is recommended as the primary technique because it achieves the strongest overall performance on the shared evaluation split, including the highest Macro F1 and Macro ROC AUC, and the paired bootstrap results support that its Macro F1 advantage is likely meaningful for this evaluation.  </w:t>
+      </w:r>
+      <w:r>
+        <w:rPr>
+          <w:sz w:val="24"/>
+          <w:szCs w:val="24"/>
+          <w:lang w:val="en-US"/>
+        </w:rPr>
+        <w:t>Ridge based linear approach</w:t>
+      </w:r>
+      <w:r>
+        <w:rPr>
+          <w:sz w:val="24"/>
+          <w:szCs w:val="24"/>
+          <w:lang w:val="en-US"/>
+        </w:rPr>
+        <w:t xml:space="preserve"> is recommended as a fallback because it is fast, more transparent through coefficients, and performs materially better than SVM on class</w:t>
       </w:r>
       <w:r>
         <w:rPr>
@@ -8972,16 +9283,7 @@
           <w:szCs w:val="24"/>
           <w:lang w:val="en-US"/>
         </w:rPr>
-        <w:t xml:space="preserve">specific recall for higher severity classes over time, not only globally.  As the time bucket analysis shows variability across </w:t>
-      </w:r>
-      <w:r>
-        <w:rPr>
-          <w:sz w:val="24"/>
-          <w:szCs w:val="24"/>
-          <w:lang w:val="en-US"/>
-        </w:rPr>
-        <w:lastRenderedPageBreak/>
-        <w:t>months, drift checks should trigger when performance degrades across consecutive periods or when input distributions shift, such as changes in tag frequencies or text vocabulary.  Retraining can be scheduled periodically, for example</w:t>
+        <w:t>specific recall for higher severity classes over time, not only globally.  As the time bucket analysis shows variability across months, drift checks should trigger when performance degrades across consecutive periods or when input distributions shift, such as changes in tag frequencies or text vocabulary.  Retraining can be scheduled periodically, for example</w:t>
       </w:r>
       <w:r>
         <w:rPr>
@@ -9352,7 +9654,32 @@
           <w:szCs w:val="24"/>
           <w:lang w:val="en-US"/>
         </w:rPr>
-        <w:t xml:space="preserve"> where continuous scores were available.  The comparative results show that Random Forest provides the strongest overall predictive performance and the best class separability, while RidgeClassifier offers a competitive and more transparent alternative with the fastest training and inference.  SVM underperformed on class</w:t>
+        <w:t xml:space="preserve"> where continuous scores were available.  The comparative results show that Random Forest provides the strongest overall predictive performance and the best class separability, while </w:t>
+      </w:r>
+      <w:r>
+        <w:rPr>
+          <w:sz w:val="24"/>
+          <w:szCs w:val="24"/>
+          <w:lang w:val="en-US"/>
+        </w:rPr>
+        <w:t>Ridge based linear approach</w:t>
+      </w:r>
+      <w:r>
+        <w:rPr>
+          <w:sz w:val="24"/>
+          <w:szCs w:val="24"/>
+          <w:lang w:val="en-US"/>
+        </w:rPr>
+        <w:t xml:space="preserve"> offers a competitive and more transparent alternative with the fastest training </w:t>
+      </w:r>
+      <w:r>
+        <w:rPr>
+          <w:sz w:val="24"/>
+          <w:szCs w:val="24"/>
+          <w:lang w:val="en-US"/>
+        </w:rPr>
+        <w:lastRenderedPageBreak/>
+        <w:t>and inference.  SVM underperformed on class</w:t>
       </w:r>
       <w:r>
         <w:rPr>
@@ -9368,16 +9695,23 @@
           <w:szCs w:val="24"/>
           <w:lang w:val="en-US"/>
         </w:rPr>
-        <w:t xml:space="preserve">balanced measures, highlighting that moderate Accuracy alone is not sufficient evidence of reliable behaviour in an imbalanced multiclass setting.  Statistical testing using paired bootstrap resampling supports that the observed Macro F1 differences are likely meaningful for this evaluation, strengthening confidence in the final model recommendation.  Overall, the </w:t>
-      </w:r>
-      <w:r>
-        <w:rPr>
-          <w:sz w:val="24"/>
-          <w:szCs w:val="24"/>
-          <w:lang w:val="en-US"/>
-        </w:rPr>
-        <w:lastRenderedPageBreak/>
-        <w:t xml:space="preserve">findings support using Random Forest as the primary approach for decision support, with RidgeClassifier as a practical fallback when interpretability or computational simplicity is prioritised, </w:t>
+        <w:t xml:space="preserve">balanced measures, highlighting that moderate Accuracy alone is not sufficient evidence of reliable behaviour in an imbalanced multiclass setting.  Statistical testing using paired bootstrap resampling supports that the observed Macro F1 differences are likely meaningful for this evaluation, strengthening confidence in the final model recommendation.  Overall, the findings support using Random Forest as the primary approach for decision support, with </w:t>
+      </w:r>
+      <w:r>
+        <w:rPr>
+          <w:sz w:val="24"/>
+          <w:szCs w:val="24"/>
+          <w:lang w:val="en-US"/>
+        </w:rPr>
+        <w:t>Ridge based linear approach</w:t>
+      </w:r>
+      <w:r>
+        <w:rPr>
+          <w:sz w:val="24"/>
+          <w:szCs w:val="24"/>
+          <w:lang w:val="en-US"/>
+        </w:rPr>
+        <w:t xml:space="preserve"> as a practical fallback when interpretability or computational simplicity is prioritised, </w:t>
       </w:r>
       <w:proofErr w:type="gramStart"/>
       <w:r>
@@ -9477,7 +9811,15 @@
           <w:szCs w:val="24"/>
           <w:lang w:val="en-MT"/>
         </w:rPr>
-        <w:t xml:space="preserve">RidgeClassifier performed as a robust middle ground.  It does not match </w:t>
+        <w:t>Ridge based linear approach</w:t>
+      </w:r>
+      <w:r>
+        <w:rPr>
+          <w:sz w:val="24"/>
+          <w:szCs w:val="24"/>
+          <w:lang w:val="en-MT"/>
+        </w:rPr>
+        <w:t xml:space="preserve"> performed as a robust middle ground.  It does not match </w:t>
       </w:r>
       <w:r>
         <w:rPr>
@@ -9559,7 +9901,23 @@
           <w:szCs w:val="24"/>
           <w:lang w:val="en-MT"/>
         </w:rPr>
-        <w:t xml:space="preserve"> as the primary choice, with RidgeClassifier as the most practical alternative when transparency and speed matter most.</w:t>
+        <w:t xml:space="preserve"> as the primary choice, with </w:t>
+      </w:r>
+      <w:r>
+        <w:rPr>
+          <w:sz w:val="24"/>
+          <w:szCs w:val="24"/>
+          <w:lang w:val="en-MT"/>
+        </w:rPr>
+        <w:t>Ridge based linear approach</w:t>
+      </w:r>
+      <w:r>
+        <w:rPr>
+          <w:sz w:val="24"/>
+          <w:szCs w:val="24"/>
+          <w:lang w:val="en-MT"/>
+        </w:rPr>
+        <w:t xml:space="preserve"> as the most practical alternative when transparency and speed matter most.</w:t>
       </w:r>
     </w:p>
     <w:p>
@@ -9695,7 +10053,16 @@
           <w:szCs w:val="24"/>
           <w:lang w:val="en-MT"/>
         </w:rPr>
-        <w:t>class performance estimates can be noisy, particularly for the least frequent classes.  The grouped time bucket analysis illustrates a related issue, where month</w:t>
+        <w:t xml:space="preserve">class performance estimates can be noisy, particularly for the least </w:t>
+      </w:r>
+      <w:r>
+        <w:rPr>
+          <w:sz w:val="24"/>
+          <w:szCs w:val="24"/>
+          <w:lang w:val="en-MT"/>
+        </w:rPr>
+        <w:lastRenderedPageBreak/>
+        <w:t>frequent classes.  The grouped time bucket analysis illustrates a related issue, where month</w:t>
       </w:r>
       <w:r>
         <w:rPr>
@@ -9729,7 +10096,6 @@
           <w:szCs w:val="24"/>
           <w:lang w:val="en-MT"/>
         </w:rPr>
-        <w:lastRenderedPageBreak/>
         <w:t>Third, interpretability evidence is limited by the methods used.  Random Forest impurity</w:t>
       </w:r>
       <w:r>
@@ -10098,7 +10464,6 @@
           <w:u w:val="single"/>
           <w:lang w:val="en-US"/>
         </w:rPr>
-        <w:lastRenderedPageBreak/>
         <w:t>Key takeaways:</w:t>
       </w:r>
     </w:p>
@@ -10133,7 +10498,39 @@
           <w:szCs w:val="24"/>
           <w:lang w:val="en-MT"/>
         </w:rPr>
-        <w:t>balanced performance and the highest separability, indicating a stronger ability to distinguish severity levels across decision thresholds.  The confusion matrix evidence further suggests that Random Forest makes fewer problematic misclassifications relative to the alternatives, even though some adjacent class confusion remains, which is expected when labels represent ordered levels of severity.  RidgeClassifier emerged as a defensible second choice.  While it does not match Random Forest on Macro F1, it performs substantially better than the evaluated SVM configuration and provides clearer transparency through coefficients, alongside the fastest training and inference times.  This makes RidgeClassifier particularly attractive when interpretability and operational simplicity are prioritised.  The SVM with an RBF kernel underperformed on class</w:t>
+        <w:t xml:space="preserve">balanced performance and the highest separability, indicating a stronger ability to distinguish severity levels across decision thresholds.  The confusion matrix evidence further suggests that Random Forest makes fewer problematic misclassifications relative to the alternatives, even though some adjacent class confusion remains, which is expected when labels represent ordered levels of severity.  </w:t>
+      </w:r>
+      <w:r>
+        <w:rPr>
+          <w:sz w:val="24"/>
+          <w:szCs w:val="24"/>
+          <w:lang w:val="en-MT"/>
+        </w:rPr>
+        <w:t>Ridge based linear approach</w:t>
+      </w:r>
+      <w:r>
+        <w:rPr>
+          <w:sz w:val="24"/>
+          <w:szCs w:val="24"/>
+          <w:lang w:val="en-MT"/>
+        </w:rPr>
+        <w:t xml:space="preserve"> emerged as a defensible second choice.  While it does not match Random Forest on Macro F1, it performs substantially better than the evaluated SVM configuration and provides clearer transparency through coefficients, alongside the fastest training and inference times.  This makes </w:t>
+      </w:r>
+      <w:r>
+        <w:rPr>
+          <w:sz w:val="24"/>
+          <w:szCs w:val="24"/>
+          <w:lang w:val="en-MT"/>
+        </w:rPr>
+        <w:t>Ridge based linear approach</w:t>
+      </w:r>
+      <w:r>
+        <w:rPr>
+          <w:sz w:val="24"/>
+          <w:szCs w:val="24"/>
+          <w:lang w:val="en-MT"/>
+        </w:rPr>
+        <w:t xml:space="preserve"> particularly attractive when interpretability and operational simplicity are prioritised.  The SVM with an RBF kernel underperformed on class</w:t>
       </w:r>
       <w:r>
         <w:rPr>
@@ -10193,16 +10590,7 @@
           <w:u w:val="single"/>
           <w:lang w:val="en-US"/>
         </w:rPr>
-        <w:t>I</w:t>
-      </w:r>
-      <w:r>
-        <w:rPr>
-          <w:sz w:val="28"/>
-          <w:szCs w:val="28"/>
-          <w:u w:val="single"/>
-          <w:lang w:val="en-US"/>
-        </w:rPr>
-        <w:t>mplications</w:t>
+        <w:t>Implications</w:t>
       </w:r>
     </w:p>
     <w:p>
@@ -10315,25 +10703,23 @@
           <w:szCs w:val="24"/>
           <w:lang w:val="en-US"/>
         </w:rPr>
-        <w:t xml:space="preserve"> such as location in future dataset versions, requiring subgroup audits and impact assessment before they influence predictions.  With these safeguards in place, the project’s comparative evidence supports a realistic and defensible recommendation: use Random Forest when maximising predictive quality is the </w:t>
-      </w:r>
-      <w:proofErr w:type="gramStart"/>
-      <w:r>
-        <w:rPr>
-          <w:sz w:val="24"/>
-          <w:szCs w:val="24"/>
-          <w:lang w:val="en-US"/>
-        </w:rPr>
-        <w:t>priority, and</w:t>
-      </w:r>
-      <w:proofErr w:type="gramEnd"/>
-      <w:r>
-        <w:rPr>
-          <w:sz w:val="24"/>
-          <w:szCs w:val="24"/>
-          <w:lang w:val="en-US"/>
-        </w:rPr>
-        <w:t xml:space="preserve"> keep RidgeClassifier as a transparent and efficient fallback when explanation and operational constraints dominate.</w:t>
+        <w:t xml:space="preserve"> such as location in future dataset versions, requiring subgroup audits and impact assessment before they influence predictions.  With these safeguards in place, the project’s comparative evidence supports a realistic and defensible recommendation: use Random Forest when maximising predictive quality is the priority, and keep </w:t>
+      </w:r>
+      <w:r>
+        <w:rPr>
+          <w:sz w:val="24"/>
+          <w:szCs w:val="24"/>
+          <w:lang w:val="en-US"/>
+        </w:rPr>
+        <w:t>Ridge based linear approach</w:t>
+      </w:r>
+      <w:r>
+        <w:rPr>
+          <w:sz w:val="24"/>
+          <w:szCs w:val="24"/>
+          <w:lang w:val="en-US"/>
+        </w:rPr>
+        <w:t xml:space="preserve"> as a transparent and efficient fallback when explanation and operational constraints dominate.</w:t>
       </w:r>
     </w:p>
     <w:p>
@@ -13589,6 +13975,7 @@
   <w:style w:type="character" w:default="1" w:styleId="DefaultParagraphFont">
     <w:name w:val="Default Paragraph Font"/>
     <w:uiPriority w:val="1"/>
+    <w:semiHidden/>
     <w:unhideWhenUsed/>
   </w:style>
   <w:style w:type="table" w:default="1" w:styleId="TableNormal">

</xml_diff>

<commit_message>
LucaD - Main Docs ready.
</commit_message>
<xml_diff>
--- a/Main Document.docx
+++ b/Main Document.docx
@@ -7171,23 +7171,13 @@
           <w:lang w:val="en-US"/>
         </w:rPr>
       </w:pPr>
-    </w:p>
-    <w:p>
-      <w:pPr>
-        <w:spacing w:line="240" w:lineRule="auto"/>
-        <w:rPr>
-          <w:sz w:val="24"/>
-          <w:szCs w:val="24"/>
-          <w:lang w:val="en-US"/>
-        </w:rPr>
-      </w:pPr>
-      <w:r>
-        <w:rPr>
-          <w:sz w:val="24"/>
-          <w:szCs w:val="24"/>
-          <w:lang w:val="en-US"/>
-        </w:rPr>
-        <w:t>Main failure mode and why Accuracy is not enough</w:t>
+      <w:r>
+        <w:rPr>
+          <w:sz w:val="24"/>
+          <w:szCs w:val="24"/>
+          <w:lang w:val="en-US"/>
+        </w:rPr>
+        <w:t>Error patterns and policy relevance</w:t>
       </w:r>
       <w:r>
         <w:rPr>
@@ -7213,42 +7203,16 @@
           <w:szCs w:val="24"/>
           <w:lang w:val="en-US"/>
         </w:rPr>
+        <w:t xml:space="preserve">The dominant error pattern across techniques is confusion between adjacent severity levels, which is expected for ordered severity style labels.  For deployment, this implies </w:t>
+      </w:r>
+      <w:r>
+        <w:rPr>
+          <w:sz w:val="24"/>
+          <w:szCs w:val="24"/>
+          <w:lang w:val="en-US"/>
+        </w:rPr>
         <w:lastRenderedPageBreak/>
-        <w:t xml:space="preserve">SVM performs weakest </w:t>
-      </w:r>
-      <w:r>
-        <w:rPr>
-          <w:sz w:val="24"/>
-          <w:szCs w:val="24"/>
-          <w:lang w:val="en-US"/>
-        </w:rPr>
-        <w:t>when</w:t>
-      </w:r>
-      <w:r>
-        <w:rPr>
-          <w:sz w:val="24"/>
-          <w:szCs w:val="24"/>
-          <w:lang w:val="en-US"/>
-        </w:rPr>
-        <w:t xml:space="preserve"> class balance is </w:t>
-      </w:r>
-      <w:proofErr w:type="gramStart"/>
-      <w:r>
-        <w:rPr>
-          <w:sz w:val="24"/>
-          <w:szCs w:val="24"/>
-          <w:lang w:val="en-US"/>
-        </w:rPr>
-        <w:t>taken into account</w:t>
-      </w:r>
-      <w:proofErr w:type="gramEnd"/>
-      <w:r>
-        <w:rPr>
-          <w:sz w:val="24"/>
-          <w:szCs w:val="24"/>
-          <w:lang w:val="en-US"/>
-        </w:rPr>
-        <w:t>.  While its Accuracy appears moderate, the confusion matrices show that it struggles to correctly recognise some minority severity classes, which drives the low Macro F1.  This highlights that Accuracy alone can be misleading in imbalanced multiclass settings, and that class</w:t>
+        <w:t>that error costs are not uniform.  Misclassifying a genuinely high</w:t>
       </w:r>
       <w:r>
         <w:rPr>
@@ -7264,35 +7228,67 @@
           <w:szCs w:val="24"/>
           <w:lang w:val="en-US"/>
         </w:rPr>
-        <w:t>balanced metrics are essential for judging practical usefulness.</w:t>
-      </w:r>
-    </w:p>
-    <w:p>
-      <w:pPr>
-        <w:spacing w:line="240" w:lineRule="auto"/>
-        <w:rPr>
-          <w:sz w:val="24"/>
-          <w:szCs w:val="24"/>
-          <w:lang w:val="en-US"/>
-        </w:rPr>
-      </w:pPr>
-    </w:p>
-    <w:p>
-      <w:pPr>
-        <w:spacing w:line="240" w:lineRule="auto"/>
-        <w:rPr>
-          <w:sz w:val="24"/>
-          <w:szCs w:val="24"/>
-          <w:lang w:val="en-US"/>
-        </w:rPr>
-      </w:pPr>
-      <w:r>
-        <w:rPr>
-          <w:sz w:val="24"/>
-          <w:szCs w:val="24"/>
-          <w:lang w:val="en-US"/>
-        </w:rPr>
-        <w:t>Error patterns and policy relevance</w:t>
+        <w:t>severity case as a lower severity class is more harmful than over</w:t>
+      </w:r>
+      <w:r>
+        <w:rPr>
+          <w:sz w:val="24"/>
+          <w:szCs w:val="24"/>
+          <w:lang w:val="en-US"/>
+        </w:rPr>
+        <w:t>-</w:t>
+      </w:r>
+      <w:r>
+        <w:rPr>
+          <w:sz w:val="24"/>
+          <w:szCs w:val="24"/>
+          <w:lang w:val="en-US"/>
+        </w:rPr>
+        <w:t>escalating a borderline case, so thresholding and escalation rules should be designed with asymmetric costs in mind, potentially including human review for high</w:t>
+      </w:r>
+      <w:r>
+        <w:rPr>
+          <w:sz w:val="24"/>
+          <w:szCs w:val="24"/>
+          <w:lang w:val="en-US"/>
+        </w:rPr>
+        <w:t>-</w:t>
+      </w:r>
+      <w:r>
+        <w:rPr>
+          <w:sz w:val="24"/>
+          <w:szCs w:val="24"/>
+          <w:lang w:val="en-US"/>
+        </w:rPr>
+        <w:t>impact decisions.</w:t>
+      </w:r>
+    </w:p>
+    <w:p>
+      <w:pPr>
+        <w:spacing w:line="240" w:lineRule="auto"/>
+        <w:rPr>
+          <w:sz w:val="24"/>
+          <w:szCs w:val="24"/>
+          <w:lang w:val="en-US"/>
+        </w:rPr>
+      </w:pPr>
+    </w:p>
+    <w:p>
+      <w:pPr>
+        <w:spacing w:line="240" w:lineRule="auto"/>
+        <w:rPr>
+          <w:sz w:val="24"/>
+          <w:szCs w:val="24"/>
+          <w:lang w:val="en-US"/>
+        </w:rPr>
+      </w:pPr>
+      <w:r>
+        <w:rPr>
+          <w:sz w:val="24"/>
+          <w:szCs w:val="24"/>
+          <w:lang w:val="en-US"/>
+        </w:rPr>
+        <w:t>Interpreting ROC correctly</w:t>
       </w:r>
       <w:r>
         <w:rPr>
@@ -7318,7 +7314,7 @@
           <w:szCs w:val="24"/>
           <w:lang w:val="en-US"/>
         </w:rPr>
-        <w:t>The dominant error pattern across techniques is confusion between adjacent severity levels, which is expected for ordered severity style labels.  For deployment, this implies that error costs are not uniform.  Misclassifying a genuinely high</w:t>
+        <w:t>ROC</w:t>
       </w:r>
       <w:r>
         <w:rPr>
@@ -7334,108 +7330,6 @@
           <w:szCs w:val="24"/>
           <w:lang w:val="en-US"/>
         </w:rPr>
-        <w:t>severity case as a lower severity class is more harmful than over</w:t>
-      </w:r>
-      <w:r>
-        <w:rPr>
-          <w:sz w:val="24"/>
-          <w:szCs w:val="24"/>
-          <w:lang w:val="en-US"/>
-        </w:rPr>
-        <w:t>-</w:t>
-      </w:r>
-      <w:r>
-        <w:rPr>
-          <w:sz w:val="24"/>
-          <w:szCs w:val="24"/>
-          <w:lang w:val="en-US"/>
-        </w:rPr>
-        <w:t>escalating a borderline case, so thresholding and escalation rules should be designed with asymmetric costs in mind, potentially including human review for high</w:t>
-      </w:r>
-      <w:r>
-        <w:rPr>
-          <w:sz w:val="24"/>
-          <w:szCs w:val="24"/>
-          <w:lang w:val="en-US"/>
-        </w:rPr>
-        <w:t>-</w:t>
-      </w:r>
-      <w:r>
-        <w:rPr>
-          <w:sz w:val="24"/>
-          <w:szCs w:val="24"/>
-          <w:lang w:val="en-US"/>
-        </w:rPr>
-        <w:t>impact decisions.</w:t>
-      </w:r>
-    </w:p>
-    <w:p>
-      <w:pPr>
-        <w:spacing w:line="240" w:lineRule="auto"/>
-        <w:rPr>
-          <w:sz w:val="24"/>
-          <w:szCs w:val="24"/>
-          <w:lang w:val="en-US"/>
-        </w:rPr>
-      </w:pPr>
-    </w:p>
-    <w:p>
-      <w:pPr>
-        <w:spacing w:line="240" w:lineRule="auto"/>
-        <w:rPr>
-          <w:sz w:val="24"/>
-          <w:szCs w:val="24"/>
-          <w:lang w:val="en-US"/>
-        </w:rPr>
-      </w:pPr>
-      <w:r>
-        <w:rPr>
-          <w:sz w:val="24"/>
-          <w:szCs w:val="24"/>
-          <w:lang w:val="en-US"/>
-        </w:rPr>
-        <w:t>Interpreting ROC correctly</w:t>
-      </w:r>
-      <w:r>
-        <w:rPr>
-          <w:sz w:val="24"/>
-          <w:szCs w:val="24"/>
-          <w:lang w:val="en-US"/>
-        </w:rPr>
-        <w:t>:</w:t>
-      </w:r>
-    </w:p>
-    <w:p>
-      <w:pPr>
-        <w:spacing w:line="240" w:lineRule="auto"/>
-        <w:rPr>
-          <w:sz w:val="24"/>
-          <w:szCs w:val="24"/>
-          <w:lang w:val="en-US"/>
-        </w:rPr>
-      </w:pPr>
-      <w:r>
-        <w:rPr>
-          <w:sz w:val="24"/>
-          <w:szCs w:val="24"/>
-          <w:lang w:val="en-US"/>
-        </w:rPr>
-        <w:t>ROC</w:t>
-      </w:r>
-      <w:r>
-        <w:rPr>
-          <w:sz w:val="24"/>
-          <w:szCs w:val="24"/>
-          <w:lang w:val="en-US"/>
-        </w:rPr>
-        <w:t>-</w:t>
-      </w:r>
-      <w:r>
-        <w:rPr>
-          <w:sz w:val="24"/>
-          <w:szCs w:val="24"/>
-          <w:lang w:val="en-US"/>
-        </w:rPr>
         <w:t xml:space="preserve">based results are informative but require careful interpretation.  Random Forest ROC is based on predicted probabilities, whereas </w:t>
       </w:r>
       <w:r>
@@ -7470,86 +7364,6 @@
         </w:rPr>
         <w:t xml:space="preserve"> based on decision scores.  ROC remains a valid ranking measure in both cases, but decision scores should not be treated as calibrated risk without additional calibration, especially if model outputs are used to justify policy actions or operational escalation.</w:t>
       </w:r>
-    </w:p>
-    <w:p>
-      <w:pPr>
-        <w:spacing w:line="240" w:lineRule="auto"/>
-        <w:rPr>
-          <w:sz w:val="24"/>
-          <w:szCs w:val="24"/>
-          <w:lang w:val="en-US"/>
-        </w:rPr>
-      </w:pPr>
-    </w:p>
-    <w:p>
-      <w:pPr>
-        <w:spacing w:line="240" w:lineRule="auto"/>
-        <w:rPr>
-          <w:sz w:val="24"/>
-          <w:szCs w:val="24"/>
-          <w:lang w:val="en-US"/>
-        </w:rPr>
-      </w:pPr>
-      <w:r>
-        <w:rPr>
-          <w:sz w:val="24"/>
-          <w:szCs w:val="24"/>
-          <w:lang w:val="en-US"/>
-        </w:rPr>
-        <w:t>Temporal variation and monitoring implications</w:t>
-      </w:r>
-      <w:r>
-        <w:rPr>
-          <w:sz w:val="24"/>
-          <w:szCs w:val="24"/>
-          <w:lang w:val="en-US"/>
-        </w:rPr>
-        <w:t>:</w:t>
-      </w:r>
-    </w:p>
-    <w:p>
-      <w:pPr>
-        <w:spacing w:line="240" w:lineRule="auto"/>
-        <w:rPr>
-          <w:sz w:val="24"/>
-          <w:szCs w:val="24"/>
-          <w:lang w:val="en-US"/>
-        </w:rPr>
-      </w:pPr>
-      <w:r>
-        <w:rPr>
-          <w:sz w:val="24"/>
-          <w:szCs w:val="24"/>
-          <w:lang w:val="en-US"/>
-        </w:rPr>
-        <w:t>Grouped performance by month shows variability, but some time buckets have small sample sizes, so apparent fluctuations may reflect sparsity rather than stable changes in model quality.  This supports the need for monitoring and periodic re</w:t>
-      </w:r>
-      <w:r>
-        <w:rPr>
-          <w:sz w:val="24"/>
-          <w:szCs w:val="24"/>
-          <w:lang w:val="en-US"/>
-        </w:rPr>
-        <w:t>-</w:t>
-      </w:r>
-      <w:r>
-        <w:rPr>
-          <w:sz w:val="24"/>
-          <w:szCs w:val="24"/>
-          <w:lang w:val="en-US"/>
-        </w:rPr>
-        <w:t>evaluation if deployed, with retraining triggers if performance degrades or the data distribution shifts over time.</w:t>
-      </w:r>
-    </w:p>
-    <w:p>
-      <w:pPr>
-        <w:spacing w:line="240" w:lineRule="auto"/>
-        <w:rPr>
-          <w:sz w:val="24"/>
-          <w:szCs w:val="24"/>
-          <w:lang w:val="en-US"/>
-        </w:rPr>
-      </w:pPr>
     </w:p>
     <w:p>
       <w:pPr>
@@ -7629,7 +7443,6 @@
           <w:u w:val="single"/>
           <w:lang w:val="en-US"/>
         </w:rPr>
-        <w:lastRenderedPageBreak/>
         <w:t>Ethical Considerations</w:t>
       </w:r>
       <w:r>
@@ -7800,6 +7613,7 @@
           <w:szCs w:val="24"/>
           <w:lang w:val="en-US"/>
         </w:rPr>
+        <w:lastRenderedPageBreak/>
         <w:t>Temporal proxy effects were assessed using the available time field.  Grouped evaluation by month shows that performance varies across months.  This can indicate temporal bias if model quality degrades during certain periods, but it must be interpreted cautiously because several month buckets contain small sample sizes.  With small group sizes, apparent gaps may reflect sampling noise rather than a consistent bias pattern.  Nevertheless, the presence of variability supports treating time as a potential fairness</w:t>
       </w:r>
       <w:r>
@@ -7904,26 +7718,6 @@
         </w:rPr>
         <w:t xml:space="preserve"> higher Macro F1 than the other techniques across most buckets, but all techniques experience fluctuations.  Where performance dips coincide with small sample sizes, the results should be treated as a warning signal rather than a definitive disparity.  From a risk perspective, the key fairness concern is that reduced performance in particular time periods could lead to systematically poorer service outcomes for cases occurring in those periods, even if no explicit sensitive group variable exists.</w:t>
       </w:r>
-    </w:p>
-    <w:p>
-      <w:pPr>
-        <w:spacing w:line="240" w:lineRule="auto"/>
-        <w:rPr>
-          <w:sz w:val="24"/>
-          <w:szCs w:val="24"/>
-          <w:lang w:val="en-US"/>
-        </w:rPr>
-      </w:pPr>
-    </w:p>
-    <w:p>
-      <w:pPr>
-        <w:spacing w:line="240" w:lineRule="auto"/>
-        <w:rPr>
-          <w:sz w:val="24"/>
-          <w:szCs w:val="24"/>
-          <w:lang w:val="en-US"/>
-        </w:rPr>
-      </w:pPr>
     </w:p>
     <w:p>
       <w:pPr>
@@ -8226,7 +8020,16 @@
           <w:szCs w:val="24"/>
           <w:lang w:val="en-US"/>
         </w:rPr>
-        <w:t xml:space="preserve"> provides the clearest global interpretability because it is a linear model.  Its coefficients can be inspected to understand which inputs most strongly influence the decision boundary, and whether they push predictions towards higher or lower severity.  This makes it suitable when explanation and accountability are prioritised, even if absolute performance is lower than the best</w:t>
+        <w:t xml:space="preserve"> provides the clearest global interpretability because it is a linear model.  Its coefficients can be inspected to understand which inputs most </w:t>
+      </w:r>
+      <w:r>
+        <w:rPr>
+          <w:sz w:val="24"/>
+          <w:szCs w:val="24"/>
+          <w:lang w:val="en-US"/>
+        </w:rPr>
+        <w:lastRenderedPageBreak/>
+        <w:t>strongly influence the decision boundary, and whether they push predictions towards higher or lower severity.  This makes it suitable when explanation and accountability are prioritised, even if absolute performance is lower than the best</w:t>
       </w:r>
       <w:r>
         <w:rPr>
@@ -8406,16 +8209,7 @@
           <w:szCs w:val="24"/>
           <w:lang w:val="en-US"/>
         </w:rPr>
-        <w:t xml:space="preserve">To support transparency in the reporting process, the evaluation protocol uses a single frozen train test split and a consistent metric set across techniques.  Key outputs such </w:t>
-      </w:r>
-      <w:r>
-        <w:rPr>
-          <w:sz w:val="24"/>
-          <w:szCs w:val="24"/>
-          <w:lang w:val="en-US"/>
-        </w:rPr>
-        <w:lastRenderedPageBreak/>
-        <w:t>as the metrics table and bootstrap significance results were exported directly from the notebook as CSV files, reducing the risk of transcription errors and improving traceability between the report narrative and the computed results.</w:t>
+        <w:t>To support transparency in the reporting process, the evaluation protocol uses a single frozen train test split and a consistent metric set across techniques.  Key outputs such as the metrics table and bootstrap significance results were exported directly from the notebook as CSV files, reducing the risk of transcription errors and improving traceability between the report narrative and the computed results.</w:t>
       </w:r>
     </w:p>
     <w:p>
@@ -8612,108 +8406,13 @@
           <w:lang w:val="en-US"/>
         </w:rPr>
       </w:pPr>
-    </w:p>
-    <w:p>
-      <w:pPr>
-        <w:spacing w:line="240" w:lineRule="auto"/>
-        <w:rPr>
-          <w:sz w:val="24"/>
-          <w:szCs w:val="24"/>
-          <w:lang w:val="en-US"/>
-        </w:rPr>
-      </w:pPr>
-      <w:r>
-        <w:rPr>
-          <w:sz w:val="24"/>
-          <w:szCs w:val="24"/>
-          <w:lang w:val="en-US"/>
-        </w:rPr>
-        <w:t>False positive and false negative costs</w:t>
-      </w:r>
-      <w:r>
-        <w:rPr>
-          <w:sz w:val="24"/>
-          <w:szCs w:val="24"/>
-          <w:lang w:val="en-US"/>
-        </w:rPr>
-        <w:t>:</w:t>
-      </w:r>
-    </w:p>
-    <w:p>
-      <w:pPr>
-        <w:spacing w:line="240" w:lineRule="auto"/>
-        <w:rPr>
-          <w:sz w:val="24"/>
-          <w:szCs w:val="24"/>
-          <w:lang w:val="en-US"/>
-        </w:rPr>
-      </w:pPr>
-      <w:r>
-        <w:rPr>
-          <w:sz w:val="24"/>
-          <w:szCs w:val="24"/>
-          <w:lang w:val="en-US"/>
-        </w:rPr>
-        <w:t>The confusion matrix patterns show that errors are not uniform across severity classes.  In severity prediction, under</w:t>
-      </w:r>
-      <w:r>
-        <w:rPr>
-          <w:sz w:val="24"/>
-          <w:szCs w:val="24"/>
-          <w:lang w:val="en-US"/>
-        </w:rPr>
-        <w:t>-</w:t>
-      </w:r>
-      <w:r>
-        <w:rPr>
-          <w:sz w:val="24"/>
-          <w:szCs w:val="24"/>
-          <w:lang w:val="en-US"/>
-        </w:rPr>
-        <w:t>prediction can be more harmful than over</w:t>
-      </w:r>
-      <w:r>
-        <w:rPr>
-          <w:sz w:val="24"/>
-          <w:szCs w:val="24"/>
-          <w:lang w:val="en-US"/>
-        </w:rPr>
-        <w:t>-</w:t>
-      </w:r>
-      <w:r>
-        <w:rPr>
-          <w:sz w:val="24"/>
-          <w:szCs w:val="24"/>
-          <w:lang w:val="en-US"/>
-        </w:rPr>
-        <w:t>prediction when higher severity cases require timely escalation or response.  A false negative at higher severity can delay intervention, misallocate resources, or lead to underreporting of critical events.  False positives also carry costs, such as unnecessary escalation, wasted staff time, and reduced trust in the system.  This asymmetric cost structure means the model should not be deployed as a fully automated decision maker.  Instead, it should be used as decision support with clear thresholds and escalation rules aligned to organisational risk tolerance.</w:t>
-      </w:r>
-    </w:p>
-    <w:p>
-      <w:pPr>
-        <w:spacing w:line="240" w:lineRule="auto"/>
-        <w:rPr>
-          <w:sz w:val="24"/>
-          <w:szCs w:val="24"/>
-          <w:lang w:val="en-US"/>
-        </w:rPr>
-      </w:pPr>
-    </w:p>
-    <w:p>
-      <w:pPr>
-        <w:spacing w:line="240" w:lineRule="auto"/>
-        <w:rPr>
-          <w:sz w:val="24"/>
-          <w:szCs w:val="24"/>
-          <w:lang w:val="en-US"/>
-        </w:rPr>
-      </w:pPr>
-      <w:r>
-        <w:rPr>
-          <w:sz w:val="24"/>
-          <w:szCs w:val="24"/>
-          <w:lang w:val="en-US"/>
-        </w:rPr>
+      <w:r>
+        <w:rPr>
+          <w:sz w:val="24"/>
+          <w:szCs w:val="24"/>
+          <w:lang w:val="en-US"/>
+        </w:rPr>
+        <w:lastRenderedPageBreak/>
         <w:t xml:space="preserve">Policy impacts and operational </w:t>
       </w:r>
       <w:proofErr w:type="spellStart"/>
@@ -9574,6 +9273,7 @@
           <w:szCs w:val="24"/>
           <w:lang w:val="en-US"/>
         </w:rPr>
+        <w:lastRenderedPageBreak/>
         <w:t>This project evaluated three supervised learning techniques for multiclass severity prediction using a shared and frozen train</w:t>
       </w:r>
       <w:r>
@@ -9670,16 +9370,7 @@
           <w:szCs w:val="24"/>
           <w:lang w:val="en-US"/>
         </w:rPr>
-        <w:t xml:space="preserve"> offers a competitive and more transparent alternative with the fastest training </w:t>
-      </w:r>
-      <w:r>
-        <w:rPr>
-          <w:sz w:val="24"/>
-          <w:szCs w:val="24"/>
-          <w:lang w:val="en-US"/>
-        </w:rPr>
-        <w:lastRenderedPageBreak/>
-        <w:t>and inference.  SVM underperformed on class</w:t>
+        <w:t xml:space="preserve"> offers a competitive and more transparent alternative with the fastest training and inference.  SVM underperformed on class</w:t>
       </w:r>
       <w:r>
         <w:rPr>
@@ -9971,7 +9662,16 @@
           <w:szCs w:val="24"/>
           <w:lang w:val="en-MT"/>
         </w:rPr>
-        <w:t>Several limitations should be considered when interpreting these results.  First, the evaluation is based on a single frozen train test split.  While this supports a fair comparison across techniques, it does not capture variability that may arise under different splits or resampling procedures.  The paired bootstrap significance testing reduces this concern by estimating uncertainty on the held</w:t>
+        <w:t xml:space="preserve">Several limitations should be considered when interpreting these results.  First, the </w:t>
+      </w:r>
+      <w:r>
+        <w:rPr>
+          <w:sz w:val="24"/>
+          <w:szCs w:val="24"/>
+          <w:lang w:val="en-MT"/>
+        </w:rPr>
+        <w:lastRenderedPageBreak/>
+        <w:t>evaluation is based on a single frozen train test split.  While this supports a fair comparison across techniques, it does not capture variability that may arise under different splits or resampling procedures.  The paired bootstrap significance testing reduces this concern by estimating uncertainty on the held</w:t>
       </w:r>
       <w:r>
         <w:rPr>
@@ -10053,16 +9753,7 @@
           <w:szCs w:val="24"/>
           <w:lang w:val="en-MT"/>
         </w:rPr>
-        <w:t xml:space="preserve">class performance estimates can be noisy, particularly for the least </w:t>
-      </w:r>
-      <w:r>
-        <w:rPr>
-          <w:sz w:val="24"/>
-          <w:szCs w:val="24"/>
-          <w:lang w:val="en-MT"/>
-        </w:rPr>
-        <w:lastRenderedPageBreak/>
-        <w:t>frequent classes.  The grouped time bucket analysis illustrates a related issue, where month</w:t>
+        <w:t>class performance estimates can be noisy, particularly for the least frequent classes.  The grouped time bucket analysis illustrates a related issue, where month</w:t>
       </w:r>
       <w:r>
         <w:rPr>
@@ -10342,7 +10033,16 @@
           <w:szCs w:val="24"/>
           <w:lang w:val="en-MT"/>
         </w:rPr>
-        <w:t>balanced metrics over time, detects drift in both inputs and performance, and triggers retraining when degradation is sustained.  Finally, usability testing with stakeholders would help define appropriate human review thresholds and escalation rules that reflect real</w:t>
+        <w:t xml:space="preserve">balanced metrics over time, detects drift in both inputs and performance, and triggers retraining when degradation is sustained.  Finally, usability testing with </w:t>
+      </w:r>
+      <w:r>
+        <w:rPr>
+          <w:sz w:val="24"/>
+          <w:szCs w:val="24"/>
+          <w:lang w:val="en-MT"/>
+        </w:rPr>
+        <w:lastRenderedPageBreak/>
+        <w:t>stakeholders would help define appropriate human review thresholds and escalation rules that reflect real</w:t>
       </w:r>
       <w:r>
         <w:rPr>
@@ -10703,7 +10403,16 @@
           <w:szCs w:val="24"/>
           <w:lang w:val="en-US"/>
         </w:rPr>
-        <w:t xml:space="preserve"> such as location in future dataset versions, requiring subgroup audits and impact assessment before they influence predictions.  With these safeguards in place, the project’s comparative evidence supports a realistic and defensible recommendation: use Random Forest when maximising predictive quality is the priority, and keep </w:t>
+        <w:t xml:space="preserve"> such as location in future dataset versions, requiring subgroup audits and </w:t>
+      </w:r>
+      <w:r>
+        <w:rPr>
+          <w:sz w:val="24"/>
+          <w:szCs w:val="24"/>
+          <w:lang w:val="en-US"/>
+        </w:rPr>
+        <w:lastRenderedPageBreak/>
+        <w:t xml:space="preserve">impact assessment before they influence predictions.  With these safeguards in place, the project’s comparative evidence supports a realistic and defensible recommendation: use Random Forest when maximising predictive quality is the priority, and keep </w:t>
       </w:r>
       <w:r>
         <w:rPr>
@@ -11126,6 +10835,7 @@
         </w:rPr>
       </w:pPr>
       <w:r>
+        <w:lastRenderedPageBreak/>
         <w:t xml:space="preserve">[6] </w:t>
       </w:r>
       <w:r>

</xml_diff>